<commit_message>
Fix paper figures and citation formatting per review feedback
- Figures 2-4 replaced with freshly-run pipeline output (checked the
  actual overlay images) instead of the older pre-made diagnostic
  images, which had a residual halo-boundary artifact on one disk and
  didn't clearly convey the disk-detection fix.
- Table 1 numbers updated to match the new example image.
- Materials text: "two to seven dishes per frame" corrected to
  "occasionally two dishes per frame"; removed the sentence about the
  petri-detection cache file.
- In-text citations now render as "[N]" with Latin digits instead of
  Persian digits.
</commit_message>
<xml_diff>
--- a/paper_figures/Antibiogram_Paper_Draft.docx
+++ b/paper_figures/Antibiogram_Paper_Draft.docx
@@ -179,19 +179,79 @@
           <w:rFonts w:hint="cs"/>
           <w:rtl/>
         </w:rPr>
-        <w:t xml:space="preserve">تست آنتی‌بایوگرام دیسک-دیفیوژن (کربی-باوئر) یکی از رایج‌ترین روش‌های آزمایشگاهی برای سنجش حساسیت باکتری به آنتی‌بیوتیک است: دیسک‌های آغشته به آنتی‌بیوتیک روی محیط کشت آگار حاوی باکتری قرار می‌گیرند و پس از انکوباسیون، در صورت حساس‌بودن باکتری، حلقه‌ای بدون رشد (هاله‌ی بازدارندگی) دور دیسک شکل می‌گیرد که قطرش، طبق جدول‌های استاندارد نظیر EUCAST، به دسته‌های حساس، متوسط و مقاوم تبدیل می‌شود. در عمل این قطر معمولاً با کولیس و به‌صورت دستی اندازه‌گیری می‌شود؛ روشی کند، وابسته به مهارت اپراتور و مستعد خطای انسانی و تغییرپذیری بین‌آزمایشگاهی. از دهه‌ی ۱۹۹۰ سامانه‌های تحلیل تصویر رایانه‌ای برای خودکارسازی این اندازه‌گیری با توافق قابل‌قبول در برابر روش دستی گزارش شده‌اند ]۱[.</w:t>
+        <w:t xml:space="preserve">تست آنتی‌بایوگرام دیسک-دیفیوژن (کربی-باوئر) یکی از رایج‌ترین روش‌های آزمایشگاهی برای سنجش حساسیت باکتری به آنتی‌بیوتیک است: دیسک‌های آغشته به آنتی‌بیوتیک روی محیط کشت آگار حاوی باکتری قرار می‌گیرند و پس از انکوباسیون، در صورت حساس‌بودن باکتری، حلقه‌ای بدون رشد (هاله‌ی بازدارندگی) دور دیسک شکل می‌گیرد که قطرش، طبق جدول‌های استاندارد نظیر EUCAST، به دسته‌های حساس، متوسط و مقاوم تبدیل می‌شود. در عمل این قطر معمولاً با کولیس و به‌صورت دستی اندازه‌گیری می‌شود؛ روشی کند، وابسته به مهارت اپراتور و مستعد خطای انسانی و تغییرپذیری بین‌آزمایشگاهی. از دهه‌ی ۱۹۹۰ سامانه‌های تحلیل تصویر رایانه‌ای برای خودکارسازی این اندازه‌گیری با توافق قابل‌قبول در برابر روش دستی گزارش شده‌اند </w:t>
       </w:r>
-    </w:p>
-    <w:p>
-      <w:pPr>
-        <w:pStyle w:val="Paragraph"/>
-      </w:pPr>
+      <w:r>
+        <w:t xml:space="preserve">[1]</w:t>
+      </w:r>
       <w:r>
         <w:rPr>
           <w:rFonts w:hint="cs"/>
           <w:rtl/>
         </w:rPr>
-        <w:t xml:space="preserve">رویکردهای بعدی عمدتاً حول تبدیل دایره‌ایِ هاف برای تشخیص دیسک و ظرف پتری ]۲[، ابزارهای مبتنی بر آستانه‌گذاری/فیلترینگ کلاسیک به‌همراه بازشناسی نوری کدِ چاپ‌شده‌ی روی دیسک مانند AntibiogramJ ]۳[، و مقایسه‌ی چند روش تقسیم‌بندی (واترشد، مدل کانتور فعال، خوشه‌بندی فازی) روی مجموعه‌داده‌ای با ۱۷۰ عکس و ۵۱۳ هاله ]۴[ متمرکز بوده‌اند. اخیراً رویکردهای مبتنی بر یادگیری عمیق نیز مطرح شده‌اند: یک اپلیکیشن موبایل مبتنی بر هوش مصنوعی با توافق ۹۰ تا ۹۸ درصد در برابر روش استاندارد بیمارستانی و اندازه‌گیری دستی ]۵[، و ترکیب تحلیل رنگ (hue contrast) با طبقه‌بندی یادگیری‌محور برای تفسیر خودکار ]۶[. این کارها نشان می‌دهند خودکارسازی در عمل ممکن و مفید است، اما معمولاً یا به مجموعه‌داده‌ی برچسب‌خورده‌ی حجیم نیاز دارند یا برای شرایط تصویربرداری محدودی (نور کنترل‌شده، یک ظرف در قاب) طراحی شده‌اند.</w:t>
+        <w:t xml:space="preserve">.</w:t>
+      </w:r>
+    </w:p>
+    <w:p>
+      <w:pPr>
+        <w:pStyle w:val="Paragraph"/>
+      </w:pPr>
+      <w:r>
+        <w:rPr>
+          <w:rFonts w:hint="cs"/>
+          <w:rtl/>
+        </w:rPr>
+        <w:t xml:space="preserve">رویکردهای بعدی عمدتاً حول تبدیل دایره‌ایِ هاف برای تشخیص دیسک و ظرف پتری </w:t>
+      </w:r>
+      <w:r>
+        <w:t xml:space="preserve">[2]</w:t>
+      </w:r>
+      <w:r>
+        <w:rPr>
+          <w:rFonts w:hint="cs"/>
+          <w:rtl/>
+        </w:rPr>
+        <w:t xml:space="preserve">، ابزارهای مبتنی بر آستانه‌گذاری/فیلترینگ کلاسیک به‌همراه بازشناسی نوری کدِ چاپ‌شده‌ی روی دیسک مانند AntibiogramJ </w:t>
+      </w:r>
+      <w:r>
+        <w:t xml:space="preserve">[3]</w:t>
+      </w:r>
+      <w:r>
+        <w:rPr>
+          <w:rFonts w:hint="cs"/>
+          <w:rtl/>
+        </w:rPr>
+        <w:t xml:space="preserve">، و مقایسه‌ی چند روش تقسیم‌بندی (واترشد، مدل کانتور فعال، خوشه‌بندی فازی) روی مجموعه‌داده‌ای با ۱۷۰ عکس و ۵۱۳ هاله </w:t>
+      </w:r>
+      <w:r>
+        <w:t xml:space="preserve">[4]</w:t>
+      </w:r>
+      <w:r>
+        <w:rPr>
+          <w:rFonts w:hint="cs"/>
+          <w:rtl/>
+        </w:rPr>
+        <w:t xml:space="preserve"> متمرکز بوده‌اند. اخیراً رویکردهای مبتنی بر یادگیری عمیق نیز مطرح شده‌اند: یک اپلیکیشن موبایل مبتنی بر هوش مصنوعی با توافق ۹۰ تا ۹۸ درصد در برابر روش استاندارد بیمارستانی و اندازه‌گیری دستی </w:t>
+      </w:r>
+      <w:r>
+        <w:t xml:space="preserve">[5]</w:t>
+      </w:r>
+      <w:r>
+        <w:rPr>
+          <w:rFonts w:hint="cs"/>
+          <w:rtl/>
+        </w:rPr>
+        <w:t xml:space="preserve">، و ترکیب تحلیل رنگ (hue contrast) با طبقه‌بندی یادگیری‌محور برای تفسیر خودکار </w:t>
+      </w:r>
+      <w:r>
+        <w:t xml:space="preserve">[6]</w:t>
+      </w:r>
+      <w:r>
+        <w:rPr>
+          <w:rFonts w:hint="cs"/>
+          <w:rtl/>
+        </w:rPr>
+        <w:t xml:space="preserve">. این کارها نشان می‌دهند خودکارسازی در عمل ممکن و مفید است، اما معمولاً یا به مجموعه‌داده‌ی برچسب‌خورده‌ی حجیم نیاز دارند یا برای شرایط تصویربرداری محدودی (نور کنترل‌شده، یک ظرف در قاب) طراحی شده‌اند.</w:t>
       </w:r>
     </w:p>
     <w:p>
@@ -243,7 +303,17 @@
           <w:rFonts w:hint="cs"/>
           <w:rtl/>
         </w:rPr>
-        <w:t xml:space="preserve">مجموعه‌داده شامل هفتادوهشت عکس واقعی از آزمایش‌های آنتی‌بایوگرام است که با دوربین تلفن‌همراه گرفته شده‌اند؛ هر عکس حاوی یک یا چند ظرف پتری است (اکثراً یک ظرف، برخی دو تا هفت ظرف هم‌زمان در یک قاب). برای تست سریع‌تر ماژول‌های بالادستِ پایپ‌لاین، خروجی کامل ماژول تشخیص پتری برای هر ۷۸ عکس در یک کش میانی (per-dish mask/ROI به‌صورت PNG بدون‌افت) ذخیره شده است؛ این کش صرفاً یک ابزار مهندسیِ سرعت‌بخشی است، نه یک مجموعه‌داده‌ی برچسب‌خورده‌ی جدا. دو سند مرجع رسمی EUCAST—جدول‌های نقطه‌قطع نسخه‌ی ۱۶.۰ و جدول دوزهای دیسک متناظر ]۷[—برای تحقیق درباره‌ی روش استاندارد خواندن مرز هاله استفاده شده‌اند (بخش ۴-۲)؛ پایپ‌لاین در حال حاضر فقط قطر را بر حسب میلی‌متر گزارش می‌کند و طبقه‌بندی حساس/متوسط/مقاوم را پیاده‌سازی نمی‌کند. برای هیچ‌کدام از عکس‌ها اندازه‌گیری مرجعِ کولیسی ثبت نشده است؛ این نبودِ ground truth به‌عنوان محدودیت اصلی این کار در بخش ۴-۳ مطرح می‌شود. جزئیات ساختاریافته‌ی نوع باکتری، آنتی‌بیوتیک‌های به‌کاررفته و شرایط انکوباسیون/محیط کشت برای کل مجموعه هنوز مستندسازی نشده‌اند [PLACEHOLDER: جزئیات ترکیب نمونه—نوع باکتری، آنتی‌بیوتیک‌ها، شرایط انکوباسیون و محیط کشت—باید تکمیل شود]. تمامی تصاویر مستقیماً از پتری‌دیش‌های آزمایشگاهی گرفته شده‌اند و هیچ داده یا تصویر بیمار در این مجموعه وجود ندارد.</w:t>
+        <w:t xml:space="preserve">مجموعه‌داده شامل هفتادوهشت عکس واقعی از آزمایش‌های آنتی‌بایوگرام است که با دوربین تلفن‌همراه گرفته شده‌اند؛ هر عکس حاوی یک یا چند ظرف پتری است (اکثراً یک ظرف، بعضاً دو ظرف در یک قاب). دو سند مرجع رسمی EUCAST—جدول‌های نقطه‌قطع نسخه‌ی ۱۶.۰ و جدول دوزهای دیسک متناظر </w:t>
+      </w:r>
+      <w:r>
+        <w:t xml:space="preserve">[7]</w:t>
+      </w:r>
+      <w:r>
+        <w:rPr>
+          <w:rFonts w:hint="cs"/>
+          <w:rtl/>
+        </w:rPr>
+        <w:t xml:space="preserve">—برای تحقیق درباره‌ی روش استاندارد خواندن مرز هاله استفاده شده‌اند (بخش ۴-۲)؛ پایپ‌لاین در حال حاضر فقط قطر را بر حسب میلی‌متر گزارش می‌کند و طبقه‌بندی حساس/متوسط/مقاوم را پیاده‌سازی نمی‌کند. برای هیچ‌کدام از عکس‌ها اندازه‌گیری مرجعِ کولیسی ثبت نشده است؛ این نبودِ ground truth به‌عنوان محدودیت اصلی این کار در بخش ۴-۳ مطرح می‌شود. جزئیات ساختاریافته‌ی نوع باکتری، آنتی‌بیوتیک‌های به‌کاررفته و شرایط انکوباسیون/محیط کشت برای کل مجموعه هنوز مستندسازی نشده‌اند [PLACEHOLDER: جزئیات ترکیب نمونه—نوع باکتری، آنتی‌بیوتیک‌ها، شرایط انکوباسیون و محیط کشت—باید تکمیل شود]. تمامی تصاویر مستقیماً از پتری‌دیش‌های آزمایشگاهی گرفته شده‌اند و هیچ داده یا تصویر بیمار در این مجموعه وجود ندارد.</w:t>
       </w:r>
     </w:p>
     <w:p>
@@ -295,7 +365,27 @@
           <w:rFonts w:hint="cs"/>
           <w:rtl/>
         </w:rPr>
-        <w:t xml:space="preserve">آستانه‌گذاری سراسری، در حضور نور ناهموار روی کل قاب عکس، یک محدودیت کلاسیک و شناخته‌شده است ]۸[؛ همین محدودیت باعث می‌شد هم تقسیم‌بندی ناحیه‌ای و هم ردیابی کانتور لبه در fallback به‌طور سیستماتیک شکست بخورند یا ظرف‌های کاذب تولید کنند. راه‌حل، تصحیح میدان روشنایی (shading correction) پیش از هر آستانه‌گذاری است: تصویر منهای تخمین صاف/بزرگ‌مقیاسِ روشنایی خودش، به‌علاوه‌ی میانگین کلی. این تصحیح به‌صورت تفریقی—نه تقسیمی—انجام می‌شود؛ در یک آزمون کنترل‌شده، نسخه‌ی تقسیمی در نواحی تاریک تصویر نویز را تقویت و تعداد ظرف‌های کاذب را در یک نمونه از سه به شش افزایش می‌داد، درحالی‌که نسخه‌ی تفریقی همان مورد را به دو کاهش داد. روی تصویر تصحیح‌شده، سگمنتیشن ناحیه‌ای با آستانه‌گذاری چندسطحیِ Otsu ]۹[ (بسط کلاسیک Otsu به سه کلاس: پس‌زمینه، آگار، برچسب روشن دیسک) روی نسخه‌ی کوچک‌شده‌ی تصویر اجرا می‌شود؛ تبدیل دایره‌ایِ هاف و ردیابی کانتور تنها به‌عنوان یک مسیر مکمل/تاییدکننده—نه پیش‌فرض—نگه داشته شده‌اند. تشخیص چندگانه (بیش از یک ظرف در قاب) با نگه‌داشتن همه‌ی کانتورهای معتبر و یک فیلتر شمول برای حذف کاندیدهای کاذب تودرتو انجام می‌شود. دو خودآزماییِ مستقلِ hypothesize-and-verify—بررسی ارزان وجود بلاب‌های هم‌اندازه‌ی دیسک، و بررسی قوی‌تر با کاندیدهای هاف-دیسک—هر کاندید پتری را با شواهدی مستقل از مسیر تشخیص خودش تایید یا رد می‌کنند. خروجی این مرحله فهرستی از ظرف‌های مستقل است که تمام ماژول‌های بعدی روی آن حلقه می‌زنند، نه یک بار برای کل عکس.</w:t>
+        <w:t xml:space="preserve">آستانه‌گذاری سراسری، در حضور نور ناهموار روی کل قاب عکس، یک محدودیت کلاسیک و شناخته‌شده است </w:t>
+      </w:r>
+      <w:r>
+        <w:t xml:space="preserve">[8]</w:t>
+      </w:r>
+      <w:r>
+        <w:rPr>
+          <w:rFonts w:hint="cs"/>
+          <w:rtl/>
+        </w:rPr>
+        <w:t xml:space="preserve">؛ همین محدودیت باعث می‌شد هم تقسیم‌بندی ناحیه‌ای و هم ردیابی کانتور لبه در fallback به‌طور سیستماتیک شکست بخورند یا ظرف‌های کاذب تولید کنند. راه‌حل، تصحیح میدان روشنایی (shading correction) پیش از هر آستانه‌گذاری است: تصویر منهای تخمین صاف/بزرگ‌مقیاسِ روشنایی خودش، به‌علاوه‌ی میانگین کلی. این تصحیح به‌صورت تفریقی—نه تقسیمی—انجام می‌شود؛ در یک آزمون کنترل‌شده، نسخه‌ی تقسیمی در نواحی تاریک تصویر نویز را تقویت و تعداد ظرف‌های کاذب را در یک نمونه از سه به شش افزایش می‌داد، درحالی‌که نسخه‌ی تفریقی همان مورد را به دو کاهش داد. روی تصویر تصحیح‌شده، سگمنتیشن ناحیه‌ای با آستانه‌گذاری چندسطحیِ Otsu </w:t>
+      </w:r>
+      <w:r>
+        <w:t xml:space="preserve">[9]</w:t>
+      </w:r>
+      <w:r>
+        <w:rPr>
+          <w:rFonts w:hint="cs"/>
+          <w:rtl/>
+        </w:rPr>
+        <w:t xml:space="preserve"> (بسط کلاسیک Otsu به سه کلاس: پس‌زمینه، آگار، برچسب روشن دیسک) روی نسخه‌ی کوچک‌شده‌ی تصویر اجرا می‌شود؛ تبدیل دایره‌ایِ هاف و ردیابی کانتور تنها به‌عنوان یک مسیر مکمل/تاییدکننده—نه پیش‌فرض—نگه داشته شده‌اند. تشخیص چندگانه (بیش از یک ظرف در قاب) با نگه‌داشتن همه‌ی کانتورهای معتبر و یک فیلتر شمول برای حذف کاندیدهای کاذب تودرتو انجام می‌شود. دو خودآزماییِ مستقلِ hypothesize-and-verify—بررسی ارزان وجود بلاب‌های هم‌اندازه‌ی دیسک، و بررسی قوی‌تر با کاندیدهای هاف-دیسک—هر کاندید پتری را با شواهدی مستقل از مسیر تشخیص خودش تایید یا رد می‌کنند. خروجی این مرحله فهرستی از ظرف‌های مستقل است که تمام ماژول‌های بعدی روی آن حلقه می‌زنند، نه یک بار برای کل عکس.</w:t>
       </w:r>
     </w:p>
     <w:p>
@@ -446,7 +536,7 @@
         </w:rPr>
         <w:drawing>
           <wp:inline distT="0" distB="0" distL="0" distR="0">
-            <wp:extent cx="1431375" cy="1586781"/>
+            <wp:extent cx="1431375" cy="1646081"/>
             <wp:effectExtent l="0" t="0" r="0" b="0"/>
             <wp:docPr id="103" name="Picture 103"/>
             <wp:cNvGraphicFramePr>
@@ -468,7 +558,7 @@
                   <pic:spPr>
                     <a:xfrm>
                       <a:off x="0" y="0"/>
-                      <a:ext cx="1431375" cy="1586781"/>
+                      <a:ext cx="1431375" cy="1646081"/>
                     </a:xfrm>
                     <a:prstGeom prst="rect">
                       <a:avLst/>
@@ -490,7 +580,7 @@
           <w:rFonts w:hint="cs"/>
           <w:rtl/>
         </w:rPr>
-        <w:t xml:space="preserve">شکل ۲: رفع باگ «پرتگاه ادغام». راست: قبل از رفع، دیسک CRO30 (شماره‌گذاری‌شده در متن) کاملاً رد شده و بدون دایره باقی مانده است. چپ: پس از رفع، هر نُه دیسک از جمله CRO30 با مرز هاله (بنفش) شناسایی شده‌اند.</w:t>
+        <w:t xml:space="preserve">شکل ۲: رفع باگ «پرتگاه ادغام» روی همان عکس (خروجی ماژول تشخیص دیسک، بدون مرز هاله). راست: قبل از رفع، دیسک CRO30 با هیچ دایره‌ای علامت‌گذاری نشده و کاملاً رد شده است. چپ: پس از رفع (اجرای فعلیِ پایپ‌لاین)، هر نُه دیسک از جمله CRO30 با دایره‌ی قرمز تشخیص داده شده‌اند.</w:t>
       </w:r>
     </w:p>
     <w:p>
@@ -553,7 +643,7 @@
         </w:rPr>
         <w:drawing>
           <wp:inline distT="0" distB="0" distL="0" distR="0">
-            <wp:extent cx="2952750" cy="3270990"/>
+            <wp:extent cx="2952750" cy="3067579"/>
             <wp:effectExtent l="0" t="0" r="0" b="0"/>
             <wp:docPr id="104" name="Picture 104"/>
             <wp:cNvGraphicFramePr>
@@ -575,7 +665,7 @@
                   <pic:spPr>
                     <a:xfrm>
                       <a:off x="0" y="0"/>
-                      <a:ext cx="2952750" cy="3270990"/>
+                      <a:ext cx="2952750" cy="3067579"/>
                     </a:xfrm>
                     <a:prstGeom prst="rect">
                       <a:avLst/>
@@ -597,7 +687,7 @@
           <w:rFonts w:hint="cs"/>
           <w:rtl/>
         </w:rPr>
-        <w:t xml:space="preserve">شکل ۳: رفع رخداد لنگرشدنِ مرز هاله به لبه‌ی پتری (اصلاح زاویه‌ای). دایره‌های قرمز، مرزهای اصلاح‌شده را نسبت به تخمین اولیه نشان می‌دهند؛ شش از نُه دیسک این نمونه دست‌کم یک زاویه‌ی اصلاح‌شده دارند.</w:t>
+        <w:t xml:space="preserve">شکل ۳: خروجیِ فعلیِ ماژول ۱۶.۶ (رفع رخداد زاویه‌ای) روی یک عکس واقعی. مرزهای قرمز دیسک‌هایی را نشان می‌دهند که دست‌کم یک زاویه‌شان اصلاح شده (سه از نُه دیسک این نمونه)؛ مرزهای سبز بدون اصلاح باقی مانده‌اند.</w:t>
       </w:r>
     </w:p>
     <w:p>
@@ -675,7 +765,7 @@
           <w:rFonts w:hint="cs"/>
           <w:rtl/>
         </w:rPr>
-        <w:t xml:space="preserve">شکل ۴ خروجیِ کاملِ سه ماژولِ اصلیِ پایپ‌لاین—تشخیص دیسک، مرز هاله، و رخداد حباب—را روی یک عکس واقعی (۹ دیسک روی یک ظرف، به روش region_rect با اطمینانِ ۰٫۷۹) نشان می‌دهد. جدول ۱ گزارش عددیِ متناظر را فهرست می‌کند: قطر دیسک‌ها از ۴٫۴ تا ۶٫۸ میلی‌متر و قطر هاله‌ها از ۵٫۰ تا ۱۹٫۹ میلی‌متر متغیر است—تنوعِ واقع‌گرایانه‌ای از میزان عدمِ‌رشد که در همین نمونه هیچ رخداد حبابی هم گزارش نشد.</w:t>
+        <w:t xml:space="preserve">شکل ۴ خروجیِ کاملِ سه ماژولِ اصلیِ پایپ‌لاین—تشخیص دیسک، مرز هاله، و رخداد حباب—را روی یک عکس واقعی (۹ دیسک روی یک ظرف، به روش hough_fallback با اطمینانِ ۰٫۸۴) نشان می‌دهد. جدول ۱ گزارش عددیِ متناظر را فهرست می‌کند: قطر دیسک‌ها از ۴٫۸ تا ۷٫۷ میلی‌متر و قطر هاله‌ها از ۵٫۶ تا ۱۸٫۵ میلی‌متر متغیر است—تنوعِ واقع‌گرایانه‌ای از میزان عدمِ‌رشد که در همین نمونه هیچ رخداد حبابی هم گزارش نشد.</w:t>
       </w:r>
     </w:p>
     <w:p>
@@ -688,7 +778,7 @@
         </w:rPr>
         <w:drawing>
           <wp:inline distT="0" distB="0" distL="0" distR="0">
-            <wp:extent cx="924250" cy="1062887"/>
+            <wp:extent cx="924250" cy="1269303"/>
             <wp:effectExtent l="0" t="0" r="0" b="0"/>
             <wp:docPr id="105" name="Picture 105"/>
             <wp:cNvGraphicFramePr>
@@ -710,7 +800,7 @@
                   <pic:spPr>
                     <a:xfrm>
                       <a:off x="0" y="0"/>
-                      <a:ext cx="924250" cy="1062887"/>
+                      <a:ext cx="924250" cy="1269303"/>
                     </a:xfrm>
                     <a:prstGeom prst="rect">
                       <a:avLst/>
@@ -774,7 +864,7 @@
         </w:rPr>
         <w:drawing>
           <wp:inline distT="0" distB="0" distL="0" distR="0">
-            <wp:extent cx="924250" cy="1062887"/>
+            <wp:extent cx="924250" cy="1206146"/>
             <wp:effectExtent l="0" t="0" r="0" b="0"/>
             <wp:docPr id="107" name="Picture 107"/>
             <wp:cNvGraphicFramePr>
@@ -796,7 +886,7 @@
                   <pic:spPr>
                     <a:xfrm>
                       <a:off x="0" y="0"/>
-                      <a:ext cx="924250" cy="1062887"/>
+                      <a:ext cx="924250" cy="1206146"/>
                     </a:xfrm>
                     <a:prstGeom prst="rect">
                       <a:avLst/>
@@ -830,7 +920,7 @@
           <w:rFonts w:hint="cs"/>
           <w:rtl/>
         </w:rPr>
-        <w:t xml:space="preserve">جدول ۱: گزارش خروجی نهایی پایپ‌لاین برای یک ظرف واقعی (۹ دیسک، روش تشخیص ظرف: region_rect، اطمینان=۰٫۷۹).</w:t>
+        <w:t xml:space="preserve">جدول ۱: گزارش خروجی نهایی پایپ‌لاین برای یک ظرف واقعی (۹ دیسک، روش تشخیص ظرف: hough_fallback، اطمینان=۰٫۸۴).</w:t>
       </w:r>
     </w:p>
     <w:tbl>
@@ -868,8 +958,6 @@
               <w:rPr>
                 <w:sz w:val="15"/>
                 <w:szCs w:val="15"/>
-                <w:b/>
-                <w:bCs/>
                 <w:rFonts w:hint="cs"/>
                 <w:rtl/>
               </w:rPr>
@@ -892,8 +980,6 @@
               <w:rPr>
                 <w:sz w:val="15"/>
                 <w:szCs w:val="15"/>
-                <w:b/>
-                <w:bCs/>
                 <w:rFonts w:hint="cs"/>
                 <w:rtl/>
               </w:rPr>
@@ -916,8 +1002,6 @@
               <w:rPr>
                 <w:sz w:val="15"/>
                 <w:szCs w:val="15"/>
-                <w:b/>
-                <w:bCs/>
                 <w:rFonts w:hint="cs"/>
                 <w:rtl/>
               </w:rPr>
@@ -965,7 +1049,7 @@
                 <w:rFonts w:hint="cs"/>
                 <w:rtl/>
               </w:rPr>
-              <w:t xml:space="preserve">۶٫۱</w:t>
+              <w:t xml:space="preserve">۷٫۷</w:t>
             </w:r>
           </w:p>
         </w:tc>
@@ -986,7 +1070,7 @@
                 <w:rFonts w:hint="cs"/>
                 <w:rtl/>
               </w:rPr>
-              <w:t xml:space="preserve">۱۷٫۱</w:t>
+              <w:t xml:space="preserve">۱۸٫۵</w:t>
             </w:r>
           </w:p>
         </w:tc>
@@ -1030,7 +1114,7 @@
                 <w:rFonts w:hint="cs"/>
                 <w:rtl/>
               </w:rPr>
-              <w:t xml:space="preserve">۶٫۸</w:t>
+              <w:t xml:space="preserve">۴٫۸</w:t>
             </w:r>
           </w:p>
         </w:tc>
@@ -1051,7 +1135,7 @@
                 <w:rFonts w:hint="cs"/>
                 <w:rtl/>
               </w:rPr>
-              <w:t xml:space="preserve">۱۷٫۲</w:t>
+              <w:t xml:space="preserve">۵٫۶</w:t>
             </w:r>
           </w:p>
         </w:tc>
@@ -1095,7 +1179,7 @@
                 <w:rFonts w:hint="cs"/>
                 <w:rtl/>
               </w:rPr>
-              <w:t xml:space="preserve">۴٫۵</w:t>
+              <w:t xml:space="preserve">۵٫۰</w:t>
             </w:r>
           </w:p>
         </w:tc>
@@ -1116,7 +1200,7 @@
                 <w:rFonts w:hint="cs"/>
                 <w:rtl/>
               </w:rPr>
-              <w:t xml:space="preserve">۱۵٫۴</w:t>
+              <w:t xml:space="preserve">۵٫۸</w:t>
             </w:r>
           </w:p>
         </w:tc>
@@ -1160,7 +1244,7 @@
                 <w:rFonts w:hint="cs"/>
                 <w:rtl/>
               </w:rPr>
-              <w:t xml:space="preserve">۶٫۵</w:t>
+              <w:t xml:space="preserve">۵٫۲</w:t>
             </w:r>
           </w:p>
         </w:tc>
@@ -1181,7 +1265,7 @@
                 <w:rFonts w:hint="cs"/>
                 <w:rtl/>
               </w:rPr>
-              <w:t xml:space="preserve">۱۹٫۹</w:t>
+              <w:t xml:space="preserve">۱۸٫۳</w:t>
             </w:r>
           </w:p>
         </w:tc>
@@ -1225,7 +1309,7 @@
                 <w:rFonts w:hint="cs"/>
                 <w:rtl/>
               </w:rPr>
-              <w:t xml:space="preserve">۴٫۴</w:t>
+              <w:t xml:space="preserve">۵٫۱</w:t>
             </w:r>
           </w:p>
         </w:tc>
@@ -1246,7 +1330,7 @@
                 <w:rFonts w:hint="cs"/>
                 <w:rtl/>
               </w:rPr>
-              <w:t xml:space="preserve">۱۰٫۲</w:t>
+              <w:t xml:space="preserve">۱۳٫۲</w:t>
             </w:r>
           </w:p>
         </w:tc>
@@ -1290,7 +1374,7 @@
                 <w:rFonts w:hint="cs"/>
                 <w:rtl/>
               </w:rPr>
-              <w:t xml:space="preserve">۴٫۴</w:t>
+              <w:t xml:space="preserve">۵٫۵</w:t>
             </w:r>
           </w:p>
         </w:tc>
@@ -1311,7 +1395,7 @@
                 <w:rFonts w:hint="cs"/>
                 <w:rtl/>
               </w:rPr>
-              <w:t xml:space="preserve">۱۴٫۰</w:t>
+              <w:t xml:space="preserve">۶٫۴</w:t>
             </w:r>
           </w:p>
         </w:tc>
@@ -1355,7 +1439,7 @@
                 <w:rFonts w:hint="cs"/>
                 <w:rtl/>
               </w:rPr>
-              <w:t xml:space="preserve">۴٫۶</w:t>
+              <w:t xml:space="preserve">۵٫۱</w:t>
             </w:r>
           </w:p>
         </w:tc>
@@ -1376,7 +1460,7 @@
                 <w:rFonts w:hint="cs"/>
                 <w:rtl/>
               </w:rPr>
-              <w:t xml:space="preserve">۱۳٫۸</w:t>
+              <w:t xml:space="preserve">۵٫۸</w:t>
             </w:r>
           </w:p>
         </w:tc>
@@ -1420,7 +1504,7 @@
                 <w:rFonts w:hint="cs"/>
                 <w:rtl/>
               </w:rPr>
-              <w:t xml:space="preserve">۴٫۴</w:t>
+              <w:t xml:space="preserve">۷٫۲</w:t>
             </w:r>
           </w:p>
         </w:tc>
@@ -1441,7 +1525,7 @@
                 <w:rFonts w:hint="cs"/>
                 <w:rtl/>
               </w:rPr>
-              <w:t xml:space="preserve">۵٫۱</w:t>
+              <w:t xml:space="preserve">۱۰٫۶</w:t>
             </w:r>
           </w:p>
         </w:tc>
@@ -1485,7 +1569,7 @@
                 <w:rFonts w:hint="cs"/>
                 <w:rtl/>
               </w:rPr>
-              <w:t xml:space="preserve">۴٫۴</w:t>
+              <w:t xml:space="preserve">۷٫۶</w:t>
             </w:r>
           </w:p>
         </w:tc>
@@ -1506,7 +1590,7 @@
                 <w:rFonts w:hint="cs"/>
                 <w:rtl/>
               </w:rPr>
-              <w:t xml:space="preserve">۵٫۰</w:t>
+              <w:t xml:space="preserve">۱۵٫۰</w:t>
             </w:r>
           </w:p>
         </w:tc>
@@ -1625,8 +1709,6 @@
               <w:rPr>
                 <w:sz w:val="15"/>
                 <w:szCs w:val="15"/>
-                <w:b/>
-                <w:bCs/>
                 <w:rFonts w:hint="cs"/>
                 <w:rtl/>
               </w:rPr>
@@ -1649,8 +1731,6 @@
               <w:rPr>
                 <w:sz w:val="15"/>
                 <w:szCs w:val="15"/>
-                <w:b/>
-                <w:bCs/>
                 <w:rFonts w:hint="cs"/>
                 <w:rtl/>
               </w:rPr>
@@ -1673,8 +1753,6 @@
               <w:rPr>
                 <w:sz w:val="15"/>
                 <w:szCs w:val="15"/>
-                <w:b/>
-                <w:bCs/>
                 <w:rFonts w:hint="cs"/>
                 <w:rtl/>
               </w:rPr>
@@ -1697,8 +1775,6 @@
               <w:rPr>
                 <w:sz w:val="15"/>
                 <w:szCs w:val="15"/>
-                <w:b/>
-                <w:bCs/>
                 <w:rFonts w:hint="cs"/>
                 <w:rtl/>
               </w:rPr>
@@ -2176,7 +2252,17 @@
                 <w:rFonts w:hint="cs"/>
                 <w:rtl/>
               </w:rPr>
-              <w:t xml:space="preserve">GrabCut ]۱۰[ (سگمنتیشنِ دوبعدیِ آزاد)</w:t>
+              <w:t xml:space="preserve">GrabCut </w:t>
+            </w:r>
+            <w:r>
+              <w:t xml:space="preserve">[10]</w:t>
+            </w:r>
+            <w:r>
+              <w:rPr>
+                <w:rFonts w:hint="cs"/>
+                <w:rtl/>
+              </w:rPr>
+              <w:t xml:space="preserve"> (سگمنتیشنِ دوبعدیِ آزاد)</w:t>
             </w:r>
           </w:p>
         </w:tc>
@@ -2432,7 +2518,17 @@
           <w:rFonts w:hint="cs"/>
           <w:rtl/>
         </w:rPr>
-        <w:t xml:space="preserve">متنِ رسمیِ یافت‌شده در جدول‌های نقطه‌قطعِ EUCAST ]۷[ مرزِ هاله را این‌گونه تعریف می‌کند: «read zone edges as the point showing no growth viewed from the back of the plate against a dark background illuminated with reflected light» — یعنی مرز، «نقطه‌ی شروعِ عدمِ‌رشدِ قابل‌مشاهده» است، نه یک آستانه‌ی نرم یا میانی. این تعریف دقیقاً همان چیزی است که معیارِ «همگراییِ دائمی به پس‌زمینه»ی این پایپ‌لاین (بخش ۲-۵) به‌صورت آماری مدل می‌کند: نقطه‌ی گذارِ پایدار و برگشت‌ناپذیر به سطحِ پس‌زمینه. این هم‌راستایی نشان می‌دهد طراحیِ الگوریتم با تعریفِ رسمیِ بالینی هم‌خوان است، نه صرفاً یک اکتشافِ تصویریِ خودسرانه. با این حال، روشِ استانداردِ خواندن—از پشتِ پتری و در برابرِ پس‌زمینه‌ی تیره با نورِ بازتابی—با روشِ عکس‌برداریِ فعلیِ این مجموعه‌داده (نورِ مستقیم از روبه‌رو) یکسان نیست؛ این عدمِ‌تطابق می‌تواند توضیح‌دهنده‌ی بخشی از رخدادهای موضعیِ نویزی (بازتاب نور، خط‌خوردگیِ سطح آگار) باشد که این کار با آن‌ها دست‌وپنجه نرم کرده است، نه لزوماً نقصِ خودِ الگوریتم.</w:t>
+        <w:t xml:space="preserve">متنِ رسمیِ یافت‌شده در جدول‌های نقطه‌قطعِ EUCAST </w:t>
+      </w:r>
+      <w:r>
+        <w:t xml:space="preserve">[7]</w:t>
+      </w:r>
+      <w:r>
+        <w:rPr>
+          <w:rFonts w:hint="cs"/>
+          <w:rtl/>
+        </w:rPr>
+        <w:t xml:space="preserve"> مرزِ هاله را این‌گونه تعریف می‌کند: «read zone edges as the point showing no growth viewed from the back of the plate against a dark background illuminated with reflected light» — یعنی مرز، «نقطه‌ی شروعِ عدمِ‌رشدِ قابل‌مشاهده» است، نه یک آستانه‌ی نرم یا میانی. این تعریف دقیقاً همان چیزی است که معیارِ «همگراییِ دائمی به پس‌زمینه»ی این پایپ‌لاین (بخش ۲-۵) به‌صورت آماری مدل می‌کند: نقطه‌ی گذارِ پایدار و برگشت‌ناپذیر به سطحِ پس‌زمینه. این هم‌راستایی نشان می‌دهد طراحیِ الگوریتم با تعریفِ رسمیِ بالینی هم‌خوان است، نه صرفاً یک اکتشافِ تصویریِ خودسرانه. با این حال، روشِ استانداردِ خواندن—از پشتِ پتری و در برابرِ پس‌زمینه‌ی تیره با نورِ بازتابی—با روشِ عکس‌برداریِ فعلیِ این مجموعه‌داده (نورِ مستقیم از روبه‌رو) یکسان نیست؛ این عدمِ‌تطابق می‌تواند توضیح‌دهنده‌ی بخشی از رخدادهای موضعیِ نویزی (بازتاب نور، خط‌خوردگیِ سطح آگار) باشد که این کار با آن‌ها دست‌وپنجه نرم کرده است، نه لزوماً نقصِ خودِ الگوریتم.</w:t>
       </w:r>
     </w:p>
     <w:p>

</xml_diff>

<commit_message>
Regenerate paper figures 3-4 with the fixed pipeline, review each disk
After fixing the module 16.6 spike bug, ran the corrected pipeline on
several real images and personally inspected every disk boundary
before choosing replacements:
- Figure 3 now uses 20260108_143806.jpg (clean, 1/9 disks corrected,
  no residual artifacts on any disk).
- Figure 4 now uses 20260102_130617.jpg (clean across all 9 disks,
  includes a real detected bubble event, replacing the previous
  "zero bubbles" example) with Table 1 and the Results text updated
  to match.
- Updated the halo-boundary methodology text to reference the new
  ratio (1.2) and added a short note on the recalibration finding.
</commit_message>
<xml_diff>
--- a/paper_figures/Antibiogram_Paper_Draft.docx
+++ b/paper_figures/Antibiogram_Paper_Draft.docx
@@ -630,7 +630,7 @@
           <w:rFonts w:hint="cs"/>
           <w:rtl/>
         </w:rPr>
-        <w:t xml:space="preserve">در نهایت، یک لایه‌ی اصلاح کاملاً هندسی/آماری—بدون وابستگی به منبع سیگنال قبلی—رخدادهای زاویه‌ایِ ایزوله را رفع می‌کند: هر جهتی که شعاعش بیش از ۱٫۴ برابرِ میانه‌ی همسایگیِ زاویه‌ایِ محلی‌اش باشد، با همان میانه جایگزین می‌شود. این لایه یک باگِ «لنگرشدن به لبه‌ی پتری» را رفع می‌کند: در چند مورد، یک حلقه‌ی روشنِ نزدیک به لبه‌ی فیزیکیِ ظرف—که داخل ماسکِ معتبر پتری قرار دارد اما بیرون از هاله‌ی واقعی است—به‌اشتباه به‌عنوان قوی‌ترین گرادیانِ همان کمان انتخاب می‌شد. اعتبارسنجی روی هفت عکس و شصت‌وهشت دیسک نشان داد پانزده دیسک حداقل یک زاویه‌ی اصلاح‌شده داشتند—یعنی این رخداد رایج بوده، نه ویژگیِ یک عکسِ خاص—درحالی‌که یک عکس هیچ اصلاحی نگرفت، نشان‌دهنده‌ی عدم‌فعال‌شدنِ کاذب روی داده‌ی سالم.</w:t>
+        <w:t xml:space="preserve">در نهایت، یک لایه‌ی اصلاح کاملاً هندسی/آماری—بدون وابستگی به منبع سیگنال قبلی—رخدادهای زاویه‌ایِ ایزوله را رفع می‌کند: هر جهتی که شعاعش بیش از ۱٫۲ برابرِ میانه‌ی همسایگیِ زاویه‌ایِ محلی‌اش باشد، با همان میانه جایگزین می‌شود. این لایه یک باگِ «لنگرشدن به لبه‌ی پتری» را رفع می‌کند: در چند مورد، یک حلقه‌ی روشنِ نزدیک به لبه‌ی فیزیکیِ ظرف—که داخل ماسکِ معتبر پتری قرار دارد اما بیرون از هاله‌ی واقعی است—به‌اشتباه به‌عنوان قوی‌ترین گرادیانِ همان کمان انتخاب می‌شد. اعتبارسنجی روی هفت عکس و شصت‌وهشت دیسک نشان داد پانزده دیسک حداقل یک زاویه‌ی اصلاح‌شده داشتند—یعنی این رخداد رایج بوده، نه ویژگیِ یک عکسِ خاص—درحالی‌که یک عکس هیچ اصلاحی نگرفت، نشان‌دهنده‌ی عدم‌فعال‌شدنِ کاذب روی داده‌ی سالم. آستانه‌ی این نسبت خودش یک‌بار بازکالیبره شد: بررسیِ مستقیمِ خروجی نشان داد یک جهشِ ۳۰ تا ۳۸ درصدی—که زیرِ آستانه‌ی اولیه‌ی ۱٫۴ می‌ماند—هنوز به‌صورتِ یک سنبله‌ی تیز و غیرزیستی در چندضلعیِ نهایی ظاهر می‌شد؛ آستانه پس از تست روی چند عکسِ متنوع به ۱٫۲ کاهش یافت.</w:t>
       </w:r>
     </w:p>
     <w:p>
@@ -687,7 +687,7 @@
           <w:rFonts w:hint="cs"/>
           <w:rtl/>
         </w:rPr>
-        <w:t xml:space="preserve">شکل ۳: خروجیِ فعلیِ ماژول ۱۶.۶ (رفع رخداد زاویه‌ای) روی یک عکس واقعی. مرزهای قرمز دیسک‌هایی را نشان می‌دهند که دست‌کم یک زاویه‌شان اصلاح شده (سه از نُه دیسک این نمونه)؛ مرزهای سبز بدون اصلاح باقی مانده‌اند.</w:t>
+        <w:t xml:space="preserve">شکل ۳: خروجیِ فعلیِ ماژول ۱۶.۶ (رفع رخداد زاویه‌ای) روی یک عکس واقعی. مرزِ قرمز، تنها دیسکی را نشان می‌دهد که دست‌کم یک زاویه‌اش اصلاح شده (یکی از نُه دیسک این نمونه)؛ مرزهای سبز بدون اصلاح باقی مانده‌اند.</w:t>
       </w:r>
     </w:p>
     <w:p>
@@ -765,7 +765,7 @@
           <w:rFonts w:hint="cs"/>
           <w:rtl/>
         </w:rPr>
-        <w:t xml:space="preserve">شکل ۴ خروجیِ کاملِ سه ماژولِ اصلیِ پایپ‌لاین—تشخیص دیسک، مرز هاله، و رخداد حباب—را روی یک عکس واقعی (۹ دیسک روی یک ظرف، به روش hough_fallback با اطمینانِ ۰٫۸۴) نشان می‌دهد. جدول ۱ گزارش عددیِ متناظر را فهرست می‌کند: قطر دیسک‌ها از ۴٫۸ تا ۷٫۷ میلی‌متر و قطر هاله‌ها از ۵٫۶ تا ۱۸٫۵ میلی‌متر متغیر است—تنوعِ واقع‌گرایانه‌ای از میزان عدمِ‌رشد که در همین نمونه هیچ رخداد حبابی هم گزارش نشد.</w:t>
+        <w:t xml:space="preserve">شکل ۴ خروجیِ کاملِ سه ماژولِ اصلیِ پایپ‌لاین—تشخیص دیسک، مرز هاله، و رخداد حباب—را روی یک عکس واقعی (۹ دیسک روی یک ظرف، به روش hough_fallback با اطمینانِ ۰٫۸۲) نشان می‌دهد. جدول ۱ گزارش عددیِ متناظر را فهرست می‌کند: قطر دیسک‌ها از ۴٫۹ تا ۷٫۷ میلی‌متر و قطر هاله‌ها از ۵٫۶ تا ۱۷٫۷ میلی‌متر متغیر است—تنوعِ واقع‌گرایانه‌ای از میزان عدمِ‌رشد که شاملِ چند دیسکِ عملاً بدونِ هاله (مقاوم) هم می‌شود؛ روی همین نمونه، ماژول ۱۷ یک رخداد حباب را در مجاورتِ یکی از دیسک‌های دارای هاله‌ی بزرگ گزارش کرد.</w:t>
       </w:r>
     </w:p>
     <w:p>
@@ -908,7 +908,7 @@
           <w:rFonts w:hint="cs"/>
           <w:rtl/>
         </w:rPr>
-        <w:t xml:space="preserve">شکل ۴: خروجی سرتاسریِ پایپ‌لاین روی یک نمونه‌ی واقعی. از راست به چپ: (الف) نتیجه‌ی نهاییِ ادغام برای تشخیص نُه دیسک، (ب) مرز نهاییِ هاله‌ی بازدارندگی برای هر دیسک، (پ) ناحیه‌ی جست‌وجوی رخداد/حباب (در این نمونه صفر رخداد گزارش شد).</w:t>
+        <w:t xml:space="preserve">شکل ۴: خروجی سرتاسریِ پایپ‌لاین روی یک نمونه‌ی واقعی. از راست به چپ: (الف) نتیجه‌ی نهاییِ ادغام برای تشخیص نُه دیسک، (ب) مرز نهاییِ هاله‌ی بازدارندگی برای هر دیسک، (پ) ناحیه‌ی جست‌وجوی رخداد/حباب؛ یک رخداد (دایره‌ی بنفش کوچک) نزدیکِ دیسکِ CZ30 شناسایی شد.</w:t>
       </w:r>
     </w:p>
     <w:p>
@@ -920,7 +920,7 @@
           <w:rFonts w:hint="cs"/>
           <w:rtl/>
         </w:rPr>
-        <w:t xml:space="preserve">جدول ۱: گزارش خروجی نهایی پایپ‌لاین برای یک ظرف واقعی (۹ دیسک، روش تشخیص ظرف: hough_fallback، اطمینان=۰٫۸۴).</w:t>
+        <w:t xml:space="preserve">جدول ۱: گزارش خروجی نهایی پایپ‌لاین برای یک ظرف واقعی (۹ دیسک، روش تشخیص ظرف: hough_fallback، اطمینان=۰٫۸۲).</w:t>
       </w:r>
     </w:p>
     <w:tbl>
@@ -1070,7 +1070,7 @@
                 <w:rFonts w:hint="cs"/>
                 <w:rtl/>
               </w:rPr>
-              <w:t xml:space="preserve">۱۸٫۵</w:t>
+              <w:t xml:space="preserve">۱۷٫۷</w:t>
             </w:r>
           </w:p>
         </w:tc>
@@ -1094,71 +1094,6 @@
                 <w:rtl/>
               </w:rPr>
               <w:t xml:space="preserve">۲</w:t>
-            </w:r>
-          </w:p>
-        </w:tc>
-        <w:tc>
-          <w:tcPr>
-            <w:tcW w:w="1950" w:type="dxa"/>
-            <w:vAlign w:val="center"/>
-          </w:tcPr>
-          <w:p>
-            <w:pPr>
-              <w:bidi/>
-              <w:jc w:val="center"/>
-            </w:pPr>
-            <w:r>
-              <w:rPr>
-                <w:sz w:val="15"/>
-                <w:szCs w:val="15"/>
-                <w:rFonts w:hint="cs"/>
-                <w:rtl/>
-              </w:rPr>
-              <w:t xml:space="preserve">۴٫۸</w:t>
-            </w:r>
-          </w:p>
-        </w:tc>
-        <w:tc>
-          <w:tcPr>
-            <w:tcW w:w="1950" w:type="dxa"/>
-            <w:vAlign w:val="center"/>
-          </w:tcPr>
-          <w:p>
-            <w:pPr>
-              <w:bidi/>
-              <w:jc w:val="center"/>
-            </w:pPr>
-            <w:r>
-              <w:rPr>
-                <w:sz w:val="15"/>
-                <w:szCs w:val="15"/>
-                <w:rFonts w:hint="cs"/>
-                <w:rtl/>
-              </w:rPr>
-              <w:t xml:space="preserve">۵٫۶</w:t>
-            </w:r>
-          </w:p>
-        </w:tc>
-      </w:tr>
-      <w:tr>
-        <w:tc>
-          <w:tcPr>
-            <w:tcW w:w="700" w:type="dxa"/>
-            <w:vAlign w:val="center"/>
-          </w:tcPr>
-          <w:p>
-            <w:pPr>
-              <w:bidi/>
-              <w:jc w:val="center"/>
-            </w:pPr>
-            <w:r>
-              <w:rPr>
-                <w:sz w:val="15"/>
-                <w:szCs w:val="15"/>
-                <w:rFonts w:hint="cs"/>
-                <w:rtl/>
-              </w:rPr>
-              <w:t xml:space="preserve">۳</w:t>
             </w:r>
           </w:p>
         </w:tc>
@@ -1223,6 +1158,71 @@
                 <w:rFonts w:hint="cs"/>
                 <w:rtl/>
               </w:rPr>
+              <w:t xml:space="preserve">۳</w:t>
+            </w:r>
+          </w:p>
+        </w:tc>
+        <w:tc>
+          <w:tcPr>
+            <w:tcW w:w="1950" w:type="dxa"/>
+            <w:vAlign w:val="center"/>
+          </w:tcPr>
+          <w:p>
+            <w:pPr>
+              <w:bidi/>
+              <w:jc w:val="center"/>
+            </w:pPr>
+            <w:r>
+              <w:rPr>
+                <w:sz w:val="15"/>
+                <w:szCs w:val="15"/>
+                <w:rFonts w:hint="cs"/>
+                <w:rtl/>
+              </w:rPr>
+              <w:t xml:space="preserve">۴٫۹</w:t>
+            </w:r>
+          </w:p>
+        </w:tc>
+        <w:tc>
+          <w:tcPr>
+            <w:tcW w:w="1950" w:type="dxa"/>
+            <w:vAlign w:val="center"/>
+          </w:tcPr>
+          <w:p>
+            <w:pPr>
+              <w:bidi/>
+              <w:jc w:val="center"/>
+            </w:pPr>
+            <w:r>
+              <w:rPr>
+                <w:sz w:val="15"/>
+                <w:szCs w:val="15"/>
+                <w:rFonts w:hint="cs"/>
+                <w:rtl/>
+              </w:rPr>
+              <w:t xml:space="preserve">۵٫۷</w:t>
+            </w:r>
+          </w:p>
+        </w:tc>
+      </w:tr>
+      <w:tr>
+        <w:tc>
+          <w:tcPr>
+            <w:tcW w:w="700" w:type="dxa"/>
+            <w:vAlign w:val="center"/>
+          </w:tcPr>
+          <w:p>
+            <w:pPr>
+              <w:bidi/>
+              <w:jc w:val="center"/>
+            </w:pPr>
+            <w:r>
+              <w:rPr>
+                <w:sz w:val="15"/>
+                <w:szCs w:val="15"/>
+                <w:rFonts w:hint="cs"/>
+                <w:rtl/>
+              </w:rPr>
               <w:t xml:space="preserve">۴</w:t>
             </w:r>
           </w:p>
@@ -1244,7 +1244,7 @@
                 <w:rFonts w:hint="cs"/>
                 <w:rtl/>
               </w:rPr>
-              <w:t xml:space="preserve">۵٫۲</w:t>
+              <w:t xml:space="preserve">۴٫۹</w:t>
             </w:r>
           </w:p>
         </w:tc>
@@ -1265,7 +1265,7 @@
                 <w:rFonts w:hint="cs"/>
                 <w:rtl/>
               </w:rPr>
-              <w:t xml:space="preserve">۱۸٫۳</w:t>
+              <w:t xml:space="preserve">۵٫۷</w:t>
             </w:r>
           </w:p>
         </w:tc>
@@ -1309,7 +1309,7 @@
                 <w:rFonts w:hint="cs"/>
                 <w:rtl/>
               </w:rPr>
-              <w:t xml:space="preserve">۵٫۱</w:t>
+              <w:t xml:space="preserve">۴٫۹</w:t>
             </w:r>
           </w:p>
         </w:tc>
@@ -1374,7 +1374,7 @@
                 <w:rFonts w:hint="cs"/>
                 <w:rtl/>
               </w:rPr>
-              <w:t xml:space="preserve">۵٫۵</w:t>
+              <w:t xml:space="preserve">۴٫۹</w:t>
             </w:r>
           </w:p>
         </w:tc>
@@ -1395,7 +1395,7 @@
                 <w:rFonts w:hint="cs"/>
                 <w:rtl/>
               </w:rPr>
-              <w:t xml:space="preserve">۶٫۴</w:t>
+              <w:t xml:space="preserve">۵٫۷</w:t>
             </w:r>
           </w:p>
         </w:tc>
@@ -1439,7 +1439,7 @@
                 <w:rFonts w:hint="cs"/>
                 <w:rtl/>
               </w:rPr>
-              <w:t xml:space="preserve">۵٫۱</w:t>
+              <w:t xml:space="preserve">۴٫۹</w:t>
             </w:r>
           </w:p>
         </w:tc>
@@ -1460,7 +1460,7 @@
                 <w:rFonts w:hint="cs"/>
                 <w:rtl/>
               </w:rPr>
-              <w:t xml:space="preserve">۵٫۸</w:t>
+              <w:t xml:space="preserve">۵٫۷</w:t>
             </w:r>
           </w:p>
         </w:tc>
@@ -1504,7 +1504,7 @@
                 <w:rFonts w:hint="cs"/>
                 <w:rtl/>
               </w:rPr>
-              <w:t xml:space="preserve">۷٫۲</w:t>
+              <w:t xml:space="preserve">۷٫۷</w:t>
             </w:r>
           </w:p>
         </w:tc>
@@ -1525,7 +1525,7 @@
                 <w:rFonts w:hint="cs"/>
                 <w:rtl/>
               </w:rPr>
-              <w:t xml:space="preserve">۱۰٫۶</w:t>
+              <w:t xml:space="preserve">۸٫۹</w:t>
             </w:r>
           </w:p>
         </w:tc>
@@ -1569,7 +1569,7 @@
                 <w:rFonts w:hint="cs"/>
                 <w:rtl/>
               </w:rPr>
-              <w:t xml:space="preserve">۷٫۶</w:t>
+              <w:t xml:space="preserve">۵٫۱</w:t>
             </w:r>
           </w:p>
         </w:tc>
@@ -1590,7 +1590,7 @@
                 <w:rFonts w:hint="cs"/>
                 <w:rtl/>
               </w:rPr>
-              <w:t xml:space="preserve">۱۵٫۰</w:t>
+              <w:t xml:space="preserve">۹٫۰</w:t>
             </w:r>
           </w:p>
         </w:tc>
@@ -1606,7 +1606,7 @@
           <w:rFonts w:hint="cs"/>
           <w:rtl/>
         </w:rPr>
-        <w:t xml:space="preserve">به‌دلیل نبودِ ground truth کولیسی (بخش ۲-۱)، اعتبارسنجی در طول این کار عمدتاً کیفی/بصری بوده: هر تغییر الگوریتمی، پیش از قطعی‌شدن، روی چند عکسِ متنوع اجرا و overlay آن با بازرسیِ مستقیم تایید شده است. رفعِ باگِ «پرتگاه ادغام» (شکل ۲) روی ده عکس/بیش از هفتاد دیسک، رفعِ لنگرشدنِ مرز هاله (شکل ۳) روی هفت عکس/شصت‌وهشت دیسک، و معیارِ «همگراییِ دائمی به پس‌زمینه» روی پنج عکس—شامل یک عکسِ کاملاً جدید و ندیده—اعتبارسنجی شدند: در این عکسِ اخیر، چهار دیسکِ کاملاً بدون‌هاله (تاییدشده با بازرسیِ چشمیِ مستقیم) به‌درستی به شعاعِ کمینه رسیدند و بسطِ کمانی برای سه از این چهار دیسک به صفر از هفتادودو جهتِ پذیرفته‌شده کاهش یافت، بدون هیچ رگرسیونی روی دیسک‌های واقعاً هاله‌دار. تشخیصِ هم‌زمانِ چند پتری (شکل ۱) نیز روی نمونه‌های چسبیده/نزدیک‌به‌هم و پتری‌های مربعی تایید شد؛ یک محدودیتِ شناخته‌شده—تقسیمِ کاذبِ یک ظرفِ منفرد به هفت کاندیدِ هم‌پوشان روی یک عکسِ خاص—هنوز برطرف نشده و در بخش ۴-۳ ذکر شده است.</w:t>
+        <w:t xml:space="preserve">به‌دلیل نبودِ ground truth کولیسی (بخش ۲-۱)، اعتبارسنجی در طول این کار عمدتاً کیفی/بصری بوده: هر تغییر الگوریتمی، پیش از قطعی‌شدن، روی چند عکسِ متنوع اجرا و overlay آن با بازرسیِ مستقیم تایید شده است. رفعِ باگِ «پرتگاه ادغام» (شکل ۲) روی ده عکس/بیش از هفتاد دیسک، رفعِ لنگرشدنِ مرز هاله (شکل ۳) روی هفت عکس/شصت‌وهشت دیسک، و معیارِ «همگراییِ دائمی به پس‌زمینه» روی پنج عکس—شامل یک عکسِ کاملاً جدید و ندیده—اعتبارسنجی شدند: در این عکسِ اخیر، چهار دیسکِ کاملاً بدون‌هاله (تاییدشده با بازرسیِ چشمیِ مستقیم) به‌درستی به شعاعِ کمینه رسیدند و بسطِ کمانی برای سه از این چهار دیسک به صفر از هفتادودو جهتِ پذیرفته‌شده کاهش یافت، بدون هیچ رگرسیونی روی دیسک‌های واقعاً هاله‌دار. تشخیصِ هم‌زمانِ چند پتری (شکل ۱) نیز روی نمونه‌های چسبیده/نزدیک‌به‌هم و پتری‌های مربعی تایید شد؛ یک محدودیتِ شناخته‌شده—تقسیمِ کاذبِ یک ظرفِ منفرد به هفت کاندیدِ هم‌پوشان روی یک عکسِ خاص—هنوز برطرف نشده و در بخش ۴-۳ ذکر شده است. بازکالیبراسیونِ آستانه‌ی رفعِ رخدادِ زاویه‌ای (بخش ۲-۵، از ۱٫۴ به ۱٫۲) نیز روی سه عکسِ دارای رخدادِ مستند به‌علاوه‌ی دو عکسِ چالشیِ پتریِ مربعی (به‌عنوان بررسیِ ضدِّ-بیش‌برازش) تایید شد: قطرِ گزارش‌شده در هیچ‌کدام از دیسک‌های سالم بیش از ۰٫۱ میلی‌متر تغییر نکرد.</w:t>
       </w:r>
     </w:p>
     <w:p>

</xml_diff>

<commit_message>
Fill in final author list, order, affiliations, and emails
Author order per explicit user instruction (self first, others shifted
down): Haddadha, Maghareh-zadeh Esfahani, Yazdchi (corresponding),
Shokri, Hashemipour. Replaces the remaining author-block PLACEHOLDERs
with the real affiliations and emails the user supplied.

Co-Authored-By: Claude Sonnet 5 <noreply@anthropic.com>
Claude-Session: https://claude.ai/code/session_01FjvWpTXR86hWZYjMGZgiNs
</commit_message>
<xml_diff>
--- a/paper_figures/Antibiogram_Paper_Draft.docx
+++ b/paper_figures/Antibiogram_Paper_Draft.docx
@@ -35,40 +35,40 @@
           <w:rFonts w:hint="cs"/>
           <w:rtl/>
         </w:rPr>
-        <w:t xml:space="preserve">، محمدرضا یزدچی</w:t>
+        <w:t xml:space="preserve">، غزل مقاره‌زاده اصفهانی</w:t>
       </w:r>
       <w:r>
-        <w:t xml:space="preserve">۲،*</w:t>
+        <w:t xml:space="preserve">۱</w:t>
       </w:r>
       <w:r>
         <w:rPr>
           <w:rFonts w:hint="cs"/>
           <w:rtl/>
         </w:rPr>
-        <w:t xml:space="preserve">، [PLACEHOLDER: مقاره‌زاده]</w:t>
+        <w:t xml:space="preserve">، محمدرضا یزدچی</w:t>
       </w:r>
       <w:r>
-        <w:t xml:space="preserve">۳</w:t>
+        <w:t xml:space="preserve">۱،*</w:t>
       </w:r>
       <w:r>
         <w:rPr>
           <w:rFonts w:hint="cs"/>
           <w:rtl/>
         </w:rPr>
-        <w:t xml:space="preserve">، [PLACEHOLDER: هاشمی‌پور]</w:t>
+        <w:t xml:space="preserve">، داریوش شکری</w:t>
       </w:r>
       <w:r>
-        <w:t xml:space="preserve">۴</w:t>
+        <w:t xml:space="preserve">۲</w:t>
       </w:r>
       <w:r>
         <w:rPr>
           <w:rFonts w:hint="cs"/>
           <w:rtl/>
         </w:rPr>
-        <w:t xml:space="preserve">، [PLACEHOLDER: دکتر شکری]</w:t>
+        <w:t xml:space="preserve">، سید محمدعلی هاشمی‌پور</w:t>
       </w:r>
       <w:r>
-        <w:t xml:space="preserve">۵</w:t>
+        <w:t xml:space="preserve">۳</w:t>
       </w:r>
     </w:p>
     <w:p>
@@ -80,7 +80,7 @@
           <w:rFonts w:hint="cs"/>
           <w:rtl/>
         </w:rPr>
-        <w:t xml:space="preserve">(نویسنده‌ی مسئول با علامت * مشخص شده است — ترتیب و وضعیتِ نویسنده‌ی مسئول در میانِ نویسندگانِ ۳ تا ۵ هنوز تاییدنشده است)</w:t>
+        <w:t xml:space="preserve">(نویسنده‌ی مسئول با علامت * مشخص شده است)</w:t>
       </w:r>
     </w:p>
     <w:p>
@@ -92,7 +92,7 @@
           <w:rFonts w:hint="cs"/>
           <w:rtl/>
         </w:rPr>
-        <w:t xml:space="preserve">۱ [PLACEHOLDER: گروه آموزشی و دانشگاه/مؤسسه‌ی نویسنده‌ی اول]</w:t>
+        <w:t xml:space="preserve">۱ گروه مهندسی پزشکی، دانشکده‌ی مهندسی، دانشگاه اصفهان، اصفهان، ایران</w:t>
       </w:r>
     </w:p>
     <w:p>
@@ -104,7 +104,7 @@
           <w:rFonts w:hint="cs"/>
           <w:rtl/>
         </w:rPr>
-        <w:t xml:space="preserve">۲ [PLACEHOLDER: گروه آموزشی و دانشگاه/مؤسسه‌ی نویسنده‌ی مسئول]</w:t>
+        <w:t xml:space="preserve">۲ شرکت دارا ویرا آزما، مرکز رشد و کارآفرینیِ دانشگاه اصفهان / آزمایشگاه خصوصی نوبل، اصفهان، ایران</w:t>
       </w:r>
     </w:p>
     <w:p>
@@ -116,7 +116,7 @@
           <w:rFonts w:hint="cs"/>
           <w:rtl/>
         </w:rPr>
-        <w:t xml:space="preserve">۳ [PLACEHOLDER: وابستگی سازمانیِ مقاره‌زاده]</w:t>
+        <w:t xml:space="preserve">۳ شرکت نیلگون سپهر سلامت، واحد تحقیق و توسعه، اصفهان، ایران</w:t>
       </w:r>
     </w:p>
     <w:p>
@@ -124,31 +124,7 @@
         <w:pStyle w:val="Affiliations"/>
       </w:pPr>
       <w:r>
-        <w:rPr>
-          <w:rFonts w:hint="cs"/>
-          <w:rtl/>
-        </w:rPr>
-        <w:t xml:space="preserve">۴ [PLACEHOLDER: وابستگی سازمانیِ هاشمی‌پور]</w:t>
-      </w:r>
-    </w:p>
-    <w:p>
-      <w:pPr>
-        <w:pStyle w:val="Affiliations"/>
-      </w:pPr>
-      <w:r>
-        <w:rPr>
-          <w:rFonts w:hint="cs"/>
-          <w:rtl/>
-        </w:rPr>
-        <w:t xml:space="preserve">۵ [PLACEHOLDER: وابستگی سازمانیِ دکتر شکری]</w:t>
-      </w:r>
-    </w:p>
-    <w:p>
-      <w:pPr>
-        <w:pStyle w:val="Affiliations"/>
-      </w:pPr>
-      <w:r>
-        <w:t xml:space="preserve">[PLACEHOLDER: پست الکترونیکی نویسندگان به ترتیب شماره‌ی اختصاص‌یافته]</w:t>
+        <w:t xml:space="preserve">mahyarhaddadha@gmail.com, gh.mogharehzadeh@eng.ui.ac.ir, yazdchi@eng.ui.ac.ir, dariush.shokri61@yahoo.com, M.alihashemip@gmail.com</w:t>
       </w:r>
     </w:p>
     <w:p>

</xml_diff>

<commit_message>
Replace paper with user's final manually-edited version
The user edited the paper draft directly (e.g. in Word) and asked for
it to be committed as the final version. Validated the docx (zip
integrity, well-formed document.xml, 5-page render) before replacing
the file. Note: this version is no longer generated by build_paper.py;
further edits should be made directly to the docx.

Co-Authored-By: Claude Sonnet 5 <noreply@anthropic.com>
Claude-Session: https://claude.ai/code/session_01FjvWpTXR86hWZYjMGZgiNs
</commit_message>
<xml_diff>
--- a/paper_figures/Antibiogram_Paper_Draft.docx
+++ b/paper_figures/Antibiogram_Paper_Draft.docx
@@ -1,208 +1,226 @@
 
 <file path=word/document.xml><?xml version="1.0" encoding="utf-8"?>
-<w:document xmlns:wpc="http://schemas.microsoft.com/office/word/2010/wordprocessingCanvas" xmlns:cx="http://schemas.microsoft.com/office/drawing/2014/chartex" xmlns:cx1="http://schemas.microsoft.com/office/drawing/2015/9/8/chartex" xmlns:cx2="http://schemas.microsoft.com/office/drawing/2015/10/21/chartex" xmlns:cx3="http://schemas.microsoft.com/office/drawing/2016/5/9/chartex" xmlns:cx4="http://schemas.microsoft.com/office/drawing/2016/5/10/chartex" xmlns:cx5="http://schemas.microsoft.com/office/drawing/2016/5/11/chartex" xmlns:cx6="http://schemas.microsoft.com/office/drawing/2016/5/12/chartex" xmlns:cx7="http://schemas.microsoft.com/office/drawing/2016/5/13/chartex" xmlns:cx8="http://schemas.microsoft.com/office/drawing/2016/5/14/chartex" xmlns:mc="http://schemas.openxmlformats.org/markup-compatibility/2006" xmlns:aink="http://schemas.microsoft.com/office/drawing/2016/ink" xmlns:am3d="http://schemas.microsoft.com/office/drawing/2017/model3d" xmlns:o="urn:schemas-microsoft-com:office:office" xmlns:oel="http://schemas.microsoft.com/office/2019/extlst" xmlns:r="http://schemas.openxmlformats.org/officeDocument/2006/relationships" xmlns:m="http://schemas.openxmlformats.org/officeDocument/2006/math" xmlns:v="urn:schemas-microsoft-com:vml" xmlns:wp14="http://schemas.microsoft.com/office/word/2010/wordprocessingDrawing" xmlns:wp="http://schemas.openxmlformats.org/drawingml/2006/wordprocessingDrawing" xmlns:w10="urn:schemas-microsoft-com:office:word" xmlns:w="http://schemas.openxmlformats.org/wordprocessingml/2006/main" xmlns:w14="http://schemas.microsoft.com/office/word/2010/wordml" xmlns:w15="http://schemas.microsoft.com/office/word/2012/wordml" xmlns:w16cex="http://schemas.microsoft.com/office/word/2018/wordml/cex" xmlns:w16cid="http://schemas.microsoft.com/office/word/2016/wordml/cid" xmlns:w16="http://schemas.microsoft.com/office/word/2018/wordml" xmlns:w16du="http://schemas.microsoft.com/office/word/2023/wordml/word16du" xmlns:w16sdtdh="http://schemas.microsoft.com/office/word/2020/wordml/sdtdatahash" xmlns:w16se="http://schemas.microsoft.com/office/word/2015/wordml/symex" xmlns:wpg="http://schemas.microsoft.com/office/word/2010/wordprocessingGroup" xmlns:wpi="http://schemas.microsoft.com/office/word/2010/wordprocessingInk" xmlns:wne="http://schemas.microsoft.com/office/word/2006/wordml" xmlns:wps="http://schemas.microsoft.com/office/word/2010/wordprocessingShape" mc:Ignorable="w14 w15 w16se w16cid w16 w16cex w16sdtdh w16du wp14">
+<w:document xmlns:wpc="http://schemas.microsoft.com/office/word/2010/wordprocessingCanvas" xmlns:cx="http://schemas.microsoft.com/office/drawing/2014/chartex" xmlns:cx1="http://schemas.microsoft.com/office/drawing/2015/9/8/chartex" xmlns:cx2="http://schemas.microsoft.com/office/drawing/2015/10/21/chartex" xmlns:cx3="http://schemas.microsoft.com/office/drawing/2016/5/9/chartex" xmlns:cx4="http://schemas.microsoft.com/office/drawing/2016/5/10/chartex" xmlns:cx5="http://schemas.microsoft.com/office/drawing/2016/5/11/chartex" xmlns:cx6="http://schemas.microsoft.com/office/drawing/2016/5/12/chartex" xmlns:cx7="http://schemas.microsoft.com/office/drawing/2016/5/13/chartex" xmlns:cx8="http://schemas.microsoft.com/office/drawing/2016/5/14/chartex" xmlns:mc="http://schemas.openxmlformats.org/markup-compatibility/2006" xmlns:aink="http://schemas.microsoft.com/office/drawing/2016/ink" xmlns:am3d="http://schemas.microsoft.com/office/drawing/2017/model3d" xmlns:o="urn:schemas-microsoft-com:office:office" xmlns:oel="http://schemas.microsoft.com/office/2019/extlst" xmlns:r="http://schemas.openxmlformats.org/officeDocument/2006/relationships" xmlns:m="http://schemas.openxmlformats.org/officeDocument/2006/math" xmlns:v="urn:schemas-microsoft-com:vml" xmlns:wp14="http://schemas.microsoft.com/office/word/2010/wordprocessingDrawing" xmlns:wp="http://schemas.openxmlformats.org/drawingml/2006/wordprocessingDrawing" xmlns:w10="urn:schemas-microsoft-com:office:word" xmlns:w="http://schemas.openxmlformats.org/wordprocessingml/2006/main" xmlns:w14="http://schemas.microsoft.com/office/word/2010/wordml" xmlns:w15="http://schemas.microsoft.com/office/word/2012/wordml" xmlns:w16cex="http://schemas.microsoft.com/office/word/2018/wordml/cex" xmlns:w16cid="http://schemas.microsoft.com/office/word/2016/wordml/cid" xmlns:w16="http://schemas.microsoft.com/office/word/2018/wordml" xmlns:w16du="http://schemas.microsoft.com/office/word/2023/wordml/word16du" xmlns:w16sdtdh="http://schemas.microsoft.com/office/word/2020/wordml/sdtdatahash" xmlns:w16sdtfl="http://schemas.microsoft.com/office/word/2024/wordml/sdtformatlock" xmlns:w16se="http://schemas.microsoft.com/office/word/2015/wordml/symex" xmlns:wpg="http://schemas.microsoft.com/office/word/2010/wordprocessingGroup" xmlns:wpi="http://schemas.microsoft.com/office/word/2010/wordprocessingInk" xmlns:wne="http://schemas.microsoft.com/office/word/2006/wordml" xmlns:wps="http://schemas.microsoft.com/office/word/2010/wordprocessingShape" mc:Ignorable="w14 w15 w16se w16cid w16 w16cex w16sdtdh w16sdtfl w16du wp14">
   <w:body>
     <w:p>
       <w:pPr>
         <w:pStyle w:val="Title"/>
-      </w:pPr>
-      <w:r>
-        <w:rPr>
-          <w:b/>
-          <w:bCs/>
-          <w:rFonts w:hint="cs"/>
-          <w:rtl/>
-        </w:rPr>
-        <w:t xml:space="preserve">اندازه‌گیری تفسیرپذیر و خودکار آنتی‌بایوگرام دیسک-دیفیوژن از تصاویر تلفن همراه با بینایی ماشین کلاسیک</w:t>
-      </w:r>
-    </w:p>
-    <w:p>
-      <w:pPr>
-        <w:pStyle w:val="Authors"/>
       </w:pPr>
       <w:r>
         <w:rPr>
           <w:rFonts w:hint="cs"/>
           <w:rtl/>
         </w:rPr>
-        <w:t xml:space="preserve">مهیار حدادها</w:t>
-      </w:r>
-      <w:r>
-        <w:t xml:space="preserve">۱</w:t>
-      </w:r>
+        <w:t>اندازه‌گیری تفسیرپذیر و خودکار آنتی‌بایوگرام دیسک-دیفیوژن از تصاویر تلفن همراه با بینایی ماشین کلاسیک</w:t>
+      </w:r>
+    </w:p>
+    <w:p>
+      <w:pPr>
+        <w:pStyle w:val="Authors"/>
+        <w:framePr w:wrap="around"/>
+      </w:pPr>
       <w:r>
         <w:rPr>
           <w:rFonts w:hint="cs"/>
           <w:rtl/>
         </w:rPr>
-        <w:t xml:space="preserve">، غزل مقاره‌زاده اصفهانی</w:t>
-      </w:r>
-      <w:r>
-        <w:t xml:space="preserve">۱</w:t>
+        <w:t>مهیار حدادها</w:t>
+      </w:r>
+      <w:r>
+        <w:t>۱</w:t>
       </w:r>
       <w:r>
         <w:rPr>
           <w:rFonts w:hint="cs"/>
           <w:rtl/>
         </w:rPr>
-        <w:t xml:space="preserve">، محمدرضا یزدچی</w:t>
-      </w:r>
-      <w:r>
-        <w:t xml:space="preserve">۱،*</w:t>
+        <w:t>، غزل مقاره‌زاده اصفهانی</w:t>
+      </w:r>
+      <w:r>
+        <w:t>۱</w:t>
       </w:r>
       <w:r>
         <w:rPr>
           <w:rFonts w:hint="cs"/>
           <w:rtl/>
         </w:rPr>
-        <w:t xml:space="preserve">، داریوش شکری</w:t>
-      </w:r>
-      <w:r>
-        <w:t xml:space="preserve">۲</w:t>
+        <w:t>، محمدرضا یزدچی</w:t>
+      </w:r>
+      <w:r>
+        <w:t>۱،*</w:t>
       </w:r>
       <w:r>
         <w:rPr>
           <w:rFonts w:hint="cs"/>
           <w:rtl/>
         </w:rPr>
-        <w:t xml:space="preserve">، سید محمدعلی هاشمی‌پور</w:t>
-      </w:r>
-      <w:r>
-        <w:t xml:space="preserve">۳</w:t>
-      </w:r>
-    </w:p>
-    <w:p>
-      <w:pPr>
-        <w:pStyle w:val="Authors"/>
-      </w:pPr>
+        <w:t>، داریوش شکری</w:t>
+      </w:r>
+      <w:r>
+        <w:t>۲</w:t>
+      </w:r>
       <w:r>
         <w:rPr>
           <w:rFonts w:hint="cs"/>
           <w:rtl/>
         </w:rPr>
-        <w:t xml:space="preserve">(نویسنده‌ی مسئول با علامت * مشخص شده است)</w:t>
+        <w:t>، سید محمدعلی هاشمی‌پور</w:t>
+      </w:r>
+      <w:r>
+        <w:t>۳</w:t>
       </w:r>
     </w:p>
     <w:p>
       <w:pPr>
-        <w:pStyle w:val="Affiliations"/>
+        <w:pStyle w:val="Authors"/>
+        <w:framePr w:wrap="around"/>
       </w:pPr>
       <w:r>
         <w:rPr>
           <w:rFonts w:hint="cs"/>
           <w:rtl/>
         </w:rPr>
-        <w:t xml:space="preserve">۱ گروه مهندسی پزشکی، دانشکده‌ی مهندسی، دانشگاه اصفهان، اصفهان، ایران</w:t>
+        <w:t>(نویسنده‌ی مسئول با علامت * مشخص شده است)</w:t>
       </w:r>
     </w:p>
     <w:p>
       <w:pPr>
         <w:pStyle w:val="Affiliations"/>
+        <w:framePr w:wrap="around"/>
       </w:pPr>
       <w:r>
         <w:rPr>
           <w:rFonts w:hint="cs"/>
           <w:rtl/>
         </w:rPr>
-        <w:t xml:space="preserve">۲ شرکت دارا ویرا آزما، مرکز رشد و کارآفرینیِ دانشگاه اصفهان / آزمایشگاه خصوصی نوبل، اصفهان، ایران</w:t>
+        <w:t>۱ گروه مهندسی پزشکی، دانشکده‌ی مهندسی، دانشگاه اصفهان، اصفهان، ایران</w:t>
       </w:r>
     </w:p>
     <w:p>
       <w:pPr>
         <w:pStyle w:val="Affiliations"/>
+        <w:framePr w:wrap="around"/>
       </w:pPr>
       <w:r>
         <w:rPr>
           <w:rFonts w:hint="cs"/>
           <w:rtl/>
         </w:rPr>
-        <w:t xml:space="preserve">۳ شرکت نیلگون سپهر سلامت، واحد تحقیق و توسعه، اصفهان، ایران</w:t>
+        <w:t>۲ شرکت دارا ویرا آزما، مرکز رشد و کارآفرینیِ دانشگاه اصفهان / آزمایشگاه خصوصی نوبل، اصفهان، ایران</w:t>
       </w:r>
     </w:p>
     <w:p>
       <w:pPr>
         <w:pStyle w:val="Affiliations"/>
-      </w:pPr>
-      <w:r>
-        <w:t xml:space="preserve">mahyarhaddadha@gmail.com, gh.mogharehzadeh@eng.ui.ac.ir, yazdchi@eng.ui.ac.ir, dariush.shokri61@yahoo.com, M.alihashemip@gmail.com</w:t>
-      </w:r>
-    </w:p>
-    <w:p>
-      <w:pPr>
-        <w:pStyle w:val="Abstract"/>
-      </w:pPr>
-      <w:r>
-        <w:rPr>
-          <w:b/>
-          <w:bCs/>
-          <w:rFonts w:hint="cs"/>
-          <w:rtl/>
-        </w:rPr>
-        <w:t xml:space="preserve">چکیده - </w:t>
-      </w:r>
+        <w:framePr w:wrap="around"/>
+      </w:pPr>
       <w:r>
         <w:rPr>
           <w:rFonts w:hint="cs"/>
           <w:rtl/>
         </w:rPr>
-        <w:t xml:space="preserve">در آنتی‌بایوگرام دیسک-دیفیوژن (کربی-باوئر)، قطر هاله‌ی عدم‌رشد اطراف هر دیسک آنتی‌بیوتیکی معمولاً به‌صورت دستی و با کولیس اندازه‌گیری می‌شود؛ روشی کند، وابسته به مهارت اپراتور و مستعد خطا. در این مقاله یک پایپ‌لاین کاملاً کلاسیک بینایی ماشین (بدون یادگیری ماشین) ارائه می‌شود که از روی یک عکس ساده‌ی تلفن‌همراه از یک یا چند ظرف پتری، به‌ترتیب ظرف(ها)، دیسک‌های آنتی‌بیوتیک، مرز هاله‌ی بازدارندگی و رخدادهای غیرعادی داخل هاله را تشخیص می‌دهد. تشخیص ظرف با آستانه‌گذاری چندسطحیِ ناحیه‌ای پس از تصحیح نور انجام می‌شود؛ تشخیص دیسک از ادغام دو‌شاخه‌ای هاف و بلاب حاصل می‌شود؛ و مرز هاله با یک پروفایل شعاعیِ مبتنی بر «همگرایی دائمی به پس‌زمینه»، بسط نامتقارن جهت‌به‌جهت مبتنی بر گرادیان، و رفع رخدادهای زاویه‌ای موضعی به‌دست می‌آید. تمام پارامترهای هندسی نسبت به اندازه‌ی ظرف یا دیسک تعریف شده‌اند، نه پیکسل مطلق، تا پایپ‌لاین بدون آموزش مجدد روی دوربین، نور و مقیاس متفاوت کار کند. عملکرد به‌صورت کیفی روی هفتادوهشت عکس واقعی اعتبارسنجی شده و چند طراحی جایگزین—از جمله GrabCut، برازش سیگموئید و معماری پیشنهادی کاربر—به‌صورت تجربی آزموده و رد شده‌اند. ارزیابی کمّی روی یک دیتاستِ مرجعِ مستقل و کارشناسی‌شده (۱۱ عکس، ۹۳ دیسک) نشان می‌دهد: تشخیصِ دیسک F1=۰٫۹۸۴، خطای قطرِ هاله MAE=۵٫۵۰mm (بایاسِ −۰٫۵۳mm)، و خطای قطرِ دیسک MAE=۰٫۱۷mm؛ این نتایج روی سیستمی مستقل و مجزا نیز عیناً بازتولید شدند.</w:t>
+        <w:t>۳ شرکت نیلگون سپهر سلامت، واحد تحقیق و توسعه، اصفهان، ایران</w:t>
       </w:r>
     </w:p>
     <w:p>
       <w:pPr>
-        <w:pStyle w:val="Index"/>
+        <w:pStyle w:val="Affiliations"/>
+        <w:framePr w:wrap="around"/>
+      </w:pPr>
+      <w:r>
+        <w:t>mahyarhaddadha@gmail.com, gh.mogharehzadeh@eng.ui.ac.ir, yazdchi@eng.ui.ac.ir, dariush.shokri61@yahoo.com, M.alihashemip@gmail.com</w:t>
+      </w:r>
+    </w:p>
+    <w:p>
+      <w:pPr>
+        <w:pStyle w:val="Abstract"/>
       </w:pPr>
       <w:r>
         <w:rPr>
+          <w:rFonts w:hint="cs"/>
           <w:b/>
-          <w:bCs/>
-          <w:rFonts w:hint="cs"/>
           <w:rtl/>
         </w:rPr>
-        <w:t xml:space="preserve">واژه‌های کلیدی: </w:t>
+        <w:t xml:space="preserve">چکیده - </w:t>
       </w:r>
       <w:r>
         <w:rPr>
           <w:rFonts w:hint="cs"/>
           <w:rtl/>
         </w:rPr>
-        <w:t xml:space="preserve">آنتی‌بایوگرام، بینایی ماشین کلاسیک، پردازش تصویر پزشکی، تبدیل هاف، تست دیسک-دیفیوژن، تقسیم‌بندی تصویر، دیسک آنتی‌بیوتیک، هاله‌ی بازدارندگی</w:t>
+        <w:t>در آنتی‌بایوگرام دیسک-دیفیوژن (کربی-باوئر)، قطر هاله‌ی عدم‌رشد اطراف هر دیسک آنتی‌بیوتیکی معمولاً به‌صورت دستی و با کولیس اندازه‌گیری می‌شود؛ روشی کند، وابسته به مهارت اپراتور و مستعد خطا. در این مقاله یک پایپ‌لاین کاملاً کلاسیک بینایی ماشین (بدون یادگیری ماشین) ارائه می‌شود که از روی یک عکس ساده‌ی تلفن‌همراه از یک یا چند ظرف پتری، به‌ترتیب ظرف(ها)، دیسک‌های آنتی‌بیوتیک، مرز هاله‌ی بازدارندگی و رخدادهای غیرعادی داخل هاله را تشخیص می‌دهد. تشخیص ظرف با آستانه‌گذاری چندسطحیِ ناحیه‌ای پس از تصحیح نور انجام می‌شود؛ تشخیص دیسک از ادغام دو‌شاخه‌ای هاف و بلاب حاصل می‌شود؛ و مرز هاله با یک پروفایل شعاعیِ مبتنی بر «همگرایی دائمی به پس‌زمینه»، بسط نامتقارن جهت‌به‌جهت مبتنی بر گرادیان، و رفع رخدادهای زاویه‌ای موضعی به‌دست می‌آید. تمام پارامترهای هندسی نسبت به اندازه‌ی ظرف یا دیسک تعریف شده‌اند، نه پیکسل مطلق، تا پایپ‌لاین بدون آموزش مجدد روی دوربین، نور و مقیاس متفاوت کار کند. عملکرد به‌صورت کیفی روی هفتادوهشت عکس واقعی اعتبارسنجی شده و چند طراحی جایگزین—از جمله GrabCut، برازش سیگموئید و معماری پیشنهادی کاربر—به‌صورت تجربی آزموده و رد شده‌اند. ارزیابی کمّی روی یک دیتاستِ مرجعِ مستقل و کارشناسی‌شده (۱۱ عکس، ۹۳ دیسک) نشان می‌دهد: تشخیصِ دیسک F1=۰٫۹۸۴، خطای قطرِ هاله MAE=۵٫۵۰mm (بایاسِ −۰٫۵۳mm)، و خطای قطرِ دیسک MAE=۰٫۱۷mm؛ این نتایج روی سیستمی مستقل و مجزا نیز عیناً بازتولید شدند.</w:t>
       </w:r>
     </w:p>
     <w:p>
       <w:pPr>
-        <w:pStyle w:val="Heading1"/>
+        <w:pStyle w:val="Index"/>
       </w:pPr>
       <w:r>
         <w:rPr>
+          <w:rFonts w:hint="cs"/>
           <w:b/>
           <w:bCs/>
-          <w:rFonts w:hint="cs"/>
           <w:rtl/>
         </w:rPr>
-        <w:t xml:space="preserve">مقدمه</w:t>
-      </w:r>
-    </w:p>
-    <w:p>
-      <w:pPr>
-        <w:pStyle w:val="Paragraph"/>
-      </w:pPr>
+        <w:t xml:space="preserve">واژه‌های کلیدی: </w:t>
+      </w:r>
       <w:r>
         <w:rPr>
           <w:rFonts w:hint="cs"/>
           <w:rtl/>
         </w:rPr>
-        <w:t xml:space="preserve">تست آنتی‌بایوگرام دیسک-دیفیوژن (کربی-باوئر) یکی از رایج‌ترین روش‌های آزمایشگاهی برای سنجش حساسیت باکتری به آنتی‌بیوتیک است: دیسک‌های آغشته به آنتی‌بیوتیک روی محیط کشت آگار حاوی باکتری قرار می‌گیرند و پس از انکوباسیون، در صورت حساس‌بودن باکتری، حلقه‌ای بدون رشد (هاله‌ی بازدارندگی) دور دیسک شکل می‌گیرد که قطرش، طبق جدول‌های استاندارد نظیر EUCAST، به دسته‌های حساس، متوسط و مقاوم تبدیل می‌شود. در عمل این قطر معمولاً با کولیس و به‌صورت دستی اندازه‌گیری می‌شود؛ روشی کند، وابسته به مهارت اپراتور و مستعد خطای انسانی و تغییرپذیری بین‌آزمایشگاهی. از دهه‌ی ۱۹۹۰ سامانه‌های تحلیل تصویر رایانه‌ای برای خودکارسازی این اندازه‌گیری با توافق قابل‌قبول در برابر روش دستی گزارش شده‌اند </w:t>
-      </w:r>
-      <w:r>
-        <w:t xml:space="preserve">[1]</w:t>
+        <w:t>آنتی‌بایوگرام، بینایی ماشین کلاسیک، پردازش تصویر پزشکی، تبدیل هاف، تست دیسک-دیفیوژن، تقسیم‌بندی تصویر، دیسک آنتی‌بیوتیک، هاله‌ی بازدارندگی</w:t>
       </w:r>
       <w:r>
         <w:rPr>
           <w:rFonts w:hint="cs"/>
           <w:rtl/>
         </w:rPr>
-        <w:t xml:space="preserve">.</w:t>
+        <w:t xml:space="preserve">، </w:t>
+      </w:r>
+      <w:r>
+        <w:t>OpenCV</w:t>
+      </w:r>
+    </w:p>
+    <w:p>
+      <w:pPr>
+        <w:pStyle w:val="Heading1"/>
+      </w:pPr>
+      <w:r>
+        <w:rPr>
+          <w:rFonts w:hint="cs"/>
+          <w:rtl/>
+        </w:rPr>
+        <w:t>مقدمه</w:t>
+      </w:r>
+    </w:p>
+    <w:p>
+      <w:pPr>
+        <w:pStyle w:val="Paragraph"/>
+      </w:pPr>
+      <w:r>
+        <w:rPr>
+          <w:rFonts w:hint="cs"/>
+          <w:rtl/>
+        </w:rPr>
+        <w:t xml:space="preserve">تست آنتی‌بایوگرام دیسک-دیفیوژن (کربی-باوئر) یکی از رایج‌ترین روش‌های آزمایشگاهی برای سنجش حساسیت باکتری به آنتی‌بیوتیک است: دیسک‌های آغشته به آنتی‌بیوتیک روی محیط کشت آگار حاوی باکتری قرار می‌گیرند و پس از انکوباسیون، در صورت حساس‌بودن باکتری، حلقه‌ای بدون رشد (هاله‌ی بازدارندگی) دور دیسک شکل می‌گیرد که قطرش، طبق جدول‌های استاندارد نظیر EUCAST، به دسته‌های حساس، متوسط و مقاوم تبدیل می‌شود. در عمل این قطر معمولاً با کولیس و به‌صورت دستی اندازه‌گیری می‌شود؛ روشی کند، وابسته به مهارت اپراتور و مستعد خطای انسانی و تغییرپذیری بین‌آزمایشگاهی. از دهه‌ی ۱۹۹۰ سامانه‌های تحلیل تصویر </w:t>
+      </w:r>
+      <w:r>
+        <w:rPr>
+          <w:rFonts w:hint="cs"/>
+          <w:rtl/>
+        </w:rPr>
+        <w:t xml:space="preserve">رایانه‌ای برای خودکارسازی این اندازه‌گیری با توافق قابل‌قبول در برابر روش دستی گزارش شده‌اند </w:t>
+      </w:r>
+      <w:r>
+        <w:t>[1]</w:t>
+      </w:r>
+      <w:r>
+        <w:rPr>
+          <w:rFonts w:hint="cs"/>
+          <w:rtl/>
+        </w:rPr>
+        <w:t>.</w:t>
       </w:r>
     </w:p>
     <w:p>
@@ -217,7 +235,7 @@
         <w:t xml:space="preserve">رویکردهای بعدی عمدتاً حول تبدیل دایره‌ایِ هاف </w:t>
       </w:r>
       <w:r>
-        <w:t xml:space="preserve">[2]</w:t>
+        <w:t>[2]</w:t>
       </w:r>
       <w:r>
         <w:rPr>
@@ -227,7 +245,7 @@
         <w:t xml:space="preserve">، ابزارهای مبتنی بر آستانه‌گذاریِ کلاسیک به‌همراه بازشناسی نوریِ کدِ چاپ‌شده‌ی روی دیسک مانند AntibiogramJ </w:t>
       </w:r>
       <w:r>
-        <w:t xml:space="preserve">[3]</w:t>
+        <w:t>[3]</w:t>
       </w:r>
       <w:r>
         <w:rPr>
@@ -237,7 +255,7 @@
         <w:t xml:space="preserve">، و مقایسه‌ی چند روشِ تقسیم‌بندی روی مجموعه‌داده‌ای با ۱۷۰ عکس و ۵۱۳ هاله </w:t>
       </w:r>
       <w:r>
-        <w:t xml:space="preserve">[4]</w:t>
+        <w:t>[4]</w:t>
       </w:r>
       <w:r>
         <w:rPr>
@@ -247,7 +265,7 @@
         <w:t xml:space="preserve"> متمرکز بوده‌اند. اخیراً رویکردهای مبتنی بر یادگیریِ عمیق نیز مطرح شده‌اند: یک اپلیکیشنِ موبایل با توافقِ ۹۰ تا ۹۸ درصد در برابرِ اندازه‌گیریِ دستی </w:t>
       </w:r>
       <w:r>
-        <w:t xml:space="preserve">[5]</w:t>
+        <w:t>[5]</w:t>
       </w:r>
       <w:r>
         <w:rPr>
@@ -257,14 +275,14 @@
         <w:t xml:space="preserve">، و ترکیبِ تحلیلِ رنگ با طبقه‌بندیِ یادگیری‌محور </w:t>
       </w:r>
       <w:r>
-        <w:t xml:space="preserve">[6]</w:t>
+        <w:t>[6]</w:t>
       </w:r>
       <w:r>
         <w:rPr>
           <w:rFonts w:hint="cs"/>
           <w:rtl/>
         </w:rPr>
-        <w:t xml:space="preserve">. این کارها نشان می‌دهند خودکارسازی مفید است، اما معمولاً به مجموعه‌داده‌ی برچسب‌خورده‌ی حجیم نیاز دارند یا برای شرایطِ تصویربرداریِ محدودی طراحی شده‌اند.</w:t>
+        <w:t>. این کارها نشان می‌دهند خودکارسازی مفید است، اما معمولاً به مجموعه‌داده‌ی برچسب‌خورده‌ی حجیم نیاز دارند یا برای شرایطِ تصویربرداریِ محدودی طراحی شده‌اند.</w:t>
       </w:r>
     </w:p>
     <w:p>
@@ -276,7 +294,7 @@
           <w:rFonts w:hint="cs"/>
           <w:rtl/>
         </w:rPr>
-        <w:t xml:space="preserve">در این مقاله یک پایپ‌لاین کاملاً کلاسیک بینایی ماشین ارائه می‌شود که از یک عکس ساده‌ی تلفن‌همراه، حتی با چند ظرف پتری هم‌زمان، ظرف(ها)، دیسک‌های آنتی‌بیوتیک، مرز هاله و رخدادهای غیرعادیِ داخل هاله (کارِ در حالِ انجام) را تشخیص می‌دهد. انتخاب رویکرد کلاسیک یک تصمیم طراحیِ آگاهانه است: (۱) به مجموعه‌داده‌ی برچسب‌خورده‌ی حجیم نیاز ندارد؛ (۲) تفسیرپذیر است—مهم برای کاربردِ آزمایشگاهیِ نیازمندِ قابلیتِ ممیزی؛ (۳) برای پیاده‌سازی روی سخت‌افزار سبک به ++C قابل‌ترجمه است؛ و (۴) پارامترها نسبی‌اند، پس بدون آموزشِ مجدد روی دوربین، نور و مقیاسِ متفاوت کار می‌کند.</w:t>
+        <w:t>در این مقاله یک پایپ‌لاین کاملاً کلاسیک بینایی ماشین ارائه می‌شود که از یک عکس ساده‌ی تلفن‌همراه، حتی با چند ظرف پتری هم‌زمان، ظرف(ها)، دیسک‌های آنتی‌بیوتیک، مرز هاله و رخدادهای غیرعادیِ داخل هاله (کارِ در حالِ انجام) را تشخیص می‌دهد. انتخاب رویکرد کلاسیک یک تصمیم طراحیِ آگاهانه است: (۱) به مجموعه‌داده‌ی برچسب‌خورده‌ی حجیم نیاز ندارد؛ (۲) تفسیرپذیر است—مهم برای کاربردِ آزمایشگاهیِ نیازمندِ قابلیتِ ممیزی؛ (۳) برای پیاده‌سازی روی سخت‌افزار سبک به ++C قابل‌ترجمه است؛ و (۴) پارامترها نسبی‌اند، پس بدون آموزشِ مجدد روی دوربین، نور و مقیاسِ متفاوت کار می‌کند.</w:t>
       </w:r>
     </w:p>
     <w:p>
@@ -285,12 +303,10 @@
       </w:pPr>
       <w:r>
         <w:rPr>
-          <w:b/>
-          <w:bCs/>
           <w:rFonts w:hint="cs"/>
           <w:rtl/>
         </w:rPr>
-        <w:t xml:space="preserve">مواد و روش‌ها</w:t>
+        <w:t>مواد و روش‌ها</w:t>
       </w:r>
     </w:p>
     <w:p>
@@ -299,12 +315,10 @@
       </w:pPr>
       <w:r>
         <w:rPr>
-          <w:b/>
-          <w:bCs/>
           <w:rFonts w:hint="cs"/>
           <w:rtl/>
         </w:rPr>
-        <w:t xml:space="preserve">داده‌ها</w:t>
+        <w:t>داده‌ها</w:t>
       </w:r>
     </w:p>
     <w:p>
@@ -319,40 +333,46 @@
         <w:t xml:space="preserve">مجموعه‌داده‌ی اصلی شامل هفتادوهشت عکس واقعی است که با دوربین تلفن‌همراه گرفته شده‌اند؛ هر عکس حاوی یک یا چند ظرف پتری است (اکثراً یک ظرف، بعضاً دو پتری). سند مرجع EUCAST (جدول‌های نقطه‌قطع نسخه‌ی ۱۶.۰ </w:t>
       </w:r>
       <w:r>
-        <w:t xml:space="preserve">[7]</w:t>
+        <w:t>[7]</w:t>
       </w:r>
       <w:r>
         <w:rPr>
           <w:rFonts w:hint="cs"/>
           <w:rtl/>
         </w:rPr>
-        <w:t xml:space="preserve">) برای بررسیِ روش استانداردِ خواندنِ مرز هاله استفاده شده (بخش ۴-۲)؛ پایپ‌لاین فقط قطر را گزارش می‌کند. برای ارزیابیِ کمّی (بخش ۳-۱)، یک زیرمجموعه‌ی مستقلِ ۱۱ عکس با حقیقتِ زمینیِ کارشناسی ساخته شد. جزئیاتِ ساختاریافته‌ی باقیِ نمونه‌ها [PLACEHOLDER: نوع باکتری، آنتی‌بیوتیک‌ها، شرایط انکوباسیون و محیط کشت] هنوز تکمیل نشده‌اند؛ هیچ داده یا تصویرِ بیمار در این مجموعه وجود ندارد.</w:t>
+        <w:t>) برای بررسیِ روش استانداردِ خواندنِ مرز هاله استفاده شده (بخش ۴-۲)؛ پایپ‌لاین فقط قطر را گزارش می‌کند. برای ارزیابیِ کمّی (بخش ۳-۱)، یک زیرمجموعه‌ی مستقلِ ۱۱ عکس با حقیقتِ زمینیِ کارشناسی ساخته شد. هیچ داده یا تصویرِ بیمار در این مجموعه وجود ندارد.</w:t>
       </w:r>
     </w:p>
     <w:p>
       <w:pPr>
         <w:pStyle w:val="Heading2"/>
-      </w:pPr>
-      <w:r>
-        <w:rPr>
-          <w:b/>
-          <w:bCs/>
-          <w:rFonts w:hint="cs"/>
-          <w:rtl/>
-        </w:rPr>
-        <w:t xml:space="preserve">معماری کلی پایپ‌لاین</w:t>
-      </w:r>
-    </w:p>
-    <w:p>
-      <w:pPr>
-        <w:pStyle w:val="Paragraph"/>
       </w:pPr>
       <w:r>
         <w:rPr>
           <w:rFonts w:hint="cs"/>
           <w:rtl/>
         </w:rPr>
-        <w:t xml:space="preserve">جریان پردازش برای هر عکس این چهار مرحله را به‌ترتیب طی می‌کند: تشخیص ظرف(های) پتری (بخش ۲-۳)، تشخیص دیسک‌های آنتی‌بیوتیک با ادغام دو‌شاخه‌ای (بخش ۲-۴)، برازش و اصلاح مرز هاله‌ی بازدارندگی (بخش ۲-۵)، و تشخیص رخدادهای غیرعادی داخل هاله (بخش ۲-۶)؛ در پایان یک گزارش عددی برای هر دیسک تولید می‌شود. سه اصل طراحی در طول کل پایپ‌لاین رعایت شده: عدم استفاده از مقدار پیکسلی مطلق (هر پارامتر نسبت به قطر ظرف یا دیسک تعریف می‌شود)، قطعیت کامل (پیش‌نیاز ترجمه‌ی آینده به ++C)، و اعتبارسنجیِ هر تغییر روی چند عکسِ متنوع پیش از قطعی‌شدن، برای پرهیز از بیش‌برازش به یک نمونه. شکل ۲ این جریان را خلاصه می‌کند.</w:t>
+        <w:t>معماری کلی پایپ‌لاین</w:t>
+      </w:r>
+    </w:p>
+    <w:p>
+      <w:pPr>
+        <w:pStyle w:val="Paragraph"/>
+      </w:pPr>
+      <w:r>
+        <w:rPr>
+          <w:rFonts w:hint="cs"/>
+          <w:rtl/>
+        </w:rPr>
+        <w:t xml:space="preserve">جریان پردازش برای هر عکس این چهار مرحله را به‌ترتیب طی می‌کند: تشخیص ظرف(های) پتری (بخش ۲-۳)، تشخیص دیسک‌های آنتی‌بیوتیک با ادغام دو‌شاخه‌ای (بخش ۲-۴)، برازش و اصلاح مرز هاله‌ی بازدارندگی (بخش ۲-۵)، و تشخیص رخدادهای غیرعادی داخل هاله (بخش ۲-۶)؛ در پایان یک گزارش عددی برای هر دیسک تولید می‌شود. سه اصل طراحی در طول کل پایپ‌لاین رعایت شده: عدم استفاده از مقدار پیکسلی مطلق (هر پارامتر نسبت به قطر ظرف یا دیسک تعریف می‌شود)، قطعیت کامل (پیش‌نیاز ترجمه‌ی آینده به ++C)، و اعتبارسنجیِ هر تغییر </w:t>
+      </w:r>
+      <w:r>
+        <w:rPr>
+          <w:rFonts w:hint="cs"/>
+          <w:rtl/>
+        </w:rPr>
+        <w:lastRenderedPageBreak/>
+        <w:t>روی چند عکسِ متنوع پیش از قطعی‌شدن، برای پرهیز از بیش‌برازش به یک نمونه. شکل ۲ این جریان را خلاصه می‌کند.</w:t>
       </w:r>
     </w:p>
     <w:p>
@@ -364,7 +384,7 @@
           <w:noProof/>
         </w:rPr>
         <w:drawing>
-          <wp:inline distT="0" distB="0" distL="0" distR="0">
+          <wp:inline distT="0" distB="0" distL="0" distR="0" wp14:anchorId="23AC4372" wp14:editId="22A42BA8">
             <wp:extent cx="2952750" cy="3927581"/>
             <wp:effectExtent l="0" t="0" r="0" b="0"/>
             <wp:docPr id="101" name="Picture 101"/>
@@ -379,7 +399,7 @@
                     <pic:cNvPicPr/>
                   </pic:nvPicPr>
                   <pic:blipFill>
-                    <a:blip r:embed="rId20"/>
+                    <a:blip r:embed="rId7"/>
                     <a:stretch>
                       <a:fillRect/>
                     </a:stretch>
@@ -409,7 +429,7 @@
           <w:rFonts w:hint="cs"/>
           <w:rtl/>
         </w:rPr>
-        <w:t xml:space="preserve">شکل ۲: نمودار کلی معماری پایپ‌لاین. ماژول‌های ۵ تا ۱۷ برای هر ظرف پتری به‌طور مستقل اجرا می‌شوند.</w:t>
+        <w:t>شکل ۲: نمودار کلی معماری پایپ‌لاین. ماژول‌های ۵ تا ۱۷ برای هر ظرف پتری به‌طور مستقل اجرا می‌شوند.</w:t>
       </w:r>
     </w:p>
     <w:p>
@@ -418,12 +438,10 @@
       </w:pPr>
       <w:r>
         <w:rPr>
-          <w:b/>
-          <w:bCs/>
           <w:rFonts w:hint="cs"/>
           <w:rtl/>
         </w:rPr>
-        <w:t xml:space="preserve">تشخیص ظرف پتری</w:t>
+        <w:t>تشخیص ظرف پتری</w:t>
       </w:r>
     </w:p>
     <w:p>
@@ -438,7 +456,7 @@
         <w:t xml:space="preserve">چالش اصلیِ این مرحله، آستانه‌گذاری در حضور نور ناهموار است </w:t>
       </w:r>
       <w:r>
-        <w:t xml:space="preserve">[8]</w:t>
+        <w:t>[8]</w:t>
       </w:r>
       <w:r>
         <w:rPr>
@@ -448,14 +466,14 @@
         <w:t xml:space="preserve">. راه‌حل، تصحیحِ میدانِ روشنایی پیش از سگمنتیشنِ ناحیه‌ای با آستانه‌گذاریِ چندسطحیِ Otsu </w:t>
       </w:r>
       <w:r>
-        <w:t xml:space="preserve">[9]</w:t>
+        <w:t>[9]</w:t>
       </w:r>
       <w:r>
         <w:rPr>
           <w:rFonts w:hint="cs"/>
           <w:rtl/>
         </w:rPr>
-        <w:t xml:space="preserve"> است؛ هاف و کانتور تنها مسیرِ مکمل/تاییدکننده‌اند. تشخیصِ چندگانه (شکل ۱) با نگه‌داشتنِ کانتورهای معتبر و دو خودآزماییِ hypothesize-and-verify انجام می‌شود.</w:t>
+        <w:t xml:space="preserve"> است. تشخیصِ چندگانه (شکل ۱) با نگه‌داشتنِ کانتورهای معتبر و دو خودآزماییِ hypothesize-and-verify انجام می‌شود.</w:t>
       </w:r>
     </w:p>
     <w:p>
@@ -467,7 +485,7 @@
           <w:noProof/>
         </w:rPr>
         <w:drawing>
-          <wp:inline distT="0" distB="0" distL="0" distR="0">
+          <wp:inline distT="0" distB="0" distL="0" distR="0" wp14:anchorId="0F2B8B33" wp14:editId="1487DBBA">
             <wp:extent cx="2952750" cy="3937000"/>
             <wp:effectExtent l="0" t="0" r="0" b="0"/>
             <wp:docPr id="102" name="Picture 102"/>
@@ -482,7 +500,7 @@
                     <pic:cNvPicPr/>
                   </pic:nvPicPr>
                   <pic:blipFill>
-                    <a:blip r:embed="rId21"/>
+                    <a:blip r:embed="rId8"/>
                     <a:stretch>
                       <a:fillRect/>
                     </a:stretch>
@@ -512,43 +530,41 @@
           <w:rFonts w:hint="cs"/>
           <w:rtl/>
         </w:rPr>
-        <w:t xml:space="preserve">شکل ۱: تشخیص هم‌زمان دو ظرف پتری واقعی و مجاور در یک قاب؛ هر ظرف با کانتور و برچسب مستقل خودش (</w:t>
-      </w:r>
-      <w:r>
-        <w:t xml:space="preserve">Petri #1 / Petri #2</w:t>
+        <w:t>شکل ۱: تشخیص هم‌زمان دو ظرف پتری واقعی و مجاور در یک قاب؛ هر ظرف با کانتور و برچسب مستقل خودش (</w:t>
+      </w:r>
+      <w:r>
+        <w:t>Petri #1 / Petri #2</w:t>
       </w:r>
       <w:r>
         <w:rPr>
           <w:rFonts w:hint="cs"/>
           <w:rtl/>
         </w:rPr>
-        <w:t xml:space="preserve">) مشخص شده است.</w:t>
+        <w:t>) مشخص شده است.</w:t>
       </w:r>
     </w:p>
     <w:p>
       <w:pPr>
         <w:pStyle w:val="Heading2"/>
-      </w:pPr>
-      <w:r>
-        <w:rPr>
-          <w:b/>
-          <w:bCs/>
-          <w:rFonts w:hint="cs"/>
-          <w:rtl/>
-        </w:rPr>
-        <w:t xml:space="preserve">تشخیص دیسک‌های آنتی‌بیوتیک</w:t>
-      </w:r>
-    </w:p>
-    <w:p>
-      <w:pPr>
-        <w:pStyle w:val="Paragraph"/>
       </w:pPr>
       <w:r>
         <w:rPr>
           <w:rFonts w:hint="cs"/>
           <w:rtl/>
         </w:rPr>
-        <w:t xml:space="preserve">تشخیص دیسک از ادغامِ دو شاخه‌ی مکمل به‌دست می‌آید: شاخه‌ی هاف به‌عنوانِ مسیرِ اصلی، و شاخه‌ی تحلیلِ بلاب/واترشد به‌عنوانِ مسیرِ پوششی برای دیسک‌های چسبیده. اعتبارسنجیِ هندسی روی اجتماعِ دو ماسک اجرا می‌شود تا شکستِ موضعیِ یک شاخه کل کاندید را نکِشد. پیش‌تر یک گیتِ دودوییِ سخت کاندیدهای معتبرِ نزدیکِ آستانه را حذف می‌کرد؛ این گیت با یک آستانه‌ی امتیازِ پیوسته جایگزین شد (جدول ۳). شکل ۳ تصویرِ ویژگیِ ورودی و نتیجه‌ی ادغام را نشان می‌دهد.</w:t>
+        <w:t>تشخیص دیسک‌های آنتی‌بیوتیک</w:t>
+      </w:r>
+    </w:p>
+    <w:p>
+      <w:pPr>
+        <w:pStyle w:val="Paragraph"/>
+      </w:pPr>
+      <w:r>
+        <w:rPr>
+          <w:rFonts w:hint="cs"/>
+          <w:rtl/>
+        </w:rPr>
+        <w:t>تشخیص دیسک از ادغامِ دو شاخه‌ی مکمل به‌دست می‌آید: شاخه‌ی هاف به‌عنوانِ مسیرِ اصلی، و شاخه‌ی تحلیلِ بلاب/واترشد به‌عنوانِ مسیرِ پوششی برای دیسک‌های چسبیده. اعتبارسنجیِ هندسی روی اجتماعِ دو ماسک اجرا می‌شود تا شکستِ موضعیِ یک شاخه کل کاندید را نکِشد. پیش‌تر یک گیتِ دودوییِ سخت کاندیدهای معتبرِ نزدیکِ آستانه را حذف می‌کرد؛ این گیت با یک آستانه‌ی امتیازِ پیوسته جایگزین شد (جدول ۳). شکل ۳ تصویرِ ویژگیِ ورودی و نتیجه‌ی ادغام را نشان می‌دهد.</w:t>
       </w:r>
     </w:p>
     <w:p>
@@ -560,7 +576,7 @@
           <w:noProof/>
         </w:rPr>
         <w:drawing>
-          <wp:inline distT="0" distB="0" distL="0" distR="0">
+          <wp:inline distT="0" distB="0" distL="0" distR="0" wp14:anchorId="3B052AE3" wp14:editId="504B28C5">
             <wp:extent cx="1605077" cy="1726604"/>
             <wp:effectExtent l="0" t="0" r="0" b="0"/>
             <wp:docPr id="103" name="Picture 103"/>
@@ -575,7 +591,7 @@
                     <pic:cNvPicPr/>
                   </pic:nvPicPr>
                   <pic:blipFill>
-                    <a:blip r:embed="rId22"/>
+                    <a:blip r:embed="rId9"/>
                     <a:stretch>
                       <a:fillRect/>
                     </a:stretch>
@@ -603,7 +619,7 @@
           <w:noProof/>
         </w:rPr>
         <w:drawing>
-          <wp:inline distT="0" distB="0" distL="0" distR="0">
+          <wp:inline distT="0" distB="0" distL="0" distR="0" wp14:anchorId="6E67F364" wp14:editId="24F13DC3">
             <wp:extent cx="1257672" cy="1726604"/>
             <wp:effectExtent l="0" t="0" r="0" b="0"/>
             <wp:docPr id="104" name="Picture 104"/>
@@ -618,7 +634,7 @@
                     <pic:cNvPicPr/>
                   </pic:nvPicPr>
                   <pic:blipFill>
-                    <a:blip r:embed="rId23"/>
+                    <a:blip r:embed="rId10"/>
                     <a:stretch>
                       <a:fillRect/>
                     </a:stretch>
@@ -648,33 +664,20 @@
           <w:rFonts w:hint="cs"/>
           <w:rtl/>
         </w:rPr>
-        <w:t xml:space="preserve">شکل ۳: تشخیص دیسک بر پایه‌ی ادغام دو‌شاخه‌ای. راست: تصویرِ ویژگیِ نورمال‌شده (ماژول ۵)، ورودیِ هر دو شاخه‌ی هاف/بلاب. چپ: نتیجه‌ی نهاییِ ادغام (ماژول ۱۴).</w:t>
+        <w:t>شکل ۳: تشخیص دیسک بر پایه‌ی ادغام دو‌شاخه‌ای. راست: تصویرِ ویژگیِ نورمال‌شده (ماژول ۵)، ورودیِ هر دو شاخه‌ی هاف/بلاب. چپ: نتیجه‌ی نهاییِ ادغام (ماژول ۱۴).</w:t>
       </w:r>
     </w:p>
     <w:p>
       <w:pPr>
         <w:pStyle w:val="Heading2"/>
-      </w:pPr>
-      <w:r>
-        <w:rPr>
-          <w:b/>
-          <w:bCs/>
-          <w:rFonts w:hint="cs"/>
-          <w:rtl/>
-        </w:rPr>
-        <w:t xml:space="preserve">تشخیص مرز هاله‌ی بازدارندگی</w:t>
-      </w:r>
-    </w:p>
-    <w:p>
-      <w:pPr>
-        <w:pStyle w:val="Paragraph"/>
       </w:pPr>
       <w:r>
         <w:rPr>
           <w:rFonts w:hint="cs"/>
           <w:rtl/>
         </w:rPr>
-        <w:t xml:space="preserve">این بخش پرچالش‌ترین مرحله‌ی پروژه بوده است. رویکردهای اولیه‌ای که با یک گیتِ وجود/عدم‌وجود تصمیم می‌گرفتند «آیا اصلاً هاله‌ای هست؟» رد شدند (جدول ۳)؛ معماریِ نهایی همیشه یک دایره‌ی هندسی برازش و اصلاح می‌کند، و جداگانه یک معیارِ آماری تعیین می‌کند که آیا برازش یک هاله‌ی واقعی نشان می‌دهد یا نویز (گزارش‌شده به‌صورتِ «تشکیل‌نشده»؛ بخش ۳-۱). شعاعِ پایه از یک پروفایلِ شعاعیِ تجمیعی و همه‌جهته به‌دست می‌آید؛ مرز، اولین شعاعی است که پس از آن مقادیر در یک باندِ نویز-محور حولِ پس‌زمینه باقی می‌مانند («همگراییِ دائمی به پس‌زمینه»)—هم‌راستا با تعریفِ رسمیِ EUCAST (بخش ۴-۲). سپس مرز جهت‌به‌جهت با یافتنِ قله‌ی گرادیانِ محلی بسط می‌یابد، محدود به دو سقفِ هندسیِ همیشه‌فعال (نیمسازِ عمود تا دیسکِ همسایه، و لبه‌ی پتری).</w:t>
+        <w:lastRenderedPageBreak/>
+        <w:t>تشخیص مرز هاله‌ی بازدارندگی</w:t>
       </w:r>
     </w:p>
     <w:p>
@@ -686,7 +689,19 @@
           <w:rFonts w:hint="cs"/>
           <w:rtl/>
         </w:rPr>
-        <w:t xml:space="preserve">در نهایت یک لایه‌ی اصلاحِ رخدادهای زاویه‌ایِ ایزوله—جایگزینیِ هر جهتی با شعاعِ بیش از ۱٫۲ برابرِ میانه‌ی همسایگیِ محلی—رخدادهایی نظیر «لنگرشدن به لبه‌ی پتری» را رفع می‌کند؛ این آستانه پس از بررسیِ خروجی روی چند عکسِ متنوع از ۱٫۴ به ۱٫۲ بازکالیبره شد (جدول ۳). شکل ۴ مرزِ پایه و مرزِ نهایی را مقایسه می‌کند.</w:t>
+        <w:t>این بخش پرچالش‌ترین مرحله‌ی پروژه بوده است. رویکردهای اولیه‌ای که با یک گیتِ وجود/عدم‌وجود تصمیم می‌گرفتند «آیا اصلاً هاله‌ای هست؟» رد شدند (جدول ۳)؛ معماریِ نهایی همیشه یک دایره‌ی هندسی برازش و اصلاح می‌کند، و جداگانه یک معیارِ آماری تعیین می‌کند که آیا برازش یک هاله‌ی واقعی نشان می‌دهد یا نویز (گزارش‌شده به‌صورتِ «تشکیل‌نشده»؛ بخش ۳-۱). شعاعِ پایه از یک پروفایلِ شعاعیِ تجمیعی و همه‌جهته به‌دست می‌آید؛ مرز، اولین شعاعی است که پس از آن مقادیر در یک باندِ نویز-محور حولِ پس‌زمینه باقی می‌مانند («همگراییِ دائمی به پس‌زمینه»)—هم‌راستا با تعریفِ رسمیِ EUCAST (بخش ۴-۲). سپس مرز جهت‌به‌جهت با یافتنِ قله‌ی گرادیانِ محلی بسط می‌یابد، محدود به دو سقفِ هندسیِ همیشه‌فعال (نیمسازِ عمود تا دیسکِ همسایه، و لبه‌ی پتری).</w:t>
+      </w:r>
+    </w:p>
+    <w:p>
+      <w:pPr>
+        <w:pStyle w:val="Paragraph"/>
+      </w:pPr>
+      <w:r>
+        <w:rPr>
+          <w:rFonts w:hint="cs"/>
+          <w:rtl/>
+        </w:rPr>
+        <w:t>در نهایت یک لایه‌ی اصلاحِ رخدادهای زاویه‌ایِ ایزوله—جایگزینیِ هر جهتی با شعاعِ بیش از ۱٫۲ برابرِ میانه‌ی همسایگیِ محلی—رخدادهایی نظیر «لنگرشدن به لبه‌ی پتری» را رفع می‌کند؛ این آستانه پس از بررسیِ خروجی روی چند عکسِ متنوع بازکالیبره شد (جدول ۳). شکل ۴ مرزِ پایه و مرزِ نهایی را مقایسه می‌کند.</w:t>
       </w:r>
     </w:p>
     <w:p>
@@ -698,7 +713,7 @@
           <w:noProof/>
         </w:rPr>
         <w:drawing>
-          <wp:inline distT="0" distB="0" distL="0" distR="0">
+          <wp:inline distT="0" distB="0" distL="0" distR="0" wp14:anchorId="55DB342F" wp14:editId="556DE0D0">
             <wp:extent cx="1399609" cy="1519575"/>
             <wp:effectExtent l="0" t="0" r="0" b="0"/>
             <wp:docPr id="105" name="Picture 105"/>
@@ -713,7 +728,7 @@
                     <pic:cNvPicPr/>
                   </pic:nvPicPr>
                   <pic:blipFill>
-                    <a:blip r:embed="rId24"/>
+                    <a:blip r:embed="rId11"/>
                     <a:stretch>
                       <a:fillRect/>
                     </a:stretch>
@@ -741,7 +756,7 @@
           <w:noProof/>
         </w:rPr>
         <w:drawing>
-          <wp:inline distT="0" distB="0" distL="0" distR="0">
+          <wp:inline distT="0" distB="0" distL="0" distR="0" wp14:anchorId="7356816C" wp14:editId="58B001B9">
             <wp:extent cx="1463140" cy="1519575"/>
             <wp:effectExtent l="0" t="0" r="0" b="0"/>
             <wp:docPr id="106" name="Picture 106"/>
@@ -756,7 +771,7 @@
                     <pic:cNvPicPr/>
                   </pic:nvPicPr>
                   <pic:blipFill>
-                    <a:blip r:embed="rId25"/>
+                    <a:blip r:embed="rId12"/>
                     <a:stretch>
                       <a:fillRect/>
                     </a:stretch>
@@ -786,47 +801,19 @@
           <w:rFonts w:hint="cs"/>
           <w:rtl/>
         </w:rPr>
-        <w:t xml:space="preserve">شکل ۴: مرزِ هاله روی یک عکسِ واقعی. راست: دایره‌ی پایه با سقفِ هندسی (ماژول ۱۶). چپ: مرزِ نهایی پس از بسطِ per-angle و رفعِ رخدادهای زاویه‌ای (ماژول ۱۶.۶).</w:t>
+        <w:t>شکل ۴: مرزِ هاله روی یک عکسِ واقعی. راست: دایره‌ی پایه با سقفِ هندسی (ماژول ۱۶). چپ: مرزِ نهایی پس از بسطِ per-angle و رفعِ رخدادهای زاویه‌ای (ماژول ۱۶.۶).</w:t>
       </w:r>
     </w:p>
     <w:p>
       <w:pPr>
         <w:pStyle w:val="Heading2"/>
-      </w:pPr>
-      <w:r>
-        <w:rPr>
-          <w:b/>
-          <w:bCs/>
-          <w:rFonts w:hint="cs"/>
-          <w:rtl/>
-        </w:rPr>
-        <w:t xml:space="preserve">تشخیص رخداد و حباب داخل هاله</w:t>
-      </w:r>
-    </w:p>
-    <w:p>
-      <w:pPr>
-        <w:pStyle w:val="Paragraph"/>
       </w:pPr>
       <w:r>
         <w:rPr>
           <w:rFonts w:hint="cs"/>
           <w:rtl/>
         </w:rPr>
-        <w:t xml:space="preserve">برای علامت‌گذاریِ رخدادهای موضعیِ غیرعادی—مانند کلونیِ مقاومِ نقطه‌ای یا حبابِ هوا—ناحیه‌ی جست‌وجو از شکلِ واقعیِ نامتقارنِ مرزِ هاله گرفته می‌شود؛ سیگنالِ باقیمانده با آستانه‌ی robust مبتنی بر MAD دوتایی می‌شود. این ماژول یک کارِ در حالِ انجام است، تاکنون روی نمونه‌ی واقعیِ دارای حباب اعتبارسنجی نشده. خروجیِ نهاییِ گزارش برای هر دیسک شامل مختصاتِ مرکز، قطرِ دیسک و قطرِ هاله (یا «تشکیل‌نشده»)، بر حسبِ میلی‌متر، است.</w:t>
-      </w:r>
-    </w:p>
-    <w:p>
-      <w:pPr>
-        <w:pStyle w:val="Heading1"/>
-      </w:pPr>
-      <w:r>
-        <w:rPr>
-          <w:b/>
-          <w:bCs/>
-          <w:rFonts w:hint="cs"/>
-          <w:rtl/>
-        </w:rPr>
-        <w:t xml:space="preserve">نتایج</w:t>
+        <w:t>تشخیص رخداد و حباب داخل هاله</w:t>
       </w:r>
     </w:p>
     <w:p>
@@ -838,7 +825,38 @@
           <w:rFonts w:hint="cs"/>
           <w:rtl/>
         </w:rPr>
-        <w:t xml:space="preserve">شکل ۵ خروجیِ کاملِ پایپ‌لاین—تشخیص دیسک، مرز هاله، و رخداد حباب—را روی یک عکسِ واقعی (۹ دیسک روی یک ظرف) نشان می‌دهد. جدول ۱ گزارشِ عددیِ متناظر را فهرست می‌کند: قطرِ دیسک‌ها از ۴٫۹ تا ۷٫۷mm و قطرِ هاله‌ها از ۵٫۶ تا ۱۷٫۷mm متغیر است، شاملِ چند دیسکِ عملاً بدونِ هاله (مقاوم)؛ ماژول ۱۷ نیز یک رخدادِ حباب گزارش کرد.</w:t>
+        <w:t>برای علامت‌گذاریِ رخدادهای موضعیِ غیرعادی—مانند کلونیِ مقاومِ نقطه‌ای یا حبابِ هوا—ناحیه‌ی جست‌وجو از شکلِ واقعیِ نامتقارنِ مرزِ هاله گرفته می‌شود؛ سیگنالِ باقیمانده با آستانه‌ی robust مبتنی بر MAD دوتایی می‌شود. این ماژول یک کارِ در حالِ انجام است، تاکنون روی نمونه‌ی واقعیِ دارای حباب اعتبارسنجی نشده. خروجیِ نهاییِ گزارش برای هر دیسک شامل مختصاتِ مرکز، قطرِ دیسک و قطرِ هاله (یا «تشکیل‌نشده»)، بر حسبِ میلی‌متر، است.</w:t>
+      </w:r>
+    </w:p>
+    <w:p>
+      <w:pPr>
+        <w:pStyle w:val="Heading1"/>
+      </w:pPr>
+      <w:r>
+        <w:rPr>
+          <w:rFonts w:hint="cs"/>
+          <w:rtl/>
+        </w:rPr>
+        <w:t>نتایج</w:t>
+      </w:r>
+    </w:p>
+    <w:p>
+      <w:pPr>
+        <w:pStyle w:val="Paragraph"/>
+      </w:pPr>
+      <w:r>
+        <w:rPr>
+          <w:rFonts w:hint="cs"/>
+          <w:rtl/>
+        </w:rPr>
+        <w:t xml:space="preserve">شکل ۵ خروجیِ کاملِ پایپ‌لاین—تشخیص دیسک، مرز هاله، و رخداد حباب—را روی یک عکسِ واقعی (۹ دیسک روی یک ظرف) نشان می‌دهد. جدول ۱ گزارشِ عددیِ متناظر را فهرست می‌کند: قطرِ دیسک‌ها از ۴٫۹ تا </w:t>
+      </w:r>
+      <w:r>
+        <w:rPr>
+          <w:rFonts w:hint="cs"/>
+          <w:rtl/>
+        </w:rPr>
+        <w:t>۷٫۷mm و قطرِ هاله‌ها از ۵٫۶ تا ۱۷٫۷mm متغیر است، شاملِ چند دیسکِ عملاً بدونِ هاله (مقاوم)؛ ماژول ۱۷ نیز یک رخدادِ حباب گزارش کرد.</w:t>
       </w:r>
     </w:p>
     <w:p>
@@ -850,7 +868,7 @@
           <w:noProof/>
         </w:rPr>
         <w:drawing>
-          <wp:inline distT="0" distB="0" distL="0" distR="0">
+          <wp:inline distT="0" distB="0" distL="0" distR="0" wp14:anchorId="733EE8DA" wp14:editId="4F77DA72">
             <wp:extent cx="821556" cy="1128271"/>
             <wp:effectExtent l="0" t="0" r="0" b="0"/>
             <wp:docPr id="107" name="Picture 107"/>
@@ -865,7 +883,7 @@
                     <pic:cNvPicPr/>
                   </pic:nvPicPr>
                   <pic:blipFill>
-                    <a:blip r:embed="rId26"/>
+                    <a:blip r:embed="rId13"/>
                     <a:stretch>
                       <a:fillRect/>
                     </a:stretch>
@@ -893,7 +911,7 @@
           <w:noProof/>
         </w:rPr>
         <w:drawing>
-          <wp:inline distT="0" distB="0" distL="0" distR="0">
+          <wp:inline distT="0" distB="0" distL="0" distR="0" wp14:anchorId="44042CF1" wp14:editId="6F3CF81C">
             <wp:extent cx="1086617" cy="1128271"/>
             <wp:effectExtent l="0" t="0" r="0" b="0"/>
             <wp:docPr id="108" name="Picture 108"/>
@@ -908,7 +926,7 @@
                     <pic:cNvPicPr/>
                   </pic:nvPicPr>
                   <pic:blipFill>
-                    <a:blip r:embed="rId27"/>
+                    <a:blip r:embed="rId14"/>
                     <a:stretch>
                       <a:fillRect/>
                     </a:stretch>
@@ -936,7 +954,7 @@
           <w:noProof/>
         </w:rPr>
         <w:drawing>
-          <wp:inline distT="0" distB="0" distL="0" distR="0">
+          <wp:inline distT="0" distB="0" distL="0" distR="0" wp14:anchorId="11072CDB" wp14:editId="5B508993">
             <wp:extent cx="864575" cy="1128271"/>
             <wp:effectExtent l="0" t="0" r="0" b="0"/>
             <wp:docPr id="109" name="Picture 109"/>
@@ -951,7 +969,7 @@
                     <pic:cNvPicPr/>
                   </pic:nvPicPr>
                   <pic:blipFill>
-                    <a:blip r:embed="rId28"/>
+                    <a:blip r:embed="rId15"/>
                     <a:stretch>
                       <a:fillRect/>
                     </a:stretch>
@@ -981,7 +999,7 @@
           <w:rFonts w:hint="cs"/>
           <w:rtl/>
         </w:rPr>
-        <w:t xml:space="preserve">شکل ۵: خروجی سرتاسریِ پایپ‌لاین روی یک نمونه‌ی واقعی. از راست به چپ: (الف) نتیجه‌ی نهاییِ ادغام برای تشخیص نُه دیسک، (ب) مرز نهاییِ هاله‌ی بازدارندگی برای هر دیسک، (پ) ناحیه‌ی جست‌وجوی رخداد/حباب؛ یک رخداد (دایره‌ی بنفش کوچک) نزدیکِ دیسکِ CZ30 شناسایی شد.</w:t>
+        <w:t>شکل ۵: خروجی سرتاسریِ پایپ‌لاین روی یک نمونه‌ی واقعی. از راست به چپ: (الف) نتیجه‌ی نهاییِ ادغام برای تشخیص نُه دیسک، (ب) مرز نهاییِ هاله‌ی بازدارندگی برای هر دیسک، (پ) ناحیه‌ی جست‌وجوی رخداد/حباب؛ یک رخداد (دایره‌ی بنفش کوچک) نزدیکِ دیسکِ CZ30 شناسایی شد.</w:t>
       </w:r>
     </w:p>
     <w:p>
@@ -993,7 +1011,7 @@
           <w:rFonts w:hint="cs"/>
           <w:rtl/>
         </w:rPr>
-        <w:t xml:space="preserve">جدول ۱: گزارش خروجی نهایی پایپ‌لاین برای یک ظرف واقعی (۹ دیسک، روش تشخیص ظرف: hough_fallback، اطمینان=۰٫۸۲).</w:t>
+        <w:t>جدول ۱: گزارش خروجی نهایی پایپ‌لاین برای یک ظرف واقعی (۹ دیسک، روش تشخیص ظرف: hough_fallback، اطمینان=۰٫۸۲).</w:t>
       </w:r>
     </w:p>
     <w:tbl>
@@ -1028,19 +1046,18 @@
           </w:tcPr>
           <w:p>
             <w:pPr>
-              <w:bidi/>
               <w:jc w:val="center"/>
             </w:pPr>
             <w:r>
               <w:rPr>
+                <w:rFonts w:hint="cs"/>
                 <w:b/>
                 <w:bCs/>
                 <w:sz w:val="15"/>
                 <w:szCs w:val="15"/>
-                <w:rFonts w:hint="cs"/>
                 <w:rtl/>
               </w:rPr>
-              <w:t xml:space="preserve">دیسک</w:t>
+              <w:t>دیسک</w:t>
             </w:r>
           </w:p>
         </w:tc>
@@ -1052,19 +1069,18 @@
           </w:tcPr>
           <w:p>
             <w:pPr>
-              <w:bidi/>
               <w:jc w:val="center"/>
             </w:pPr>
             <w:r>
               <w:rPr>
+                <w:rFonts w:hint="cs"/>
                 <w:b/>
                 <w:bCs/>
                 <w:sz w:val="15"/>
                 <w:szCs w:val="15"/>
-                <w:rFonts w:hint="cs"/>
                 <w:rtl/>
               </w:rPr>
-              <w:t xml:space="preserve">قطر دیسک (mm)</w:t>
+              <w:t>قطر دیسک (mm)</w:t>
             </w:r>
           </w:p>
         </w:tc>
@@ -1076,19 +1092,18 @@
           </w:tcPr>
           <w:p>
             <w:pPr>
-              <w:bidi/>
               <w:jc w:val="center"/>
             </w:pPr>
             <w:r>
               <w:rPr>
+                <w:rFonts w:hint="cs"/>
                 <w:b/>
                 <w:bCs/>
                 <w:sz w:val="15"/>
                 <w:szCs w:val="15"/>
-                <w:rFonts w:hint="cs"/>
                 <w:rtl/>
               </w:rPr>
-              <w:t xml:space="preserve">قطر هاله (mm)</w:t>
+              <w:t>قطر هاله (mm)</w:t>
             </w:r>
           </w:p>
         </w:tc>
@@ -1104,17 +1119,16 @@
           </w:tcPr>
           <w:p>
             <w:pPr>
-              <w:bidi/>
               <w:jc w:val="center"/>
             </w:pPr>
             <w:r>
               <w:rPr>
+                <w:rFonts w:hint="cs"/>
                 <w:sz w:val="15"/>
                 <w:szCs w:val="15"/>
-                <w:rFonts w:hint="cs"/>
                 <w:rtl/>
               </w:rPr>
-              <w:t xml:space="preserve">۱</w:t>
+              <w:t>۱</w:t>
             </w:r>
           </w:p>
         </w:tc>
@@ -1125,17 +1139,16 @@
           </w:tcPr>
           <w:p>
             <w:pPr>
-              <w:bidi/>
               <w:jc w:val="center"/>
             </w:pPr>
             <w:r>
               <w:rPr>
+                <w:rFonts w:hint="cs"/>
                 <w:sz w:val="15"/>
                 <w:szCs w:val="15"/>
-                <w:rFonts w:hint="cs"/>
                 <w:rtl/>
               </w:rPr>
-              <w:t xml:space="preserve">۷٫۷</w:t>
+              <w:t>۷٫۷</w:t>
             </w:r>
           </w:p>
         </w:tc>
@@ -1146,17 +1159,16 @@
           </w:tcPr>
           <w:p>
             <w:pPr>
-              <w:bidi/>
               <w:jc w:val="center"/>
             </w:pPr>
             <w:r>
               <w:rPr>
+                <w:rFonts w:hint="cs"/>
                 <w:sz w:val="15"/>
                 <w:szCs w:val="15"/>
-                <w:rFonts w:hint="cs"/>
                 <w:rtl/>
               </w:rPr>
-              <w:t xml:space="preserve">۱۷٫۷</w:t>
+              <w:t>۱۷٫۷</w:t>
             </w:r>
           </w:p>
         </w:tc>
@@ -1172,17 +1184,16 @@
           </w:tcPr>
           <w:p>
             <w:pPr>
-              <w:bidi/>
               <w:jc w:val="center"/>
             </w:pPr>
             <w:r>
               <w:rPr>
+                <w:rFonts w:hint="cs"/>
                 <w:sz w:val="15"/>
                 <w:szCs w:val="15"/>
-                <w:rFonts w:hint="cs"/>
                 <w:rtl/>
               </w:rPr>
-              <w:t xml:space="preserve">۲</w:t>
+              <w:t>۲</w:t>
             </w:r>
           </w:p>
         </w:tc>
@@ -1193,17 +1204,16 @@
           </w:tcPr>
           <w:p>
             <w:pPr>
-              <w:bidi/>
               <w:jc w:val="center"/>
             </w:pPr>
             <w:r>
               <w:rPr>
+                <w:rFonts w:hint="cs"/>
                 <w:sz w:val="15"/>
                 <w:szCs w:val="15"/>
-                <w:rFonts w:hint="cs"/>
                 <w:rtl/>
               </w:rPr>
-              <w:t xml:space="preserve">۵٫۰</w:t>
+              <w:t>۵٫۰</w:t>
             </w:r>
           </w:p>
         </w:tc>
@@ -1214,17 +1224,16 @@
           </w:tcPr>
           <w:p>
             <w:pPr>
-              <w:bidi/>
               <w:jc w:val="center"/>
             </w:pPr>
             <w:r>
               <w:rPr>
+                <w:rFonts w:hint="cs"/>
                 <w:sz w:val="15"/>
                 <w:szCs w:val="15"/>
-                <w:rFonts w:hint="cs"/>
                 <w:rtl/>
               </w:rPr>
-              <w:t xml:space="preserve">۵٫۸</w:t>
+              <w:t>۵٫۸</w:t>
             </w:r>
           </w:p>
         </w:tc>
@@ -1240,17 +1249,16 @@
           </w:tcPr>
           <w:p>
             <w:pPr>
-              <w:bidi/>
               <w:jc w:val="center"/>
             </w:pPr>
             <w:r>
               <w:rPr>
+                <w:rFonts w:hint="cs"/>
                 <w:sz w:val="15"/>
                 <w:szCs w:val="15"/>
-                <w:rFonts w:hint="cs"/>
                 <w:rtl/>
               </w:rPr>
-              <w:t xml:space="preserve">۳</w:t>
+              <w:t>۳</w:t>
             </w:r>
           </w:p>
         </w:tc>
@@ -1261,17 +1269,16 @@
           </w:tcPr>
           <w:p>
             <w:pPr>
-              <w:bidi/>
               <w:jc w:val="center"/>
             </w:pPr>
             <w:r>
               <w:rPr>
+                <w:rFonts w:hint="cs"/>
                 <w:sz w:val="15"/>
                 <w:szCs w:val="15"/>
-                <w:rFonts w:hint="cs"/>
                 <w:rtl/>
               </w:rPr>
-              <w:t xml:space="preserve">۴٫۹</w:t>
+              <w:t>۴٫۹</w:t>
             </w:r>
           </w:p>
         </w:tc>
@@ -1282,17 +1289,16 @@
           </w:tcPr>
           <w:p>
             <w:pPr>
-              <w:bidi/>
               <w:jc w:val="center"/>
             </w:pPr>
             <w:r>
               <w:rPr>
+                <w:rFonts w:hint="cs"/>
                 <w:sz w:val="15"/>
                 <w:szCs w:val="15"/>
-                <w:rFonts w:hint="cs"/>
                 <w:rtl/>
               </w:rPr>
-              <w:t xml:space="preserve">۵٫۷</w:t>
+              <w:t>۵٫۷</w:t>
             </w:r>
           </w:p>
         </w:tc>
@@ -1308,17 +1314,16 @@
           </w:tcPr>
           <w:p>
             <w:pPr>
-              <w:bidi/>
               <w:jc w:val="center"/>
             </w:pPr>
             <w:r>
               <w:rPr>
+                <w:rFonts w:hint="cs"/>
                 <w:sz w:val="15"/>
                 <w:szCs w:val="15"/>
-                <w:rFonts w:hint="cs"/>
                 <w:rtl/>
               </w:rPr>
-              <w:t xml:space="preserve">۴</w:t>
+              <w:t>۴</w:t>
             </w:r>
           </w:p>
         </w:tc>
@@ -1329,17 +1334,16 @@
           </w:tcPr>
           <w:p>
             <w:pPr>
-              <w:bidi/>
               <w:jc w:val="center"/>
             </w:pPr>
             <w:r>
               <w:rPr>
+                <w:rFonts w:hint="cs"/>
                 <w:sz w:val="15"/>
                 <w:szCs w:val="15"/>
-                <w:rFonts w:hint="cs"/>
                 <w:rtl/>
               </w:rPr>
-              <w:t xml:space="preserve">۴٫۹</w:t>
+              <w:t>۴٫۹</w:t>
             </w:r>
           </w:p>
         </w:tc>
@@ -1350,17 +1354,16 @@
           </w:tcPr>
           <w:p>
             <w:pPr>
-              <w:bidi/>
               <w:jc w:val="center"/>
             </w:pPr>
             <w:r>
               <w:rPr>
+                <w:rFonts w:hint="cs"/>
                 <w:sz w:val="15"/>
                 <w:szCs w:val="15"/>
-                <w:rFonts w:hint="cs"/>
                 <w:rtl/>
               </w:rPr>
-              <w:t xml:space="preserve">۵٫۷</w:t>
+              <w:t>۵٫۷</w:t>
             </w:r>
           </w:p>
         </w:tc>
@@ -1376,17 +1379,16 @@
           </w:tcPr>
           <w:p>
             <w:pPr>
-              <w:bidi/>
               <w:jc w:val="center"/>
             </w:pPr>
             <w:r>
               <w:rPr>
+                <w:rFonts w:hint="cs"/>
                 <w:sz w:val="15"/>
                 <w:szCs w:val="15"/>
-                <w:rFonts w:hint="cs"/>
                 <w:rtl/>
               </w:rPr>
-              <w:t xml:space="preserve">۵</w:t>
+              <w:t>۵</w:t>
             </w:r>
           </w:p>
         </w:tc>
@@ -1397,17 +1399,16 @@
           </w:tcPr>
           <w:p>
             <w:pPr>
-              <w:bidi/>
               <w:jc w:val="center"/>
             </w:pPr>
             <w:r>
               <w:rPr>
+                <w:rFonts w:hint="cs"/>
                 <w:sz w:val="15"/>
                 <w:szCs w:val="15"/>
-                <w:rFonts w:hint="cs"/>
                 <w:rtl/>
               </w:rPr>
-              <w:t xml:space="preserve">۴٫۹</w:t>
+              <w:t>۴٫۹</w:t>
             </w:r>
           </w:p>
         </w:tc>
@@ -1418,17 +1419,16 @@
           </w:tcPr>
           <w:p>
             <w:pPr>
-              <w:bidi/>
               <w:jc w:val="center"/>
             </w:pPr>
             <w:r>
               <w:rPr>
+                <w:rFonts w:hint="cs"/>
                 <w:sz w:val="15"/>
                 <w:szCs w:val="15"/>
-                <w:rFonts w:hint="cs"/>
                 <w:rtl/>
               </w:rPr>
-              <w:t xml:space="preserve">۱۳٫۲</w:t>
+              <w:t>۱۳٫۲</w:t>
             </w:r>
           </w:p>
         </w:tc>
@@ -1444,17 +1444,16 @@
           </w:tcPr>
           <w:p>
             <w:pPr>
-              <w:bidi/>
               <w:jc w:val="center"/>
             </w:pPr>
             <w:r>
               <w:rPr>
+                <w:rFonts w:hint="cs"/>
                 <w:sz w:val="15"/>
                 <w:szCs w:val="15"/>
-                <w:rFonts w:hint="cs"/>
                 <w:rtl/>
               </w:rPr>
-              <w:t xml:space="preserve">۶</w:t>
+              <w:t>۶</w:t>
             </w:r>
           </w:p>
         </w:tc>
@@ -1465,17 +1464,16 @@
           </w:tcPr>
           <w:p>
             <w:pPr>
-              <w:bidi/>
               <w:jc w:val="center"/>
             </w:pPr>
             <w:r>
               <w:rPr>
+                <w:rFonts w:hint="cs"/>
                 <w:sz w:val="15"/>
                 <w:szCs w:val="15"/>
-                <w:rFonts w:hint="cs"/>
                 <w:rtl/>
               </w:rPr>
-              <w:t xml:space="preserve">۴٫۹</w:t>
+              <w:t>۴٫۹</w:t>
             </w:r>
           </w:p>
         </w:tc>
@@ -1486,17 +1484,16 @@
           </w:tcPr>
           <w:p>
             <w:pPr>
-              <w:bidi/>
               <w:jc w:val="center"/>
             </w:pPr>
             <w:r>
               <w:rPr>
+                <w:rFonts w:hint="cs"/>
                 <w:sz w:val="15"/>
                 <w:szCs w:val="15"/>
-                <w:rFonts w:hint="cs"/>
                 <w:rtl/>
               </w:rPr>
-              <w:t xml:space="preserve">۵٫۷</w:t>
+              <w:t>۵٫۷</w:t>
             </w:r>
           </w:p>
         </w:tc>
@@ -1512,17 +1509,16 @@
           </w:tcPr>
           <w:p>
             <w:pPr>
-              <w:bidi/>
               <w:jc w:val="center"/>
             </w:pPr>
             <w:r>
               <w:rPr>
+                <w:rFonts w:hint="cs"/>
                 <w:sz w:val="15"/>
                 <w:szCs w:val="15"/>
-                <w:rFonts w:hint="cs"/>
                 <w:rtl/>
               </w:rPr>
-              <w:t xml:space="preserve">۷</w:t>
+              <w:t>۷</w:t>
             </w:r>
           </w:p>
         </w:tc>
@@ -1533,17 +1529,16 @@
           </w:tcPr>
           <w:p>
             <w:pPr>
-              <w:bidi/>
               <w:jc w:val="center"/>
             </w:pPr>
             <w:r>
               <w:rPr>
+                <w:rFonts w:hint="cs"/>
                 <w:sz w:val="15"/>
                 <w:szCs w:val="15"/>
-                <w:rFonts w:hint="cs"/>
                 <w:rtl/>
               </w:rPr>
-              <w:t xml:space="preserve">۴٫۹</w:t>
+              <w:t>۴٫۹</w:t>
             </w:r>
           </w:p>
         </w:tc>
@@ -1554,17 +1549,16 @@
           </w:tcPr>
           <w:p>
             <w:pPr>
-              <w:bidi/>
               <w:jc w:val="center"/>
             </w:pPr>
             <w:r>
               <w:rPr>
+                <w:rFonts w:hint="cs"/>
                 <w:sz w:val="15"/>
                 <w:szCs w:val="15"/>
-                <w:rFonts w:hint="cs"/>
                 <w:rtl/>
               </w:rPr>
-              <w:t xml:space="preserve">۵٫۷</w:t>
+              <w:t>۵٫۷</w:t>
             </w:r>
           </w:p>
         </w:tc>
@@ -1580,17 +1574,16 @@
           </w:tcPr>
           <w:p>
             <w:pPr>
-              <w:bidi/>
               <w:jc w:val="center"/>
             </w:pPr>
             <w:r>
               <w:rPr>
+                <w:rFonts w:hint="cs"/>
                 <w:sz w:val="15"/>
                 <w:szCs w:val="15"/>
-                <w:rFonts w:hint="cs"/>
                 <w:rtl/>
               </w:rPr>
-              <w:t xml:space="preserve">۸</w:t>
+              <w:t>۸</w:t>
             </w:r>
           </w:p>
         </w:tc>
@@ -1601,17 +1594,16 @@
           </w:tcPr>
           <w:p>
             <w:pPr>
-              <w:bidi/>
               <w:jc w:val="center"/>
             </w:pPr>
             <w:r>
               <w:rPr>
+                <w:rFonts w:hint="cs"/>
                 <w:sz w:val="15"/>
                 <w:szCs w:val="15"/>
-                <w:rFonts w:hint="cs"/>
                 <w:rtl/>
               </w:rPr>
-              <w:t xml:space="preserve">۷٫۷</w:t>
+              <w:t>۷٫۷</w:t>
             </w:r>
           </w:p>
         </w:tc>
@@ -1622,17 +1614,16 @@
           </w:tcPr>
           <w:p>
             <w:pPr>
-              <w:bidi/>
               <w:jc w:val="center"/>
             </w:pPr>
             <w:r>
               <w:rPr>
+                <w:rFonts w:hint="cs"/>
                 <w:sz w:val="15"/>
                 <w:szCs w:val="15"/>
-                <w:rFonts w:hint="cs"/>
                 <w:rtl/>
               </w:rPr>
-              <w:t xml:space="preserve">۸٫۹</w:t>
+              <w:t>۸٫۹</w:t>
             </w:r>
           </w:p>
         </w:tc>
@@ -1648,17 +1639,16 @@
           </w:tcPr>
           <w:p>
             <w:pPr>
-              <w:bidi/>
               <w:jc w:val="center"/>
             </w:pPr>
             <w:r>
               <w:rPr>
+                <w:rFonts w:hint="cs"/>
                 <w:sz w:val="15"/>
                 <w:szCs w:val="15"/>
-                <w:rFonts w:hint="cs"/>
                 <w:rtl/>
               </w:rPr>
-              <w:t xml:space="preserve">۹</w:t>
+              <w:t>۹</w:t>
             </w:r>
           </w:p>
         </w:tc>
@@ -1669,17 +1659,16 @@
           </w:tcPr>
           <w:p>
             <w:pPr>
-              <w:bidi/>
               <w:jc w:val="center"/>
             </w:pPr>
             <w:r>
               <w:rPr>
+                <w:rFonts w:hint="cs"/>
                 <w:sz w:val="15"/>
                 <w:szCs w:val="15"/>
-                <w:rFonts w:hint="cs"/>
                 <w:rtl/>
               </w:rPr>
-              <w:t xml:space="preserve">۵٫۱</w:t>
+              <w:t>۵٫۱</w:t>
             </w:r>
           </w:p>
         </w:tc>
@@ -1690,17 +1679,16 @@
           </w:tcPr>
           <w:p>
             <w:pPr>
-              <w:bidi/>
               <w:jc w:val="center"/>
             </w:pPr>
             <w:r>
               <w:rPr>
+                <w:rFonts w:hint="cs"/>
                 <w:sz w:val="15"/>
                 <w:szCs w:val="15"/>
-                <w:rFonts w:hint="cs"/>
                 <w:rtl/>
               </w:rPr>
-              <w:t xml:space="preserve">۹٫۰</w:t>
+              <w:t>۹٫۰</w:t>
             </w:r>
           </w:p>
         </w:tc>
@@ -1716,55 +1704,149 @@
           <w:rFonts w:hint="cs"/>
           <w:rtl/>
         </w:rPr>
-        <w:t xml:space="preserve">روی مجموعه‌ی ۷۸-عکسیِ اصلی، اعتبارسنجی عمدتاً کیفی/بصری بوده: هر تغییرِ الگوریتمی، پیش از قطعی‌شدن، روی چند عکسِ متنوع اجرا و overlay آن با بازرسیِ مستقیم تایید شده—از جمله رفعِ «پرتگاهِ ادغام» و رفعِ لنگرشدنِ مرزِ هاله (بخش ۲-۵)، که روی چند عکسِ چالشیِ پتریِ مربعی نیز بدونِ رگرسیون تکرار شد.</w:t>
+        <w:t>روی مجموعه‌ی ۷۸-عکسیِ اصلی، اعتبارسنجی عمدتاً کیفی/بصری بوده: هر تغییرِ الگوریتمی، پیش از قطعی‌شدن، روی چند عکسِ متنوع اجرا و overlay آن با بازرسیِ مستقیم تایید شده—از جمله رفعِ «پرتگاهِ ادغام» و رفعِ لنگرشدنِ مرزِ هاله (بخش ۲-۵)، که روی چند عکسِ چالشیِ پتریِ مربعی نیز بدونِ رگرسیون تکرار شد.</w:t>
       </w:r>
     </w:p>
     <w:p>
       <w:pPr>
         <w:pStyle w:val="Heading2"/>
-      </w:pPr>
-      <w:r>
-        <w:rPr>
-          <w:b/>
-          <w:bCs/>
-          <w:rFonts w:hint="cs"/>
-          <w:rtl/>
-        </w:rPr>
-        <w:t xml:space="preserve">ارزیابی کمّی در برابر Ground Truth</w:t>
-      </w:r>
-    </w:p>
-    <w:p>
-      <w:pPr>
-        <w:pStyle w:val="Paragraph"/>
       </w:pPr>
       <w:r>
         <w:rPr>
           <w:rFonts w:hint="cs"/>
           <w:rtl/>
         </w:rPr>
-        <w:t xml:space="preserve">برای ارزیابیِ کمّی، دیسک‌های یک زیرمجموعه‌ی مستقلِ ۱۱ عکسی با یک لوکیتورِ Hough-circle مجزا از پایپ‌لاینِ تحتِ ارزیابی شماره‌گذاری شدند—تا خطای سیستماتیکِ خودِ سیستم در حقیقتِ زمینی جذب نشود—و سپس هر دیسک توسط یک کارشناسِ آزمایشگاه، روی نسخه‌ی چاپیِ عکس، خوانده و ثبت شد (۹۳ دیسک؛ ۶۴ دارایِ قطرِ هاله‌ی ثبت‌شده، ۲۹ بدونِ هاله). ارزیابی با اجرایِ بدون‌تغییرِ نوت‌بوک روی هر عکس انجام و دیسک‌ها صرفاً بر اساسِ نزدیک‌ترینِ موقعیت (نه ترتیبِ داخلیِ پایپ‌لاین) تطبیق داده شدند. جدول ۲ نتایج را خلاصه می‌کند (خطای قطر با MAE، بایاس، و Bland–Altman </w:t>
-      </w:r>
-      <w:r>
-        <w:t xml:space="preserve">[11]</w:t>
-      </w:r>
+        <w:t>ارزیابی کمّی در برابر Ground Truth</w:t>
+      </w:r>
+    </w:p>
+    <w:p>
+      <w:pPr>
+        <w:pStyle w:val="Paragraph"/>
+      </w:pPr>
       <w:r>
         <w:rPr>
           <w:rFonts w:hint="cs"/>
           <w:rtl/>
         </w:rPr>
-        <w:t xml:space="preserve">)؛ این نتایج روی یک سیستمِ کاملاً مجزا نیز عیناً بازتولید شدند.</w:t>
-      </w:r>
-    </w:p>
-    <w:p>
-      <w:pPr>
-        <w:pStyle w:val="TableTitle"/>
-      </w:pPr>
+        <w:t xml:space="preserve">برای ارزیابیِ کمّی، دیسک‌های یک زیرمجموعه‌ی مستقلِ ۱۱ عکسی با یک لوکیتورِ </w:t>
+      </w:r>
+      <w:r>
+        <w:rPr>
+          <w:rFonts w:asciiTheme="majorBidi" w:hAnsiTheme="majorBidi" w:cstheme="majorBidi"/>
+          <w:rtl/>
+        </w:rPr>
+        <w:t>Hough-circle</w:t>
+      </w:r>
       <w:r>
         <w:rPr>
           <w:rFonts w:hint="cs"/>
           <w:rtl/>
         </w:rPr>
-        <w:t xml:space="preserve">جدول ۲: نتایجِ ارزیابیِ کمّی در برابرِ حقیقتِ زمینیِ کارشناسی (۱۱ عکس، ۹۳ دیسک).</w:t>
+        <w:t xml:space="preserve"> مجزا از پایپ‌لاینِ تحتِ ارزیابی شماره‌گذاری شدند—تا خطای سیستماتیکِ خودِ سیستم در </w:t>
+      </w:r>
+      <w:r>
+        <w:rPr>
+          <w:sz w:val="24"/>
+          <w:szCs w:val="28"/>
+        </w:rPr>
+        <w:t>Ground Truth</w:t>
+      </w:r>
+      <w:r>
+        <w:rPr>
+          <w:rFonts w:hint="cs"/>
+          <w:sz w:val="24"/>
+          <w:szCs w:val="28"/>
+          <w:rtl/>
+        </w:rPr>
+        <w:t xml:space="preserve"> </w:t>
+      </w:r>
+      <w:r>
+        <w:rPr>
+          <w:rFonts w:hint="cs"/>
+          <w:rtl/>
+        </w:rPr>
+        <w:t xml:space="preserve">جذب نشود—و سپس هر دیسک توسط یک کارشناسِ آزمایشگاه، روی نسخه‌ی چاپیِ عکس، خوانده و ثبت شد (۹۳ دیسک؛ ۶۴ </w:t>
+      </w:r>
+      <w:r>
+        <w:rPr>
+          <w:rFonts w:hint="cs"/>
+          <w:rtl/>
+        </w:rPr>
+        <w:t xml:space="preserve">دیسک </w:t>
+      </w:r>
+      <w:r>
+        <w:rPr>
+          <w:rFonts w:hint="cs"/>
+          <w:rtl/>
+        </w:rPr>
+        <w:t xml:space="preserve">دارایِ قطرِ هاله‌ی ثبت‌شده، ۲۹ </w:t>
+      </w:r>
+      <w:r>
+        <w:rPr>
+          <w:rFonts w:hint="cs"/>
+          <w:rtl/>
+        </w:rPr>
+        <w:t xml:space="preserve">دیسک </w:t>
+      </w:r>
+      <w:r>
+        <w:rPr>
+          <w:rFonts w:hint="cs"/>
+          <w:rtl/>
+        </w:rPr>
+        <w:t xml:space="preserve">بدونِ هاله). ارزیابی با اجرایِ بدون‌تغییرِ نوت‌بوک روی هر عکس انجام و دیسک‌ها صرفاً بر اساسِ نزدیک‌ترینِ موقعیت (نه ترتیبِ داخلیِ پایپ‌لاین) تطبیق داده شدند. جدول ۲ نتایج را خلاصه می‌کند (خطای قطر با MAE، بایاس، و Bland–Altman </w:t>
+      </w:r>
+      <w:r>
+        <w:t>[11]</w:t>
+      </w:r>
+      <w:r>
+        <w:rPr>
+          <w:rFonts w:hint="cs"/>
+          <w:rtl/>
+        </w:rPr>
+        <w:t>)؛ این نتایج روی یک سیستمِ کاملاً مجزا نیز عیناً بازتولید شدند.</w:t>
+      </w:r>
+    </w:p>
+    <w:p>
+      <w:pPr>
+        <w:pStyle w:val="TableTitle"/>
+      </w:pPr>
+      <w:r>
+        <w:rPr>
+          <w:rFonts w:hint="cs"/>
+          <w:rtl/>
+        </w:rPr>
+        <w:t>جدول ۲: نتایجِ ارزیابیِ کمّی در برابرِ</w:t>
+      </w:r>
+      <w:r>
+        <w:rPr>
+          <w:rFonts w:hint="cs"/>
+          <w:sz w:val="14"/>
+          <w:szCs w:val="14"/>
+          <w:rtl/>
+        </w:rPr>
+        <w:t xml:space="preserve"> </w:t>
+      </w:r>
+      <w:r>
+        <w:rPr>
+          <w:szCs w:val="20"/>
+        </w:rPr>
+        <w:t>Ground Truth</w:t>
+      </w:r>
+      <w:r>
+        <w:rPr>
+          <w:rFonts w:hint="cs"/>
+          <w:sz w:val="14"/>
+          <w:szCs w:val="14"/>
+          <w:rtl/>
+        </w:rPr>
+        <w:t xml:space="preserve"> </w:t>
+      </w:r>
+      <w:r>
+        <w:rPr>
+          <w:rFonts w:hint="cs"/>
+          <w:rtl/>
+        </w:rPr>
+        <w:t>کارشناسی (۱۱ عکس، ۹۳ دیسک).</w:t>
       </w:r>
     </w:p>
     <w:tbl>
@@ -1782,8 +1864,8 @@
         <w:tblLook w:val="04A0" w:firstRow="1" w:lastRow="0" w:firstColumn="1" w:lastColumn="0" w:noHBand="0" w:noVBand="1"/>
       </w:tblPr>
       <w:tblGrid>
-        <w:gridCol w:w="2350"/>
-        <w:gridCol w:w="2250"/>
+        <w:gridCol w:w="2087"/>
+        <w:gridCol w:w="2513"/>
       </w:tblGrid>
       <w:tr>
         <w:trPr>
@@ -1792,49 +1874,47 @@
         </w:trPr>
         <w:tc>
           <w:tcPr>
-            <w:tcW w:w="2350" w:type="dxa"/>
+            <w:tcW w:w="2087" w:type="dxa"/>
             <w:shd w:val="clear" w:color="auto" w:fill="D9D9D9"/>
             <w:vAlign w:val="center"/>
           </w:tcPr>
           <w:p>
             <w:pPr>
-              <w:bidi/>
               <w:jc w:val="center"/>
             </w:pPr>
             <w:r>
               <w:rPr>
+                <w:rFonts w:hint="cs"/>
                 <w:b/>
                 <w:bCs/>
                 <w:sz w:val="15"/>
                 <w:szCs w:val="15"/>
-                <w:rFonts w:hint="cs"/>
                 <w:rtl/>
               </w:rPr>
-              <w:t xml:space="preserve">معیار</w:t>
+              <w:t>معیار</w:t>
             </w:r>
           </w:p>
         </w:tc>
         <w:tc>
           <w:tcPr>
-            <w:tcW w:w="2250" w:type="dxa"/>
+            <w:tcW w:w="2513" w:type="dxa"/>
             <w:shd w:val="clear" w:color="auto" w:fill="D9D9D9"/>
             <w:vAlign w:val="center"/>
           </w:tcPr>
           <w:p>
             <w:pPr>
-              <w:bidi/>
               <w:jc w:val="center"/>
             </w:pPr>
             <w:r>
               <w:rPr>
+                <w:rFonts w:hint="cs"/>
                 <w:b/>
                 <w:bCs/>
                 <w:sz w:val="15"/>
                 <w:szCs w:val="15"/>
-                <w:rFonts w:hint="cs"/>
                 <w:rtl/>
               </w:rPr>
-              <w:t xml:space="preserve">مقدار</w:t>
+              <w:t>مقدار</w:t>
             </w:r>
           </w:p>
         </w:tc>
@@ -1845,33 +1925,31 @@
         </w:trPr>
         <w:tc>
           <w:tcPr>
-            <w:tcW w:w="2350" w:type="dxa"/>
+            <w:tcW w:w="2087" w:type="dxa"/>
             <w:vAlign w:val="center"/>
           </w:tcPr>
           <w:p>
             <w:pPr>
-              <w:bidi/>
               <w:jc w:val="center"/>
             </w:pPr>
             <w:r>
               <w:rPr>
+                <w:rFonts w:hint="cs"/>
                 <w:sz w:val="15"/>
                 <w:szCs w:val="15"/>
-                <w:rFonts w:hint="cs"/>
                 <w:rtl/>
               </w:rPr>
-              <w:t xml:space="preserve">تشخیصِ ظرفِ پتری (۱۱ عکس)</w:t>
+              <w:t>تشخیصِ ظرفِ پتری (۱۱ عکس)</w:t>
             </w:r>
           </w:p>
         </w:tc>
         <w:tc>
           <w:tcPr>
-            <w:tcW w:w="2250" w:type="dxa"/>
+            <w:tcW w:w="2513" w:type="dxa"/>
             <w:vAlign w:val="center"/>
           </w:tcPr>
           <w:p>
             <w:pPr>
-              <w:bidi/>
               <w:jc w:val="center"/>
             </w:pPr>
             <w:r>
@@ -1879,7 +1957,7 @@
                 <w:sz w:val="15"/>
                 <w:szCs w:val="15"/>
               </w:rPr>
-              <w:t xml:space="preserve">۱۱/۱۱ (۱۰۰٪)</w:t>
+              <w:t>۱۱/۱۱ (۱۰۰٪)</w:t>
             </w:r>
           </w:p>
         </w:tc>
@@ -1890,19 +1968,18 @@
         </w:trPr>
         <w:tc>
           <w:tcPr>
-            <w:tcW w:w="2350" w:type="dxa"/>
+            <w:tcW w:w="2087" w:type="dxa"/>
             <w:vAlign w:val="center"/>
           </w:tcPr>
           <w:p>
             <w:pPr>
-              <w:bidi/>
               <w:jc w:val="center"/>
             </w:pPr>
             <w:r>
               <w:rPr>
+                <w:rFonts w:hint="cs"/>
                 <w:sz w:val="15"/>
                 <w:szCs w:val="15"/>
-                <w:rFonts w:hint="cs"/>
                 <w:rtl/>
               </w:rPr>
               <w:t xml:space="preserve">تشخیصِ دیسک: </w:t>
@@ -1912,13 +1989,13 @@
                 <w:sz w:val="15"/>
                 <w:szCs w:val="15"/>
               </w:rPr>
-              <w:t xml:space="preserve">Precision / Recall / F1</w:t>
+              <w:t>Precision / Recall / F1</w:t>
             </w:r>
             <w:r>
               <w:rPr>
+                <w:rFonts w:hint="cs"/>
                 <w:sz w:val="15"/>
                 <w:szCs w:val="15"/>
-                <w:rFonts w:hint="cs"/>
                 <w:rtl/>
               </w:rPr>
               <w:t xml:space="preserve"> (۹۳ دیسک)</w:t>
@@ -1927,20 +2004,59 @@
         </w:tc>
         <w:tc>
           <w:tcPr>
-            <w:tcW w:w="2250" w:type="dxa"/>
+            <w:tcW w:w="2513" w:type="dxa"/>
             <w:vAlign w:val="center"/>
           </w:tcPr>
           <w:p>
             <w:pPr>
-              <w:bidi/>
               <w:jc w:val="center"/>
+              <w:rPr>
+                <w:rFonts w:hint="cs"/>
+                <w:sz w:val="15"/>
+                <w:szCs w:val="15"/>
+                <w:rtl/>
+                <w:lang w:bidi="fa-IR"/>
+              </w:rPr>
             </w:pPr>
             <w:r>
               <w:rPr>
+                <w:rFonts w:hint="cs"/>
                 <w:sz w:val="15"/>
                 <w:szCs w:val="15"/>
+                <w:rtl/>
+                <w:lang w:bidi="fa-IR"/>
               </w:rPr>
-              <w:t xml:space="preserve">۰٫۹۸۹ / ۰٫۹۷۸ / ۰٫۹۸۴</w:t>
+              <w:t>۹۸</w:t>
+            </w:r>
+            <w:r>
+              <w:rPr>
+                <w:rFonts w:hint="cs"/>
+                <w:sz w:val="15"/>
+                <w:szCs w:val="15"/>
+                <w:rtl/>
+                <w:lang w:bidi="fa-IR"/>
+              </w:rPr>
+              <w:t>۴</w:t>
+            </w:r>
+            <w:r>
+              <w:rPr>
+                <w:rFonts w:hint="cs"/>
+                <w:sz w:val="15"/>
+                <w:szCs w:val="15"/>
+                <w:rtl/>
+                <w:lang w:bidi="fa-IR"/>
+              </w:rPr>
+              <w:t>/۰</w:t>
+            </w:r>
+            <w:r>
+              <w:rPr>
+                <w:rFonts w:hint="cs"/>
+                <w:sz w:val="15"/>
+                <w:szCs w:val="15"/>
+                <w:rtl/>
+                <w:lang w:bidi="fa-IR"/>
+              </w:rPr>
+              <w:t>، ۹۷۹/۰، ۹۸۹/۰</w:t>
             </w:r>
           </w:p>
         </w:tc>
@@ -1951,19 +2067,18 @@
         </w:trPr>
         <w:tc>
           <w:tcPr>
-            <w:tcW w:w="2350" w:type="dxa"/>
+            <w:tcW w:w="2087" w:type="dxa"/>
             <w:vAlign w:val="center"/>
           </w:tcPr>
           <w:p>
             <w:pPr>
-              <w:bidi/>
               <w:jc w:val="center"/>
             </w:pPr>
             <w:r>
               <w:rPr>
+                <w:rFonts w:hint="cs"/>
                 <w:sz w:val="15"/>
                 <w:szCs w:val="15"/>
-                <w:rFonts w:hint="cs"/>
                 <w:rtl/>
               </w:rPr>
               <w:t xml:space="preserve">حضورِ هاله: </w:t>
@@ -1973,13 +2088,13 @@
                 <w:sz w:val="15"/>
                 <w:szCs w:val="15"/>
               </w:rPr>
-              <w:t xml:space="preserve">Accuracy / Precision / Recall</w:t>
+              <w:t>Accuracy / Precision / Recall</w:t>
             </w:r>
             <w:r>
               <w:rPr>
+                <w:rFonts w:hint="cs"/>
                 <w:sz w:val="15"/>
                 <w:szCs w:val="15"/>
-                <w:rFonts w:hint="cs"/>
                 <w:rtl/>
               </w:rPr>
               <w:t xml:space="preserve"> </w:t>
@@ -1989,26 +2104,35 @@
                 <w:sz w:val="15"/>
                 <w:szCs w:val="15"/>
               </w:rPr>
-              <w:t xml:space="preserve">(n=۹۱)</w:t>
+              <w:t>(n=۹۱)</w:t>
             </w:r>
           </w:p>
         </w:tc>
         <w:tc>
           <w:tcPr>
-            <w:tcW w:w="2250" w:type="dxa"/>
+            <w:tcW w:w="2513" w:type="dxa"/>
             <w:vAlign w:val="center"/>
           </w:tcPr>
           <w:p>
             <w:pPr>
-              <w:bidi/>
               <w:jc w:val="center"/>
+              <w:rPr>
+                <w:rFonts w:hint="cs"/>
+                <w:sz w:val="15"/>
+                <w:szCs w:val="15"/>
+                <w:rtl/>
+                <w:lang w:bidi="fa-IR"/>
+              </w:rPr>
             </w:pPr>
             <w:r>
               <w:rPr>
+                <w:rFonts w:hint="cs"/>
                 <w:sz w:val="15"/>
                 <w:szCs w:val="15"/>
+                <w:rtl/>
+                <w:lang w:bidi="fa-IR"/>
               </w:rPr>
-              <w:t xml:space="preserve">۰٫۷۸۰ / ۰٫۸۰۳ / ۰٫۹۰۵</w:t>
+              <w:t>۹۰۵/۰، ۸۰۳/۰، ۷۸۰/۰</w:t>
             </w:r>
           </w:p>
         </w:tc>
@@ -2019,21 +2143,21 @@
         </w:trPr>
         <w:tc>
           <w:tcPr>
-            <w:tcW w:w="2350" w:type="dxa"/>
+            <w:tcW w:w="2087" w:type="dxa"/>
             <w:vAlign w:val="center"/>
           </w:tcPr>
           <w:p>
             <w:pPr>
-              <w:bidi/>
               <w:jc w:val="center"/>
             </w:pPr>
             <w:r>
               <w:rPr>
+                <w:rFonts w:hint="cs"/>
                 <w:sz w:val="15"/>
                 <w:szCs w:val="15"/>
-                <w:rFonts w:hint="cs"/>
                 <w:rtl/>
               </w:rPr>
+              <w:lastRenderedPageBreak/>
               <w:t xml:space="preserve">قطرِ هاله: MAE، بایاس و حدودِ توافقِ ۹۵٪ </w:t>
             </w:r>
             <w:r>
@@ -2041,26 +2165,124 @@
                 <w:sz w:val="15"/>
                 <w:szCs w:val="15"/>
               </w:rPr>
-              <w:t xml:space="preserve">(n=۵۷)</w:t>
+              <w:t>(n=۵۷)</w:t>
             </w:r>
           </w:p>
         </w:tc>
         <w:tc>
           <w:tcPr>
-            <w:tcW w:w="2250" w:type="dxa"/>
+            <w:tcW w:w="2513" w:type="dxa"/>
             <w:vAlign w:val="center"/>
           </w:tcPr>
           <w:p>
             <w:pPr>
-              <w:bidi/>
               <w:jc w:val="center"/>
+              <w:rPr>
+                <w:rFonts w:asciiTheme="majorBidi" w:hAnsiTheme="majorBidi" w:cstheme="majorBidi"/>
+                <w:sz w:val="15"/>
+                <w:szCs w:val="15"/>
+                <w:lang w:bidi="fa-IR"/>
+              </w:rPr>
             </w:pPr>
             <w:r>
               <w:rPr>
+                <w:rFonts w:asciiTheme="majorBidi" w:hAnsiTheme="majorBidi" w:cstheme="majorBidi"/>
                 <w:sz w:val="15"/>
                 <w:szCs w:val="15"/>
+                <w:lang w:bidi="fa-IR"/>
               </w:rPr>
-              <w:t xml:space="preserve">۵٫۵۰ / −۰٫۵۳ / [−۱۶٫۱،+۱۵٫۱] mm</w:t>
+              <w:t>] mm</w:t>
+            </w:r>
+            <w:r>
+              <w:rPr>
+                <w:rFonts w:asciiTheme="majorBidi" w:hAnsiTheme="majorBidi" w:cstheme="majorBidi"/>
+                <w:sz w:val="15"/>
+                <w:szCs w:val="15"/>
+                <w:rtl/>
+                <w:lang w:bidi="fa-IR"/>
+              </w:rPr>
+              <w:t>۱۲/۱۶-</w:t>
+            </w:r>
+            <w:r>
+              <w:rPr>
+                <w:rFonts w:asciiTheme="majorBidi" w:hAnsiTheme="majorBidi" w:cstheme="majorBidi" w:hint="cs"/>
+                <w:sz w:val="15"/>
+                <w:szCs w:val="15"/>
+                <w:rtl/>
+                <w:lang w:bidi="fa-IR"/>
+              </w:rPr>
+              <w:t xml:space="preserve"> ،</w:t>
+            </w:r>
+            <w:r>
+              <w:rPr>
+                <w:rFonts w:asciiTheme="majorBidi" w:hAnsiTheme="majorBidi" w:cstheme="majorBidi"/>
+                <w:sz w:val="15"/>
+                <w:szCs w:val="15"/>
+                <w:rtl/>
+                <w:lang w:bidi="fa-IR"/>
+              </w:rPr>
+              <w:t xml:space="preserve"> ۰۵/۱۵</w:t>
+            </w:r>
+            <w:proofErr w:type="gramStart"/>
+            <w:r>
+              <w:rPr>
+                <w:rFonts w:asciiTheme="majorBidi" w:hAnsiTheme="majorBidi" w:cstheme="majorBidi"/>
+                <w:sz w:val="15"/>
+                <w:szCs w:val="15"/>
+                <w:rtl/>
+                <w:lang w:bidi="fa-IR"/>
+              </w:rPr>
+              <w:t>+</w:t>
+            </w:r>
+            <w:r>
+              <w:rPr>
+                <w:rFonts w:asciiTheme="majorBidi" w:hAnsiTheme="majorBidi" w:cstheme="majorBidi"/>
+                <w:sz w:val="15"/>
+                <w:szCs w:val="15"/>
+                <w:lang w:bidi="fa-IR"/>
+              </w:rPr>
+              <w:t>[</w:t>
+            </w:r>
+            <w:proofErr w:type="gramEnd"/>
+            <w:r>
+              <w:rPr>
+                <w:rFonts w:asciiTheme="majorBidi" w:hAnsiTheme="majorBidi" w:cstheme="majorBidi" w:hint="cs"/>
+                <w:sz w:val="15"/>
+                <w:szCs w:val="15"/>
+                <w:rtl/>
+                <w:lang w:bidi="fa-IR"/>
+              </w:rPr>
+              <w:t>،</w:t>
+            </w:r>
+            <w:r>
+              <w:rPr>
+                <w:rFonts w:asciiTheme="majorBidi" w:hAnsiTheme="majorBidi" w:cstheme="majorBidi"/>
+                <w:sz w:val="15"/>
+                <w:szCs w:val="15"/>
+                <w:rtl/>
+                <w:lang w:bidi="fa-IR"/>
+              </w:rPr>
+              <w:t xml:space="preserve"> ۵۳/۰-</w:t>
+            </w:r>
+            <w:r>
+              <w:rPr>
+                <w:rFonts w:asciiTheme="majorBidi" w:hAnsiTheme="majorBidi" w:cstheme="majorBidi" w:hint="cs"/>
+                <w:sz w:val="15"/>
+                <w:szCs w:val="15"/>
+                <w:rtl/>
+                <w:lang w:bidi="fa-IR"/>
+              </w:rPr>
+              <w:t xml:space="preserve"> ،</w:t>
+            </w:r>
+            <w:r>
+              <w:rPr>
+                <w:rFonts w:asciiTheme="majorBidi" w:hAnsiTheme="majorBidi" w:cstheme="majorBidi"/>
+                <w:sz w:val="15"/>
+                <w:szCs w:val="15"/>
+                <w:rtl/>
+                <w:lang w:bidi="fa-IR"/>
+              </w:rPr>
+              <w:t xml:space="preserve"> ۵۰/۵</w:t>
             </w:r>
           </w:p>
         </w:tc>
@@ -2071,19 +2293,18 @@
         </w:trPr>
         <w:tc>
           <w:tcPr>
-            <w:tcW w:w="2350" w:type="dxa"/>
+            <w:tcW w:w="2087" w:type="dxa"/>
             <w:vAlign w:val="center"/>
           </w:tcPr>
           <w:p>
             <w:pPr>
-              <w:bidi/>
               <w:jc w:val="center"/>
             </w:pPr>
             <w:r>
               <w:rPr>
+                <w:rFonts w:hint="cs"/>
                 <w:sz w:val="15"/>
                 <w:szCs w:val="15"/>
-                <w:rFonts w:hint="cs"/>
                 <w:rtl/>
               </w:rPr>
               <w:t xml:space="preserve">قطرِ دیسک (خودسازگاری): MAE و بایاس </w:t>
@@ -2093,26 +2314,47 @@
                 <w:sz w:val="15"/>
                 <w:szCs w:val="15"/>
               </w:rPr>
-              <w:t xml:space="preserve">(n=۹۱)</w:t>
+              <w:t>(n=۹۱)</w:t>
             </w:r>
           </w:p>
         </w:tc>
         <w:tc>
           <w:tcPr>
-            <w:tcW w:w="2250" w:type="dxa"/>
+            <w:tcW w:w="2513" w:type="dxa"/>
             <w:vAlign w:val="center"/>
           </w:tcPr>
           <w:p>
             <w:pPr>
-              <w:bidi/>
               <w:jc w:val="center"/>
+              <w:rPr>
+                <w:rFonts w:hint="cs"/>
+                <w:lang w:bidi="fa-IR"/>
+              </w:rPr>
             </w:pPr>
             <w:r>
               <w:rPr>
                 <w:sz w:val="15"/>
                 <w:szCs w:val="15"/>
               </w:rPr>
-              <w:t xml:space="preserve">۰٫۱۷ / ۰٫۰۰ mm</w:t>
+              <w:t>mm</w:t>
+            </w:r>
+            <w:r>
+              <w:rPr>
+                <w:rFonts w:hint="cs"/>
+                <w:sz w:val="15"/>
+                <w:szCs w:val="15"/>
+                <w:rtl/>
+              </w:rPr>
+              <w:t xml:space="preserve"> </w:t>
+            </w:r>
+            <w:r>
+              <w:rPr>
+                <w:rFonts w:hint="cs"/>
+                <w:sz w:val="15"/>
+                <w:szCs w:val="15"/>
+                <w:rtl/>
+              </w:rPr>
+              <w:t>۰۰/۰ ، ۱۷/۰</w:t>
             </w:r>
           </w:p>
         </w:tc>
@@ -2125,38 +2367,34 @@
       </w:pPr>
       <w:r>
         <w:rPr>
-          <w:b/>
-          <w:bCs/>
           <w:rFonts w:hint="cs"/>
           <w:rtl/>
         </w:rPr>
-        <w:t xml:space="preserve">بحث</w:t>
+        <w:t>بحث</w:t>
       </w:r>
     </w:p>
     <w:p>
       <w:pPr>
         <w:pStyle w:val="Heading2"/>
-      </w:pPr>
-      <w:r>
-        <w:rPr>
-          <w:b/>
-          <w:bCs/>
-          <w:rFonts w:hint="cs"/>
-          <w:rtl/>
-        </w:rPr>
-        <w:t xml:space="preserve">مقایسه‌ی طراحی‌های پذیرفته‌شده در برابر ردشده</w:t>
-      </w:r>
-    </w:p>
-    <w:p>
-      <w:pPr>
-        <w:pStyle w:val="Paragraph"/>
       </w:pPr>
       <w:r>
         <w:rPr>
           <w:rFonts w:hint="cs"/>
           <w:rtl/>
         </w:rPr>
-        <w:t xml:space="preserve">تصمیم‌های نهاییِ این پایپ‌لاین از آزمایشِ تجربیِ مقایسه‌ای به‌دست آمده‌اند، نه از اولین ایده. جدول ۳ مهم‌ترین طراحی‌های ردشده، دلیلِ ردشدن هرکدام، و طراحیِ نهاییِ جایگزین را خلاصه می‌کند؛ این رد‌شدن‌ها خودشان محتوای علمیِ معتبری‌اند.</w:t>
+        <w:t>مقایسه‌ی طراحی‌های پذیرفته‌شده در برابر ردشده</w:t>
+      </w:r>
+    </w:p>
+    <w:p>
+      <w:pPr>
+        <w:pStyle w:val="Paragraph"/>
+      </w:pPr>
+      <w:r>
+        <w:rPr>
+          <w:rFonts w:hint="cs"/>
+          <w:rtl/>
+        </w:rPr>
+        <w:t>تصمیم‌های نهاییِ این پایپ‌لاین از آزمایشِ تجربیِ مقایسه‌ای به‌دست آمده‌اند، نه از اولین ایده. جدول ۳ مهم‌ترین طراحی‌های ردشده، دلیلِ ردشدن هرکدام، و طراحیِ نهاییِ جایگزین را خلاصه می‌کند؛ این رد‌شدن‌ها خودشان محتوای علمیِ معتبری‌اند.</w:t>
       </w:r>
     </w:p>
     <w:p>
@@ -2174,13 +2412,21 @@
     <w:p>
       <w:pPr>
         <w:pStyle w:val="TableTitle"/>
+        <w:rPr>
+          <w:rtl/>
+        </w:rPr>
+      </w:pPr>
+    </w:p>
+    <w:p>
+      <w:pPr>
+        <w:pStyle w:val="TableTitle"/>
       </w:pPr>
       <w:r>
         <w:rPr>
           <w:rFonts w:hint="cs"/>
           <w:rtl/>
         </w:rPr>
-        <w:t xml:space="preserve">جدول ۳: مقایسه‌ی طراحی‌های پذیرفته‌شده در برابر ردشده به تفکیک ماژول (خلاصه‌شده از تاریخچه‌ی توسعه).</w:t>
+        <w:t>جدول ۳: مقایسه‌ی طراحی‌های پذیرفته‌شده در برابر ردشده به تفکیک ماژول (خلاصه‌شده از تاریخچه‌ی توسعه).</w:t>
       </w:r>
     </w:p>
     <w:tbl>
@@ -2216,19 +2462,18 @@
           </w:tcPr>
           <w:p>
             <w:pPr>
-              <w:bidi/>
               <w:jc w:val="center"/>
             </w:pPr>
             <w:r>
               <w:rPr>
+                <w:rFonts w:hint="cs"/>
                 <w:b/>
                 <w:bCs/>
                 <w:sz w:val="15"/>
                 <w:szCs w:val="15"/>
-                <w:rFonts w:hint="cs"/>
                 <w:rtl/>
               </w:rPr>
-              <w:t xml:space="preserve">ماژول</w:t>
+              <w:t>ماژول</w:t>
             </w:r>
           </w:p>
         </w:tc>
@@ -2240,19 +2485,18 @@
           </w:tcPr>
           <w:p>
             <w:pPr>
-              <w:bidi/>
               <w:jc w:val="center"/>
             </w:pPr>
             <w:r>
               <w:rPr>
+                <w:rFonts w:hint="cs"/>
                 <w:b/>
                 <w:bCs/>
                 <w:sz w:val="15"/>
                 <w:szCs w:val="15"/>
-                <w:rFonts w:hint="cs"/>
                 <w:rtl/>
               </w:rPr>
-              <w:t xml:space="preserve">طراحی ردشده</w:t>
+              <w:t>طراحی ردشده</w:t>
             </w:r>
           </w:p>
         </w:tc>
@@ -2264,19 +2508,18 @@
           </w:tcPr>
           <w:p>
             <w:pPr>
-              <w:bidi/>
               <w:jc w:val="center"/>
             </w:pPr>
             <w:r>
               <w:rPr>
+                <w:rFonts w:hint="cs"/>
                 <w:b/>
                 <w:bCs/>
                 <w:sz w:val="15"/>
                 <w:szCs w:val="15"/>
-                <w:rFonts w:hint="cs"/>
                 <w:rtl/>
               </w:rPr>
-              <w:t xml:space="preserve">دلیل رد</w:t>
+              <w:t>دلیل رد</w:t>
             </w:r>
           </w:p>
         </w:tc>
@@ -2288,19 +2531,18 @@
           </w:tcPr>
           <w:p>
             <w:pPr>
-              <w:bidi/>
               <w:jc w:val="center"/>
             </w:pPr>
             <w:r>
               <w:rPr>
+                <w:rFonts w:hint="cs"/>
                 <w:b/>
                 <w:bCs/>
                 <w:sz w:val="15"/>
                 <w:szCs w:val="15"/>
-                <w:rFonts w:hint="cs"/>
                 <w:rtl/>
               </w:rPr>
-              <w:t xml:space="preserve">طراحی نهایی</w:t>
+              <w:t>طراحی نهایی</w:t>
             </w:r>
           </w:p>
         </w:tc>
@@ -2316,17 +2558,16 @@
           </w:tcPr>
           <w:p>
             <w:pPr>
-              <w:bidi/>
               <w:jc w:val="center"/>
             </w:pPr>
             <w:r>
               <w:rPr>
+                <w:rFonts w:hint="cs"/>
                 <w:sz w:val="15"/>
                 <w:szCs w:val="15"/>
-                <w:rFonts w:hint="cs"/>
                 <w:rtl/>
               </w:rPr>
-              <w:t xml:space="preserve">تشخیص پتری</w:t>
+              <w:t>تشخیص پتری</w:t>
             </w:r>
           </w:p>
         </w:tc>
@@ -2337,17 +2578,16 @@
           </w:tcPr>
           <w:p>
             <w:pPr>
-              <w:bidi/>
               <w:jc w:val="center"/>
             </w:pPr>
             <w:r>
               <w:rPr>
+                <w:rFonts w:hint="cs"/>
                 <w:sz w:val="15"/>
                 <w:szCs w:val="15"/>
-                <w:rFonts w:hint="cs"/>
                 <w:rtl/>
               </w:rPr>
-              <w:t xml:space="preserve">شکستنِ پتری با واترشد (Watershed-splitting)</w:t>
+              <w:t>شکستنِ پتری با واترشد (Watershed-splitting)</w:t>
             </w:r>
           </w:p>
         </w:tc>
@@ -2358,17 +2598,16 @@
           </w:tcPr>
           <w:p>
             <w:pPr>
-              <w:bidi/>
               <w:jc w:val="center"/>
             </w:pPr>
             <w:r>
               <w:rPr>
+                <w:rFonts w:hint="cs"/>
                 <w:sz w:val="15"/>
                 <w:szCs w:val="15"/>
-                <w:rFonts w:hint="cs"/>
                 <w:rtl/>
               </w:rPr>
-              <w:t xml:space="preserve">قله‌های کاذبِ تبدیل فاصله روی پتری‌های سالم—به‌ویژه مربعی—ظرفِ کامل را به قطعاتِ کوچک‌تر می‌شکست</w:t>
+              <w:t>قله‌های کاذبِ تبدیل فاصله روی پتری‌های سالم—به‌ویژه مربعی—ظرفِ کامل را به قطعاتِ کوچک‌تر می‌شکست</w:t>
             </w:r>
           </w:p>
         </w:tc>
@@ -2379,17 +2618,16 @@
           </w:tcPr>
           <w:p>
             <w:pPr>
-              <w:bidi/>
               <w:jc w:val="center"/>
             </w:pPr>
             <w:r>
               <w:rPr>
+                <w:rFonts w:hint="cs"/>
                 <w:sz w:val="15"/>
                 <w:szCs w:val="15"/>
-                <w:rFonts w:hint="cs"/>
                 <w:rtl/>
               </w:rPr>
-              <w:t xml:space="preserve">سگمنتیشن ناحیه‌ای Multi-Otsu؛ هاف فقط تاییدکننده</w:t>
+              <w:t>سگمنتیشن ناحیه‌ای Multi-Otsu؛ هاف فقط تاییدکننده</w:t>
             </w:r>
           </w:p>
         </w:tc>
@@ -2405,17 +2643,16 @@
           </w:tcPr>
           <w:p>
             <w:pPr>
-              <w:bidi/>
               <w:jc w:val="center"/>
             </w:pPr>
             <w:r>
               <w:rPr>
+                <w:rFonts w:hint="cs"/>
                 <w:sz w:val="15"/>
                 <w:szCs w:val="15"/>
-                <w:rFonts w:hint="cs"/>
                 <w:rtl/>
               </w:rPr>
-              <w:t xml:space="preserve">تشخیص دیسک</w:t>
+              <w:t>تشخیص دیسک</w:t>
             </w:r>
           </w:p>
         </w:tc>
@@ -2426,17 +2663,16 @@
           </w:tcPr>
           <w:p>
             <w:pPr>
-              <w:bidi/>
               <w:jc w:val="center"/>
             </w:pPr>
             <w:r>
               <w:rPr>
+                <w:rFonts w:hint="cs"/>
                 <w:sz w:val="15"/>
                 <w:szCs w:val="15"/>
-                <w:rFonts w:hint="cs"/>
                 <w:rtl/>
               </w:rPr>
-              <w:t xml:space="preserve">ادغامِ سه‌شاخه‌ای (DT مستقل) + گیتِ سخت/دودویی + تاییدِ ظاهریِ مستقل</w:t>
+              <w:t>ادغامِ سه‌شاخه‌ای (DT مستقل) + گیتِ سخت/دودویی + تاییدِ ظاهریِ مستقل</w:t>
             </w:r>
           </w:p>
         </w:tc>
@@ -2447,17 +2683,16 @@
           </w:tcPr>
           <w:p>
             <w:pPr>
-              <w:bidi/>
               <w:jc w:val="center"/>
             </w:pPr>
             <w:r>
               <w:rPr>
+                <w:rFonts w:hint="cs"/>
                 <w:sz w:val="15"/>
                 <w:szCs w:val="15"/>
-                <w:rFonts w:hint="cs"/>
                 <w:rtl/>
               </w:rPr>
-              <w:t xml:space="preserve">DT مستقل ناسازگار با مقیاس بود؛ گیت و تاییدِ ظاهری کاندیدهای معتبر را کاذب رد می‌کردند</w:t>
+              <w:t>DT مستقل ناسازگار با مقیاس بود؛ گیت و تاییدِ ظاهری کاندیدهای معتبر را کاذب رد می‌کردند</w:t>
             </w:r>
           </w:p>
         </w:tc>
@@ -2468,17 +2703,16 @@
           </w:tcPr>
           <w:p>
             <w:pPr>
-              <w:bidi/>
               <w:jc w:val="center"/>
             </w:pPr>
             <w:r>
               <w:rPr>
+                <w:rFonts w:hint="cs"/>
                 <w:sz w:val="15"/>
                 <w:szCs w:val="15"/>
-                <w:rFonts w:hint="cs"/>
                 <w:rtl/>
               </w:rPr>
-              <w:t xml:space="preserve">ادغامِ دوشاخه‌ای (DT فقط ابزار)؛ تصمیم فقط بر پایه‌ی امتیازِ پیوسته</w:t>
+              <w:t>ادغامِ دوشاخه‌ای (DT فقط ابزار)؛ تصمیم فقط بر پایه‌ی امتیازِ پیوسته</w:t>
             </w:r>
           </w:p>
         </w:tc>
@@ -2494,17 +2728,16 @@
           </w:tcPr>
           <w:p>
             <w:pPr>
-              <w:bidi/>
               <w:jc w:val="center"/>
             </w:pPr>
             <w:r>
               <w:rPr>
+                <w:rFonts w:hint="cs"/>
                 <w:sz w:val="15"/>
                 <w:szCs w:val="15"/>
-                <w:rFonts w:hint="cs"/>
                 <w:rtl/>
               </w:rPr>
-              <w:t xml:space="preserve">مرز هاله</w:t>
+              <w:t>مرز هاله</w:t>
             </w:r>
           </w:p>
         </w:tc>
@@ -2515,14 +2748,13 @@
           </w:tcPr>
           <w:p>
             <w:pPr>
-              <w:bidi/>
               <w:jc w:val="center"/>
             </w:pPr>
             <w:r>
               <w:rPr>
+                <w:rFonts w:hint="cs"/>
                 <w:sz w:val="15"/>
                 <w:szCs w:val="15"/>
-                <w:rFonts w:hint="cs"/>
                 <w:rtl/>
               </w:rPr>
               <w:t xml:space="preserve">گیتِ وجود/عدم‌وجود (۳ رویکرد) + GrabCut </w:t>
@@ -2532,13 +2764,13 @@
                 <w:sz w:val="15"/>
                 <w:szCs w:val="15"/>
               </w:rPr>
-              <w:t xml:space="preserve">[10]</w:t>
+              <w:t>[10]</w:t>
             </w:r>
             <w:r>
               <w:rPr>
+                <w:rFonts w:hint="cs"/>
                 <w:sz w:val="15"/>
                 <w:szCs w:val="15"/>
-                <w:rFonts w:hint="cs"/>
                 <w:rtl/>
               </w:rPr>
               <w:t xml:space="preserve"> + برازشِ سیگموئید</w:t>
@@ -2552,17 +2784,16 @@
           </w:tcPr>
           <w:p>
             <w:pPr>
-              <w:bidi/>
               <w:jc w:val="center"/>
             </w:pPr>
             <w:r>
               <w:rPr>
+                <w:rFonts w:hint="cs"/>
                 <w:sz w:val="15"/>
                 <w:szCs w:val="15"/>
-                <w:rFonts w:hint="cs"/>
                 <w:rtl/>
               </w:rPr>
-              <w:t xml:space="preserve">یا هاله‌های واقعی را حذف/نویز را می‌پذیرفتند، یا بدونِ لبه‌ی قوی نشتی/تیغه‌ی کاذب تولید می‌کردند</w:t>
+              <w:t>یا هاله‌های واقعی را حذف/نویز را می‌پذیرفتند، یا بدونِ لبه‌ی قوی نشتی/تیغه‌ی کاذب تولید می‌کردند</w:t>
             </w:r>
           </w:p>
         </w:tc>
@@ -2573,17 +2804,16 @@
           </w:tcPr>
           <w:p>
             <w:pPr>
-              <w:bidi/>
               <w:jc w:val="center"/>
             </w:pPr>
             <w:r>
               <w:rPr>
+                <w:rFonts w:hint="cs"/>
                 <w:sz w:val="15"/>
                 <w:szCs w:val="15"/>
-                <w:rFonts w:hint="cs"/>
                 <w:rtl/>
               </w:rPr>
-              <w:t xml:space="preserve">حذفِ گیتِ وجود؛ پروفایلِ شعاعیِ تجمیعی + همگراییِ دائمی + بسطِ per-angle</w:t>
+              <w:t>حذفِ گیتِ وجود؛ پروفایلِ شعاعیِ تجمیعی + همگراییِ دائمی + بسطِ per-angle</w:t>
             </w:r>
           </w:p>
         </w:tc>
@@ -2599,17 +2829,16 @@
           </w:tcPr>
           <w:p>
             <w:pPr>
-              <w:bidi/>
               <w:jc w:val="center"/>
             </w:pPr>
             <w:r>
               <w:rPr>
+                <w:rFonts w:hint="cs"/>
                 <w:sz w:val="15"/>
                 <w:szCs w:val="15"/>
-                <w:rFonts w:hint="cs"/>
                 <w:rtl/>
               </w:rPr>
-              <w:t xml:space="preserve">مرز هاله</w:t>
+              <w:t>مرز هاله</w:t>
             </w:r>
           </w:p>
         </w:tc>
@@ -2620,17 +2849,16 @@
           </w:tcPr>
           <w:p>
             <w:pPr>
-              <w:bidi/>
               <w:jc w:val="center"/>
             </w:pPr>
             <w:r>
               <w:rPr>
+                <w:rFonts w:hint="cs"/>
                 <w:sz w:val="15"/>
                 <w:szCs w:val="15"/>
-                <w:rFonts w:hint="cs"/>
                 <w:rtl/>
               </w:rPr>
-              <w:t xml:space="preserve">پیشنهادِ کاربر: میانه‌ی ۳۶ کمانِ ده‌درجه + رشدِ دایره + سقفِ EUCAST</w:t>
+              <w:t>پیشنهادِ کاربر: میانه‌ی ۳۶ کمانِ ده‌درجه + رشدِ دایره + سقفِ EUCAST</w:t>
             </w:r>
           </w:p>
         </w:tc>
@@ -2641,17 +2869,16 @@
           </w:tcPr>
           <w:p>
             <w:pPr>
-              <w:bidi/>
               <w:jc w:val="center"/>
             </w:pPr>
             <w:r>
               <w:rPr>
+                <w:rFonts w:hint="cs"/>
                 <w:sz w:val="15"/>
                 <w:szCs w:val="15"/>
-                <w:rFonts w:hint="cs"/>
                 <w:rtl/>
               </w:rPr>
-              <w:t xml:space="preserve">نویزِ per-arc بالاتر از پروفایلِ تجمیعی؛ استانداردِ عمومیِ فاصله‌ی بین‌دیسکی در EUCAST یافت نشد</w:t>
+              <w:t>نویزِ per-arc بالاتر از پروفایلِ تجمیعی؛ استانداردِ عمومیِ فاصله‌ی بین‌دیسکی در EUCAST یافت نشد</w:t>
             </w:r>
           </w:p>
         </w:tc>
@@ -2662,17 +2889,16 @@
           </w:tcPr>
           <w:p>
             <w:pPr>
-              <w:bidi/>
               <w:jc w:val="center"/>
             </w:pPr>
             <w:r>
               <w:rPr>
+                <w:rFonts w:hint="cs"/>
                 <w:sz w:val="15"/>
                 <w:szCs w:val="15"/>
-                <w:rFonts w:hint="cs"/>
                 <w:rtl/>
               </w:rPr>
-              <w:t xml:space="preserve">سقف‌های هندسیِ مخصوصِ همان تصویر (Voronoi+لبه‌ی پتری) دقیق‌تر بودند</w:t>
+              <w:t>سقف‌های هندسیِ مخصوصِ همان تصویر (Voronoi+لبه‌ی پتری) دقیق‌تر بودند</w:t>
             </w:r>
           </w:p>
         </w:tc>
@@ -2685,7 +2911,7 @@
           <w:type w:val="continuous"/>
           <w:pgSz w:w="11906" w:h="16838" w:code="9"/>
           <w:pgMar w:top="1418" w:right="1134" w:bottom="1418" w:left="1134" w:header="851" w:footer="567" w:gutter="0"/>
-          <w:cols w:num="1"/>
+          <w:cols w:space="720"/>
           <w:bidi/>
           <w:rtlGutter/>
         </w:sectPr>
@@ -2697,12 +2923,10 @@
       </w:pPr>
       <w:r>
         <w:rPr>
-          <w:b/>
-          <w:bCs/>
           <w:rFonts w:hint="cs"/>
           <w:rtl/>
         </w:rPr>
-        <w:t xml:space="preserve">همخوانی با استاندارد خواندن EUCAST</w:t>
+        <w:t>همخوانی با استاندارد خواندن EUCAST</w:t>
       </w:r>
     </w:p>
     <w:p>
@@ -2717,7 +2941,7 @@
         <w:t xml:space="preserve">متنِ رسمیِ EUCAST </w:t>
       </w:r>
       <w:r>
-        <w:t xml:space="preserve">[7]</w:t>
+        <w:t>[7]</w:t>
       </w:r>
       <w:r>
         <w:rPr>
@@ -2733,12 +2957,10 @@
       </w:pPr>
       <w:r>
         <w:rPr>
-          <w:b/>
-          <w:bCs/>
           <w:rFonts w:hint="cs"/>
           <w:rtl/>
         </w:rPr>
-        <w:t xml:space="preserve">محدودیت‌ها</w:t>
+        <w:t>محدودیت‌ها</w:t>
       </w:r>
     </w:p>
     <w:p>
@@ -2750,21 +2972,26 @@
           <w:rFonts w:hint="cs"/>
           <w:rtl/>
         </w:rPr>
-        <w:t xml:space="preserve">حجمِ نمونه‌ی ارزیابیِ کمّی (۱۱ عکس، ۹۳ دیسک) محدود است—توصیفِ اولیه‌ی دقت، نه اعتبارسنجیِ قطعی. خطایِ قطرِ هاله متوسط است (MAE=۵٫۵mm، عمدتاً نشتِ سیگنال و vignetting)، و آستانه‌ی گیتِ حضور Recall را به‌نفعِ Precision معامله می‌کند. ماژولِ تشخیصِ پتری روی یک عکسِ خاص همچنان دچارِ تقسیمِ کاذب است (عمداً رفع‌نشده)؛ ماژولِ حباب کارِ در حالِ انجام است؛ طبقه‌بندیِ EUCAST پیاده‌سازی نشده؛ و جزئیاتِ ترکیبِ نمونه‌ها مستند نشده‌اند.</w:t>
-      </w:r>
-    </w:p>
-    <w:p>
-      <w:pPr>
-        <w:pStyle w:val="Heading1"/>
-      </w:pPr>
+        <w:t xml:space="preserve">حجمِ نمونه‌ی ارزیابیِ کمّی (۱۱ عکس، ۹۳ دیسک) محدود است—توصیفِ اولیه‌ی دقت، نه اعتبارسنجیِ قطعی. خطایِ قطرِ هاله متوسط است (MAE=۵٫۵mm، عمدتاً نشتِ سیگنال و vignetting)، و آستانه‌ی گیتِ حضور Recall را به‌نفعِ Precision معامله می‌کند. ماژولِ تشخیصِ پتری روی یک عکسِ خاص همچنان دچارِ تقسیمِ کاذب است (عمداً رفع‌نشده)؛ ماژولِ حباب کارِ در حالِ انجام </w:t>
+      </w:r>
       <w:r>
         <w:rPr>
-          <w:b/>
-          <w:bCs/>
           <w:rFonts w:hint="cs"/>
           <w:rtl/>
         </w:rPr>
-        <w:t xml:space="preserve">نتیجه‌گیری</w:t>
+        <w:t>است؛ طبقه‌بندیِ EUCAST پیاده‌سازی نشده؛ و جزئیاتِ ترکیبِ نمونه‌ها مستند نشده‌اند.</w:t>
+      </w:r>
+    </w:p>
+    <w:p>
+      <w:pPr>
+        <w:pStyle w:val="Heading1"/>
+      </w:pPr>
+      <w:r>
+        <w:rPr>
+          <w:rFonts w:hint="cs"/>
+          <w:rtl/>
+        </w:rPr>
+        <w:t>نتیجه‌گیری</w:t>
       </w:r>
     </w:p>
     <w:p>
@@ -2779,7 +3006,7 @@
         <w:t xml:space="preserve">در این مقاله یک پایپ‌لاینِ کاملاً کلاسیکِ بینایی ماشین برای تشخیص و اندازه‌گیریِ خودکارِ آنتی‌بایوگرامِ دیسک-دیفیوژن از روی تصویرِ تلفن‌همراه ارائه شد که ظرفِ پتری، دیسک‌های آنتی‌بیوتیک، مرزِ هاله‌ی بازدارندگی و رخدادهای غیرعادیِ داخلِ هاله را تشخیص می‌دهد؛ طراحیِ نهایی حاصلِ چندین دورِ آزمایشِ تجربیِ مقایسه‌ای است (جدول ۳)، و معیارِ نهاییِ مرزِ هاله با تعریفِ رسمیِ EUCAST هم‌راستاست. ارزیابیِ کمّی در برابرِ حقیقتِ زمینیِ کارشناسی (بخش ۳-۱) F1=۰٫۹۸۴ برایِ تشخیصِ دیسک و MAE=۵٫۵۰mm برایِ قطرِ هاله نشان داد، با بازتولیدِ مستقل روی سیستمی مجزا. کارِ آینده شاملِ بزرگ‌ترکردنِ دیتاستِ مرجع، طبقه‌بندیِ حساس/متوسط/مقاوم بر اساسِ EUCAST، بهبودِ توازنِ </w:t>
       </w:r>
       <w:r>
-        <w:t xml:space="preserve">Recall/Precision</w:t>
+        <w:t>Recall/Precision</w:t>
       </w:r>
       <w:r>
         <w:rPr>
@@ -2807,38 +3034,50 @@
       </w:pPr>
       <w:r>
         <w:rPr>
-          <w:b/>
-          <w:bCs/>
           <w:rFonts w:hint="cs"/>
           <w:rtl/>
         </w:rPr>
-        <w:t xml:space="preserve">قدردانی</w:t>
+        <w:t>مراجع</w:t>
       </w:r>
     </w:p>
     <w:p>
       <w:pPr>
-        <w:pStyle w:val="Paragraph"/>
-      </w:pPr>
-      <w:r>
-        <w:rPr>
-          <w:rFonts w:hint="cs"/>
-          <w:rtl/>
-        </w:rPr>
-        <w:t xml:space="preserve">[PLACEHOLDER: در صورت وجود حمایتِ مالی، آزمایشگاهی یا سازمانی، در این بخش ذکر شود.]</w:t>
+        <w:pStyle w:val="References"/>
+      </w:pPr>
+      <w:r>
+        <w:t xml:space="preserve">A. </w:t>
+      </w:r>
+      <w:proofErr w:type="spellStart"/>
+      <w:r>
+        <w:t>Gavoille</w:t>
+      </w:r>
+      <w:proofErr w:type="spellEnd"/>
+      <w:r>
+        <w:t xml:space="preserve">, B. Bardy, and A. </w:t>
+      </w:r>
+      <w:proofErr w:type="spellStart"/>
+      <w:r>
+        <w:t>Andremont</w:t>
+      </w:r>
+      <w:proofErr w:type="spellEnd"/>
+      <w:r>
+        <w:t xml:space="preserve">, “Measurement of inhibition zone diameter in disk susceptibility tests by computerized image analysis,” </w:t>
+      </w:r>
+      <w:proofErr w:type="spellStart"/>
+      <w:r>
+        <w:t>Comput</w:t>
+      </w:r>
+      <w:proofErr w:type="spellEnd"/>
+      <w:r>
+        <w:t>. Biol. Med., vol. 24, no. 3, pp. 179–188, 1994.</w:t>
       </w:r>
     </w:p>
     <w:p>
       <w:pPr>
-        <w:pStyle w:val="Heading"/>
-      </w:pPr>
-      <w:r>
-        <w:rPr>
-          <w:b/>
-          <w:bCs/>
-          <w:rFonts w:hint="cs"/>
-          <w:rtl/>
-        </w:rPr>
-        <w:t xml:space="preserve">مراجع</w:t>
+        <w:pStyle w:val="References"/>
+      </w:pPr>
+      <w:r>
+        <w:t>H. S. Bhargav et al., “Measurement of the zone of inhibition of an antibiotic,” in Proc. IEEE 6th Int. Conf. Advanced Computing (IACC), 2016, pp. 409–414.</w:t>
       </w:r>
     </w:p>
     <w:p>
@@ -2846,7 +3085,31 @@
         <w:pStyle w:val="References"/>
       </w:pPr>
       <w:r>
-        <w:t xml:space="preserve">A. Gavoille, B. Bardy, and A. Andremont, “Measurement of inhibition zone diameter in disk susceptibility tests by computerized image analysis,” Comput. Biol. Med., vol. 24, no. 3, pp. 179–188, 1994.</w:t>
+        <w:t>C. A. Alonso et al., “</w:t>
+      </w:r>
+      <w:proofErr w:type="spellStart"/>
+      <w:r>
+        <w:t>AntibiogramJ</w:t>
+      </w:r>
+      <w:proofErr w:type="spellEnd"/>
+      <w:r>
+        <w:t xml:space="preserve">: A tool for </w:t>
+      </w:r>
+      <w:proofErr w:type="spellStart"/>
+      <w:r>
+        <w:t>analysing</w:t>
+      </w:r>
+      <w:proofErr w:type="spellEnd"/>
+      <w:r>
+        <w:t xml:space="preserve"> images from disk diffusion tests,” </w:t>
+      </w:r>
+      <w:proofErr w:type="spellStart"/>
+      <w:r>
+        <w:t>Comput</w:t>
+      </w:r>
+      <w:proofErr w:type="spellEnd"/>
+      <w:r>
+        <w:t>. Methods Programs Biomed., vol. 143, pp. 159–169, 2017.</w:t>
       </w:r>
     </w:p>
     <w:p>
@@ -2854,7 +3117,7 @@
         <w:pStyle w:val="References"/>
       </w:pPr>
       <w:r>
-        <w:t xml:space="preserve">H. S. Bhargav et al., “Measurement of the zone of inhibition of an antibiotic,” in Proc. IEEE 6th Int. Conf. Advanced Computing (IACC), 2016, pp. 409–414.</w:t>
+        <w:t>B. K. Priya et al., “Automatic inhibition zone diameter measurement for disc diffusion test using image segmentation,” IETE J. Res., vol. 69, no. 8, pp. 5708–5725, 2023.</w:t>
       </w:r>
     </w:p>
     <w:p>
@@ -2862,7 +3125,7 @@
         <w:pStyle w:val="References"/>
       </w:pPr>
       <w:r>
-        <w:t xml:space="preserve">C. A. Alonso et al., “AntibiogramJ: A tool for analysing images from disk diffusion tests,” Comput. Methods Programs Biomed., vol. 143, pp. 159–169, 2017.</w:t>
+        <w:t>M. Pascucci et al., “AI-based mobile application to fight antibiotic resistance,” Nat. Commun., vol. 12, art. no. 1173, 2021.</w:t>
       </w:r>
     </w:p>
     <w:p>
@@ -2870,7 +3133,15 @@
         <w:pStyle w:val="References"/>
       </w:pPr>
       <w:r>
-        <w:t xml:space="preserve">B. K. Priya et al., “Automatic inhibition zone diameter measurement for disc diffusion test using image segmentation,” IETE J. Res., vol. 69, no. 8, pp. 5708–5725, 2023.</w:t>
+        <w:t xml:space="preserve">E. Gullu, S. Bora, and B. </w:t>
+      </w:r>
+      <w:proofErr w:type="spellStart"/>
+      <w:r>
+        <w:t>Beynek</w:t>
+      </w:r>
+      <w:proofErr w:type="spellEnd"/>
+      <w:r>
+        <w:t>, “Exploiting image processing and AI techniques for the determination of antimicrobial susceptibility,” Appl. Sci., vol. 14, no. 9, art. no. 3950, 2024.</w:t>
       </w:r>
     </w:p>
     <w:p>
@@ -2878,7 +3149,7 @@
         <w:pStyle w:val="References"/>
       </w:pPr>
       <w:r>
-        <w:t xml:space="preserve">M. Pascucci et al., “AI-based mobile application to fight antibiotic resistance,” Nat. Commun., vol. 12, art. no. 1173, 2021.</w:t>
+        <w:t>European Committee on Antimicrobial Susceptibility Testing (EUCAST), Breakpoint Tables for Interpretation of MICs and Zone Diameters, version 16.0, 2026.</w:t>
       </w:r>
     </w:p>
     <w:p>
@@ -2886,7 +3157,7 @@
         <w:pStyle w:val="References"/>
       </w:pPr>
       <w:r>
-        <w:t xml:space="preserve">E. Gullu, S. Bora, and B. Beynek, “Exploiting image processing and AI techniques for the determination of antimicrobial susceptibility,” Appl. Sci., vol. 14, no. 9, art. no. 3950, 2024.</w:t>
+        <w:t>R. C. Gonzalez and R. E. Woods, Digital Image Processing, 4th ed. Pearson, 2018.</w:t>
       </w:r>
     </w:p>
     <w:p>
@@ -2894,7 +3165,15 @@
         <w:pStyle w:val="References"/>
       </w:pPr>
       <w:r>
-        <w:t xml:space="preserve">European Committee on Antimicrobial Susceptibility Testing (EUCAST), Breakpoint Tables for Interpretation of MICs and Zone Diameters, version 16.0, 2026.</w:t>
+        <w:t xml:space="preserve">N. Otsu, “A threshold selection method from gray-level histograms,” IEEE Trans. Syst., Man, </w:t>
+      </w:r>
+      <w:proofErr w:type="spellStart"/>
+      <w:r>
+        <w:t>Cybern</w:t>
+      </w:r>
+      <w:proofErr w:type="spellEnd"/>
+      <w:r>
+        <w:t>., vol. 9, no. 1, pp. 62–66, 1979.</w:t>
       </w:r>
     </w:p>
     <w:p>
@@ -2902,7 +3181,15 @@
         <w:pStyle w:val="References"/>
       </w:pPr>
       <w:r>
-        <w:t xml:space="preserve">R. C. Gonzalez and R. E. Woods, Digital Image Processing, 4th ed. Pearson, 2018.</w:t>
+        <w:t>C. Rother, V. Kolmogorov, and A. Blake, “‘</w:t>
+      </w:r>
+      <w:proofErr w:type="spellStart"/>
+      <w:r>
+        <w:t>GrabCut</w:t>
+      </w:r>
+      <w:proofErr w:type="spellEnd"/>
+      <w:r>
+        <w:t>’: Interactive foreground extraction using iterated graph cuts,” ACM Trans. Graph., vol. 23, no. 3, pp. 309–314, 2004.</w:t>
       </w:r>
     </w:p>
     <w:p>
@@ -2910,23 +3197,8 @@
         <w:pStyle w:val="References"/>
       </w:pPr>
       <w:r>
-        <w:t xml:space="preserve">N. Otsu, “A threshold selection method from gray-level histograms,” IEEE Trans. Syst., Man, Cybern., vol. 9, no. 1, pp. 62–66, 1979.</w:t>
-      </w:r>
-    </w:p>
-    <w:p>
-      <w:pPr>
-        <w:pStyle w:val="References"/>
-      </w:pPr>
-      <w:r>
-        <w:t xml:space="preserve">C. Rother, V. Kolmogorov, and A. Blake, “‘GrabCut’: Interactive foreground extraction using iterated graph cuts,” ACM Trans. Graph., vol. 23, no. 3, pp. 309–314, 2004.</w:t>
-      </w:r>
-    </w:p>
-    <w:p>
-      <w:pPr>
-        <w:pStyle w:val="References"/>
-      </w:pPr>
-      <w:r>
-        <w:t xml:space="preserve">J. M. Bland and D. G. Altman, “Statistical methods for assessing agreement between two methods of clinical measurement,” The Lancet, vol. 327, no. 8476, pp. 307–310, 1986.</w:t>
+        <w:lastRenderedPageBreak/>
+        <w:t>J. M. Bland and D. G. Altman, “Statistical methods for assessing agreement between two methods of clinical measurement,” The Lancet, vol. 327, no. 8476, pp. 307–310, 1986.</w:t>
       </w:r>
     </w:p>
     <w:p>
@@ -2935,7 +3207,7 @@
           <w:type w:val="continuous"/>
           <w:pgSz w:w="11906" w:h="16838" w:code="9"/>
           <w:pgMar w:top="1418" w:right="1134" w:bottom="1418" w:left="1134" w:header="851" w:footer="567" w:gutter="0"/>
-          <w:cols w:num="1"/>
+          <w:cols w:space="720"/>
           <w:bidi/>
           <w:rtlGutter/>
         </w:sectPr>
@@ -2958,7 +3230,7 @@
 </file>
 
 <file path=word/endnotes.xml><?xml version="1.0" encoding="utf-8"?>
-<w:endnotes xmlns:wpc="http://schemas.microsoft.com/office/word/2010/wordprocessingCanvas" xmlns:cx="http://schemas.microsoft.com/office/drawing/2014/chartex" xmlns:cx1="http://schemas.microsoft.com/office/drawing/2015/9/8/chartex" xmlns:cx2="http://schemas.microsoft.com/office/drawing/2015/10/21/chartex" xmlns:cx3="http://schemas.microsoft.com/office/drawing/2016/5/9/chartex" xmlns:cx4="http://schemas.microsoft.com/office/drawing/2016/5/10/chartex" xmlns:cx5="http://schemas.microsoft.com/office/drawing/2016/5/11/chartex" xmlns:cx6="http://schemas.microsoft.com/office/drawing/2016/5/12/chartex" xmlns:cx7="http://schemas.microsoft.com/office/drawing/2016/5/13/chartex" xmlns:cx8="http://schemas.microsoft.com/office/drawing/2016/5/14/chartex" xmlns:mc="http://schemas.openxmlformats.org/markup-compatibility/2006" xmlns:aink="http://schemas.microsoft.com/office/drawing/2016/ink" xmlns:am3d="http://schemas.microsoft.com/office/drawing/2017/model3d" xmlns:o="urn:schemas-microsoft-com:office:office" xmlns:oel="http://schemas.microsoft.com/office/2019/extlst" xmlns:r="http://schemas.openxmlformats.org/officeDocument/2006/relationships" xmlns:m="http://schemas.openxmlformats.org/officeDocument/2006/math" xmlns:v="urn:schemas-microsoft-com:vml" xmlns:wp14="http://schemas.microsoft.com/office/word/2010/wordprocessingDrawing" xmlns:wp="http://schemas.openxmlformats.org/drawingml/2006/wordprocessingDrawing" xmlns:w10="urn:schemas-microsoft-com:office:word" xmlns:w="http://schemas.openxmlformats.org/wordprocessingml/2006/main" xmlns:w14="http://schemas.microsoft.com/office/word/2010/wordml" xmlns:w15="http://schemas.microsoft.com/office/word/2012/wordml" xmlns:w16cex="http://schemas.microsoft.com/office/word/2018/wordml/cex" xmlns:w16cid="http://schemas.microsoft.com/office/word/2016/wordml/cid" xmlns:w16="http://schemas.microsoft.com/office/word/2018/wordml" xmlns:w16du="http://schemas.microsoft.com/office/word/2023/wordml/word16du" xmlns:w16sdtdh="http://schemas.microsoft.com/office/word/2020/wordml/sdtdatahash" xmlns:w16se="http://schemas.microsoft.com/office/word/2015/wordml/symex" xmlns:wpg="http://schemas.microsoft.com/office/word/2010/wordprocessingGroup" xmlns:wpi="http://schemas.microsoft.com/office/word/2010/wordprocessingInk" xmlns:wne="http://schemas.microsoft.com/office/word/2006/wordml" xmlns:wps="http://schemas.microsoft.com/office/word/2010/wordprocessingShape" mc:Ignorable="w14 w15 w16se w16cid w16 w16cex w16sdtdh w16du wp14">
+<w:endnotes xmlns:wpc="http://schemas.microsoft.com/office/word/2010/wordprocessingCanvas" xmlns:cx="http://schemas.microsoft.com/office/drawing/2014/chartex" xmlns:cx1="http://schemas.microsoft.com/office/drawing/2015/9/8/chartex" xmlns:cx2="http://schemas.microsoft.com/office/drawing/2015/10/21/chartex" xmlns:cx3="http://schemas.microsoft.com/office/drawing/2016/5/9/chartex" xmlns:cx4="http://schemas.microsoft.com/office/drawing/2016/5/10/chartex" xmlns:cx5="http://schemas.microsoft.com/office/drawing/2016/5/11/chartex" xmlns:cx6="http://schemas.microsoft.com/office/drawing/2016/5/12/chartex" xmlns:cx7="http://schemas.microsoft.com/office/drawing/2016/5/13/chartex" xmlns:cx8="http://schemas.microsoft.com/office/drawing/2016/5/14/chartex" xmlns:mc="http://schemas.openxmlformats.org/markup-compatibility/2006" xmlns:aink="http://schemas.microsoft.com/office/drawing/2016/ink" xmlns:am3d="http://schemas.microsoft.com/office/drawing/2017/model3d" xmlns:o="urn:schemas-microsoft-com:office:office" xmlns:oel="http://schemas.microsoft.com/office/2019/extlst" xmlns:r="http://schemas.openxmlformats.org/officeDocument/2006/relationships" xmlns:m="http://schemas.openxmlformats.org/officeDocument/2006/math" xmlns:v="urn:schemas-microsoft-com:vml" xmlns:wp14="http://schemas.microsoft.com/office/word/2010/wordprocessingDrawing" xmlns:wp="http://schemas.openxmlformats.org/drawingml/2006/wordprocessingDrawing" xmlns:w10="urn:schemas-microsoft-com:office:word" xmlns:w="http://schemas.openxmlformats.org/wordprocessingml/2006/main" xmlns:w14="http://schemas.microsoft.com/office/word/2010/wordml" xmlns:w15="http://schemas.microsoft.com/office/word/2012/wordml" xmlns:w16cex="http://schemas.microsoft.com/office/word/2018/wordml/cex" xmlns:w16cid="http://schemas.microsoft.com/office/word/2016/wordml/cid" xmlns:w16="http://schemas.microsoft.com/office/word/2018/wordml" xmlns:w16du="http://schemas.microsoft.com/office/word/2023/wordml/word16du" xmlns:w16sdtdh="http://schemas.microsoft.com/office/word/2020/wordml/sdtdatahash" xmlns:w16sdtfl="http://schemas.microsoft.com/office/word/2024/wordml/sdtformatlock" xmlns:w16se="http://schemas.microsoft.com/office/word/2015/wordml/symex" xmlns:wpg="http://schemas.microsoft.com/office/word/2010/wordprocessingGroup" xmlns:wpi="http://schemas.microsoft.com/office/word/2010/wordprocessingInk" xmlns:wne="http://schemas.microsoft.com/office/word/2006/wordml" xmlns:wps="http://schemas.microsoft.com/office/word/2010/wordprocessingShape" mc:Ignorable="w14 w15 w16se w16cid w16 w16cex w16sdtdh w16sdtfl w16du wp14">
   <w:endnote w:type="separator" w:id="-1">
     <w:p>
       <w:r>
@@ -2978,69 +3250,8 @@
 </w:endnotes>
 </file>
 
-<file path=word/footer1.xml><?xml version="1.0" encoding="utf-8"?>
-<w:ftr xmlns:wpc="http://schemas.microsoft.com/office/word/2010/wordprocessingCanvas" xmlns:cx="http://schemas.microsoft.com/office/drawing/2014/chartex" xmlns:cx1="http://schemas.microsoft.com/office/drawing/2015/9/8/chartex" xmlns:cx2="http://schemas.microsoft.com/office/drawing/2015/10/21/chartex" xmlns:cx3="http://schemas.microsoft.com/office/drawing/2016/5/9/chartex" xmlns:cx4="http://schemas.microsoft.com/office/drawing/2016/5/10/chartex" xmlns:cx5="http://schemas.microsoft.com/office/drawing/2016/5/11/chartex" xmlns:cx6="http://schemas.microsoft.com/office/drawing/2016/5/12/chartex" xmlns:cx7="http://schemas.microsoft.com/office/drawing/2016/5/13/chartex" xmlns:cx8="http://schemas.microsoft.com/office/drawing/2016/5/14/chartex" xmlns:mc="http://schemas.openxmlformats.org/markup-compatibility/2006" xmlns:aink="http://schemas.microsoft.com/office/drawing/2016/ink" xmlns:am3d="http://schemas.microsoft.com/office/drawing/2017/model3d" xmlns:o="urn:schemas-microsoft-com:office:office" xmlns:oel="http://schemas.microsoft.com/office/2019/extlst" xmlns:r="http://schemas.openxmlformats.org/officeDocument/2006/relationships" xmlns:m="http://schemas.openxmlformats.org/officeDocument/2006/math" xmlns:v="urn:schemas-microsoft-com:vml" xmlns:wp14="http://schemas.microsoft.com/office/word/2010/wordprocessingDrawing" xmlns:wp="http://schemas.openxmlformats.org/drawingml/2006/wordprocessingDrawing" xmlns:w10="urn:schemas-microsoft-com:office:word" xmlns:w="http://schemas.openxmlformats.org/wordprocessingml/2006/main" xmlns:w14="http://schemas.microsoft.com/office/word/2010/wordml" xmlns:w15="http://schemas.microsoft.com/office/word/2012/wordml" xmlns:w16cex="http://schemas.microsoft.com/office/word/2018/wordml/cex" xmlns:w16cid="http://schemas.microsoft.com/office/word/2016/wordml/cid" xmlns:w16="http://schemas.microsoft.com/office/word/2018/wordml" xmlns:w16du="http://schemas.microsoft.com/office/word/2023/wordml/word16du" xmlns:w16sdtdh="http://schemas.microsoft.com/office/word/2020/wordml/sdtdatahash" xmlns:w16se="http://schemas.microsoft.com/office/word/2015/wordml/symex" xmlns:wpg="http://schemas.microsoft.com/office/word/2010/wordprocessingGroup" xmlns:wpi="http://schemas.microsoft.com/office/word/2010/wordprocessingInk" xmlns:wne="http://schemas.microsoft.com/office/word/2006/wordml" xmlns:wps="http://schemas.microsoft.com/office/word/2010/wordprocessingShape" mc:Ignorable="w14 w15 w16se w16cid w16 w16cex w16sdtdh w16du wp14">
-  <w:p>
-    <w:pPr>
-      <w:pStyle w:val="Footer"/>
-      <w:framePr w:wrap="around" w:vAnchor="text" w:hAnchor="text" w:xAlign="center" w:y="1"/>
-      <w:rPr>
-        <w:rStyle w:val="PageNumber"/>
-      </w:rPr>
-    </w:pPr>
-    <w:r>
-      <w:rPr>
-        <w:rStyle w:val="PageNumber"/>
-        <w:rtl/>
-      </w:rPr>
-      <w:fldChar w:fldCharType="begin"/>
-    </w:r>
-    <w:r>
-      <w:rPr>
-        <w:rStyle w:val="PageNumber"/>
-      </w:rPr>
-      <w:instrText xml:space="preserve">PAGE  </w:instrText>
-    </w:r>
-    <w:r>
-      <w:rPr>
-        <w:rStyle w:val="PageNumber"/>
-        <w:rtl/>
-      </w:rPr>
-      <w:fldChar w:fldCharType="separate"/>
-    </w:r>
-    <w:r>
-      <w:rPr>
-        <w:rStyle w:val="PageNumber"/>
-        <w:noProof/>
-        <w:rtl/>
-      </w:rPr>
-      <w:t>4</w:t>
-    </w:r>
-    <w:r>
-      <w:rPr>
-        <w:rStyle w:val="PageNumber"/>
-        <w:rtl/>
-      </w:rPr>
-      <w:fldChar w:fldCharType="end"/>
-    </w:r>
-  </w:p>
-  <w:p>
-    <w:pPr>
-      <w:pStyle w:val="Footer"/>
-    </w:pPr>
-    <w:r>
-      <w:rPr>
-        <w:rFonts w:hint="cs"/>
-        <w:rtl/>
-      </w:rPr>
-      <w:tab/>
-    </w:r>
-  </w:p>
-</w:ftr>
-</file>
-
 <file path=word/footnotes.xml><?xml version="1.0" encoding="utf-8"?>
-<w:footnotes xmlns:wpc="http://schemas.microsoft.com/office/word/2010/wordprocessingCanvas" xmlns:cx="http://schemas.microsoft.com/office/drawing/2014/chartex" xmlns:cx1="http://schemas.microsoft.com/office/drawing/2015/9/8/chartex" xmlns:cx2="http://schemas.microsoft.com/office/drawing/2015/10/21/chartex" xmlns:cx3="http://schemas.microsoft.com/office/drawing/2016/5/9/chartex" xmlns:cx4="http://schemas.microsoft.com/office/drawing/2016/5/10/chartex" xmlns:cx5="http://schemas.microsoft.com/office/drawing/2016/5/11/chartex" xmlns:cx6="http://schemas.microsoft.com/office/drawing/2016/5/12/chartex" xmlns:cx7="http://schemas.microsoft.com/office/drawing/2016/5/13/chartex" xmlns:cx8="http://schemas.microsoft.com/office/drawing/2016/5/14/chartex" xmlns:mc="http://schemas.openxmlformats.org/markup-compatibility/2006" xmlns:aink="http://schemas.microsoft.com/office/drawing/2016/ink" xmlns:am3d="http://schemas.microsoft.com/office/drawing/2017/model3d" xmlns:o="urn:schemas-microsoft-com:office:office" xmlns:oel="http://schemas.microsoft.com/office/2019/extlst" xmlns:r="http://schemas.openxmlformats.org/officeDocument/2006/relationships" xmlns:m="http://schemas.openxmlformats.org/officeDocument/2006/math" xmlns:v="urn:schemas-microsoft-com:vml" xmlns:wp14="http://schemas.microsoft.com/office/word/2010/wordprocessingDrawing" xmlns:wp="http://schemas.openxmlformats.org/drawingml/2006/wordprocessingDrawing" xmlns:w10="urn:schemas-microsoft-com:office:word" xmlns:w="http://schemas.openxmlformats.org/wordprocessingml/2006/main" xmlns:w14="http://schemas.microsoft.com/office/word/2010/wordml" xmlns:w15="http://schemas.microsoft.com/office/word/2012/wordml" xmlns:w16cex="http://schemas.microsoft.com/office/word/2018/wordml/cex" xmlns:w16cid="http://schemas.microsoft.com/office/word/2016/wordml/cid" xmlns:w16="http://schemas.microsoft.com/office/word/2018/wordml" xmlns:w16du="http://schemas.microsoft.com/office/word/2023/wordml/word16du" xmlns:w16sdtdh="http://schemas.microsoft.com/office/word/2020/wordml/sdtdatahash" xmlns:w16se="http://schemas.microsoft.com/office/word/2015/wordml/symex" xmlns:wpg="http://schemas.microsoft.com/office/word/2010/wordprocessingGroup" xmlns:wpi="http://schemas.microsoft.com/office/word/2010/wordprocessingInk" xmlns:wne="http://schemas.microsoft.com/office/word/2006/wordml" xmlns:wps="http://schemas.microsoft.com/office/word/2010/wordprocessingShape" mc:Ignorable="w14 w15 w16se w16cid w16 w16cex w16sdtdh w16du wp14">
+<w:footnotes xmlns:wpc="http://schemas.microsoft.com/office/word/2010/wordprocessingCanvas" xmlns:cx="http://schemas.microsoft.com/office/drawing/2014/chartex" xmlns:cx1="http://schemas.microsoft.com/office/drawing/2015/9/8/chartex" xmlns:cx2="http://schemas.microsoft.com/office/drawing/2015/10/21/chartex" xmlns:cx3="http://schemas.microsoft.com/office/drawing/2016/5/9/chartex" xmlns:cx4="http://schemas.microsoft.com/office/drawing/2016/5/10/chartex" xmlns:cx5="http://schemas.microsoft.com/office/drawing/2016/5/11/chartex" xmlns:cx6="http://schemas.microsoft.com/office/drawing/2016/5/12/chartex" xmlns:cx7="http://schemas.microsoft.com/office/drawing/2016/5/13/chartex" xmlns:cx8="http://schemas.microsoft.com/office/drawing/2016/5/14/chartex" xmlns:mc="http://schemas.openxmlformats.org/markup-compatibility/2006" xmlns:aink="http://schemas.microsoft.com/office/drawing/2016/ink" xmlns:am3d="http://schemas.microsoft.com/office/drawing/2017/model3d" xmlns:o="urn:schemas-microsoft-com:office:office" xmlns:oel="http://schemas.microsoft.com/office/2019/extlst" xmlns:r="http://schemas.openxmlformats.org/officeDocument/2006/relationships" xmlns:m="http://schemas.openxmlformats.org/officeDocument/2006/math" xmlns:v="urn:schemas-microsoft-com:vml" xmlns:wp14="http://schemas.microsoft.com/office/word/2010/wordprocessingDrawing" xmlns:wp="http://schemas.openxmlformats.org/drawingml/2006/wordprocessingDrawing" xmlns:w10="urn:schemas-microsoft-com:office:word" xmlns:w="http://schemas.openxmlformats.org/wordprocessingml/2006/main" xmlns:w14="http://schemas.microsoft.com/office/word/2010/wordml" xmlns:w15="http://schemas.microsoft.com/office/word/2012/wordml" xmlns:w16cex="http://schemas.microsoft.com/office/word/2018/wordml/cex" xmlns:w16cid="http://schemas.microsoft.com/office/word/2016/wordml/cid" xmlns:w16="http://schemas.microsoft.com/office/word/2018/wordml" xmlns:w16du="http://schemas.microsoft.com/office/word/2023/wordml/word16du" xmlns:w16sdtdh="http://schemas.microsoft.com/office/word/2020/wordml/sdtdatahash" xmlns:w16sdtfl="http://schemas.microsoft.com/office/word/2024/wordml/sdtformatlock" xmlns:w16se="http://schemas.microsoft.com/office/word/2015/wordml/symex" xmlns:wpg="http://schemas.microsoft.com/office/word/2010/wordprocessingGroup" xmlns:wpi="http://schemas.microsoft.com/office/word/2010/wordprocessingInk" xmlns:wne="http://schemas.microsoft.com/office/word/2006/wordml" xmlns:wps="http://schemas.microsoft.com/office/word/2010/wordprocessingShape" mc:Ignorable="w14 w15 w16se w16cid w16 w16cex w16sdtdh w16sdtfl w16du wp14">
   <w:footnote w:type="separator" w:id="-1">
     <w:p>
       <w:r>
@@ -3060,39 +3271,8 @@
 </w:footnotes>
 </file>
 
-<file path=word/header1.xml><?xml version="1.0" encoding="utf-8"?>
-<w:hdr xmlns:wpc="http://schemas.microsoft.com/office/word/2010/wordprocessingCanvas" xmlns:cx="http://schemas.microsoft.com/office/drawing/2014/chartex" xmlns:cx1="http://schemas.microsoft.com/office/drawing/2015/9/8/chartex" xmlns:cx2="http://schemas.microsoft.com/office/drawing/2015/10/21/chartex" xmlns:cx3="http://schemas.microsoft.com/office/drawing/2016/5/9/chartex" xmlns:cx4="http://schemas.microsoft.com/office/drawing/2016/5/10/chartex" xmlns:cx5="http://schemas.microsoft.com/office/drawing/2016/5/11/chartex" xmlns:cx6="http://schemas.microsoft.com/office/drawing/2016/5/12/chartex" xmlns:cx7="http://schemas.microsoft.com/office/drawing/2016/5/13/chartex" xmlns:cx8="http://schemas.microsoft.com/office/drawing/2016/5/14/chartex" xmlns:mc="http://schemas.openxmlformats.org/markup-compatibility/2006" xmlns:aink="http://schemas.microsoft.com/office/drawing/2016/ink" xmlns:am3d="http://schemas.microsoft.com/office/drawing/2017/model3d" xmlns:o="urn:schemas-microsoft-com:office:office" xmlns:oel="http://schemas.microsoft.com/office/2019/extlst" xmlns:r="http://schemas.openxmlformats.org/officeDocument/2006/relationships" xmlns:m="http://schemas.openxmlformats.org/officeDocument/2006/math" xmlns:v="urn:schemas-microsoft-com:vml" xmlns:wp14="http://schemas.microsoft.com/office/word/2010/wordprocessingDrawing" xmlns:wp="http://schemas.openxmlformats.org/drawingml/2006/wordprocessingDrawing" xmlns:w10="urn:schemas-microsoft-com:office:word" xmlns:w="http://schemas.openxmlformats.org/wordprocessingml/2006/main" xmlns:w14="http://schemas.microsoft.com/office/word/2010/wordml" xmlns:w15="http://schemas.microsoft.com/office/word/2012/wordml" xmlns:w16cex="http://schemas.microsoft.com/office/word/2018/wordml/cex" xmlns:w16cid="http://schemas.microsoft.com/office/word/2016/wordml/cid" xmlns:w16="http://schemas.microsoft.com/office/word/2018/wordml" xmlns:w16du="http://schemas.microsoft.com/office/word/2023/wordml/word16du" xmlns:w16sdtdh="http://schemas.microsoft.com/office/word/2020/wordml/sdtdatahash" xmlns:w16se="http://schemas.microsoft.com/office/word/2015/wordml/symex" xmlns:wpg="http://schemas.microsoft.com/office/word/2010/wordprocessingGroup" xmlns:wpi="http://schemas.microsoft.com/office/word/2010/wordprocessingInk" xmlns:wne="http://schemas.microsoft.com/office/word/2006/wordml" xmlns:wps="http://schemas.microsoft.com/office/word/2010/wordprocessingShape" mc:Ignorable="w14 w15 w16se w16cid w16 w16cex w16sdtdh w16du wp14">
-  <w:p>
-    <w:pPr>
-      <w:pStyle w:val="Header"/>
-      <w:rPr>
-        <w:rtl/>
-        <w:lang w:bidi="fa-IR"/>
-      </w:rPr>
-    </w:pPr>
-    <w:r>
-      <w:tab/>
-    </w:r>
-    <w:r>
-      <w:rPr>
-        <w:rFonts w:hint="cs"/>
-        <w:rtl/>
-        <w:lang w:bidi="fa-IR"/>
-      </w:rPr>
-      <w:t>11 تا 13 بهمن 1384، دانشگاه شیراز</w:t>
-    </w:r>
-  </w:p>
-</w:hdr>
-</file>
-
-<file path=word/header2.xml><?xml version="1.0" encoding="utf-8"?>
-<w:hdr xmlns:wpc="http://schemas.microsoft.com/office/word/2010/wordprocessingCanvas" xmlns:cx="http://schemas.microsoft.com/office/drawing/2014/chartex" xmlns:cx1="http://schemas.microsoft.com/office/drawing/2015/9/8/chartex" xmlns:cx2="http://schemas.microsoft.com/office/drawing/2015/10/21/chartex" xmlns:cx3="http://schemas.microsoft.com/office/drawing/2016/5/9/chartex" xmlns:cx4="http://schemas.microsoft.com/office/drawing/2016/5/10/chartex" xmlns:cx5="http://schemas.microsoft.com/office/drawing/2016/5/11/chartex" xmlns:cx6="http://schemas.microsoft.com/office/drawing/2016/5/12/chartex" xmlns:cx7="http://schemas.microsoft.com/office/drawing/2016/5/13/chartex" xmlns:cx8="http://schemas.microsoft.com/office/drawing/2016/5/14/chartex" xmlns:mc="http://schemas.openxmlformats.org/markup-compatibility/2006" xmlns:aink="http://schemas.microsoft.com/office/drawing/2016/ink" xmlns:am3d="http://schemas.microsoft.com/office/drawing/2017/model3d" xmlns:o="urn:schemas-microsoft-com:office:office" xmlns:oel="http://schemas.microsoft.com/office/2019/extlst" xmlns:r="http://schemas.openxmlformats.org/officeDocument/2006/relationships" xmlns:m="http://schemas.openxmlformats.org/officeDocument/2006/math" xmlns:v="urn:schemas-microsoft-com:vml" xmlns:wp14="http://schemas.microsoft.com/office/word/2010/wordprocessingDrawing" xmlns:wp="http://schemas.openxmlformats.org/drawingml/2006/wordprocessingDrawing" xmlns:w10="urn:schemas-microsoft-com:office:word" xmlns:w="http://schemas.openxmlformats.org/wordprocessingml/2006/main" xmlns:w14="http://schemas.microsoft.com/office/word/2010/wordml" xmlns:w15="http://schemas.microsoft.com/office/word/2012/wordml" xmlns:w16cex="http://schemas.microsoft.com/office/word/2018/wordml/cex" xmlns:w16cid="http://schemas.microsoft.com/office/word/2016/wordml/cid" xmlns:w16="http://schemas.microsoft.com/office/word/2018/wordml" xmlns:w16du="http://schemas.microsoft.com/office/word/2023/wordml/word16du" xmlns:w16sdtdh="http://schemas.microsoft.com/office/word/2020/wordml/sdtdatahash" xmlns:w16se="http://schemas.microsoft.com/office/word/2015/wordml/symex" xmlns:wpg="http://schemas.microsoft.com/office/word/2010/wordprocessingGroup" xmlns:wpi="http://schemas.microsoft.com/office/word/2010/wordprocessingInk" xmlns:wne="http://schemas.microsoft.com/office/word/2006/wordml" xmlns:wps="http://schemas.microsoft.com/office/word/2010/wordprocessingShape" mc:Ignorable="w14 w15 w16se w16cid w16 w16cex w16sdtdh w16du wp14">
-  <w:p/>
-</w:hdr>
-</file>
-
 <file path=word/numbering.xml><?xml version="1.0" encoding="utf-8"?>
-<w:numbering xmlns:wpc="http://schemas.microsoft.com/office/word/2010/wordprocessingCanvas" xmlns:cx="http://schemas.microsoft.com/office/drawing/2014/chartex" xmlns:cx1="http://schemas.microsoft.com/office/drawing/2015/9/8/chartex" xmlns:cx2="http://schemas.microsoft.com/office/drawing/2015/10/21/chartex" xmlns:cx3="http://schemas.microsoft.com/office/drawing/2016/5/9/chartex" xmlns:cx4="http://schemas.microsoft.com/office/drawing/2016/5/10/chartex" xmlns:cx5="http://schemas.microsoft.com/office/drawing/2016/5/11/chartex" xmlns:cx6="http://schemas.microsoft.com/office/drawing/2016/5/12/chartex" xmlns:cx7="http://schemas.microsoft.com/office/drawing/2016/5/13/chartex" xmlns:cx8="http://schemas.microsoft.com/office/drawing/2016/5/14/chartex" xmlns:mc="http://schemas.openxmlformats.org/markup-compatibility/2006" xmlns:aink="http://schemas.microsoft.com/office/drawing/2016/ink" xmlns:am3d="http://schemas.microsoft.com/office/drawing/2017/model3d" xmlns:o="urn:schemas-microsoft-com:office:office" xmlns:oel="http://schemas.microsoft.com/office/2019/extlst" xmlns:r="http://schemas.openxmlformats.org/officeDocument/2006/relationships" xmlns:m="http://schemas.openxmlformats.org/officeDocument/2006/math" xmlns:v="urn:schemas-microsoft-com:vml" xmlns:wp14="http://schemas.microsoft.com/office/word/2010/wordprocessingDrawing" xmlns:wp="http://schemas.openxmlformats.org/drawingml/2006/wordprocessingDrawing" xmlns:w10="urn:schemas-microsoft-com:office:word" xmlns:w="http://schemas.openxmlformats.org/wordprocessingml/2006/main" xmlns:w14="http://schemas.microsoft.com/office/word/2010/wordml" xmlns:w15="http://schemas.microsoft.com/office/word/2012/wordml" xmlns:w16cex="http://schemas.microsoft.com/office/word/2018/wordml/cex" xmlns:w16cid="http://schemas.microsoft.com/office/word/2016/wordml/cid" xmlns:w16="http://schemas.microsoft.com/office/word/2018/wordml" xmlns:w16du="http://schemas.microsoft.com/office/word/2023/wordml/word16du" xmlns:w16sdtdh="http://schemas.microsoft.com/office/word/2020/wordml/sdtdatahash" xmlns:w16se="http://schemas.microsoft.com/office/word/2015/wordml/symex" xmlns:wpg="http://schemas.microsoft.com/office/word/2010/wordprocessingGroup" xmlns:wpi="http://schemas.microsoft.com/office/word/2010/wordprocessingInk" xmlns:wne="http://schemas.microsoft.com/office/word/2006/wordml" xmlns:wps="http://schemas.microsoft.com/office/word/2010/wordprocessingShape" mc:Ignorable="w14 w15 w16se w16cid w16 w16cex w16sdtdh w16du wp14">
+<w:numbering xmlns:wpc="http://schemas.microsoft.com/office/word/2010/wordprocessingCanvas" xmlns:cx="http://schemas.microsoft.com/office/drawing/2014/chartex" xmlns:cx1="http://schemas.microsoft.com/office/drawing/2015/9/8/chartex" xmlns:cx2="http://schemas.microsoft.com/office/drawing/2015/10/21/chartex" xmlns:cx3="http://schemas.microsoft.com/office/drawing/2016/5/9/chartex" xmlns:cx4="http://schemas.microsoft.com/office/drawing/2016/5/10/chartex" xmlns:cx5="http://schemas.microsoft.com/office/drawing/2016/5/11/chartex" xmlns:cx6="http://schemas.microsoft.com/office/drawing/2016/5/12/chartex" xmlns:cx7="http://schemas.microsoft.com/office/drawing/2016/5/13/chartex" xmlns:cx8="http://schemas.microsoft.com/office/drawing/2016/5/14/chartex" xmlns:mc="http://schemas.openxmlformats.org/markup-compatibility/2006" xmlns:aink="http://schemas.microsoft.com/office/drawing/2016/ink" xmlns:am3d="http://schemas.microsoft.com/office/drawing/2017/model3d" xmlns:o="urn:schemas-microsoft-com:office:office" xmlns:oel="http://schemas.microsoft.com/office/2019/extlst" xmlns:r="http://schemas.openxmlformats.org/officeDocument/2006/relationships" xmlns:m="http://schemas.openxmlformats.org/officeDocument/2006/math" xmlns:v="urn:schemas-microsoft-com:vml" xmlns:wp14="http://schemas.microsoft.com/office/word/2010/wordprocessingDrawing" xmlns:wp="http://schemas.openxmlformats.org/drawingml/2006/wordprocessingDrawing" xmlns:w10="urn:schemas-microsoft-com:office:word" xmlns:w="http://schemas.openxmlformats.org/wordprocessingml/2006/main" xmlns:w14="http://schemas.microsoft.com/office/word/2010/wordml" xmlns:w15="http://schemas.microsoft.com/office/word/2012/wordml" xmlns:w16cex="http://schemas.microsoft.com/office/word/2018/wordml/cex" xmlns:w16cid="http://schemas.microsoft.com/office/word/2016/wordml/cid" xmlns:w16="http://schemas.microsoft.com/office/word/2018/wordml" xmlns:w16du="http://schemas.microsoft.com/office/word/2023/wordml/word16du" xmlns:w16sdtdh="http://schemas.microsoft.com/office/word/2020/wordml/sdtdatahash" xmlns:w16sdtfl="http://schemas.microsoft.com/office/word/2024/wordml/sdtformatlock" xmlns:w16se="http://schemas.microsoft.com/office/word/2015/wordml/symex" xmlns:wpg="http://schemas.microsoft.com/office/word/2010/wordprocessingGroup" xmlns:wpi="http://schemas.microsoft.com/office/word/2010/wordprocessingInk" xmlns:wne="http://schemas.microsoft.com/office/word/2006/wordml" xmlns:wps="http://schemas.microsoft.com/office/word/2010/wordprocessingShape" mc:Ignorable="w14 w15 w16se w16cid w16 w16cex w16sdtdh w16sdtfl w16du wp14">
   <w:abstractNum w:abstractNumId="0" w15:restartNumberingAfterBreak="0">
     <w:nsid w:val="FFFFFF7C"/>
     <w:multiLevelType w:val="singleLevel"/>
@@ -6165,7 +6345,7 @@
 </file>
 
 <file path=word/styles.xml><?xml version="1.0" encoding="utf-8"?>
-<w:styles xmlns:mc="http://schemas.openxmlformats.org/markup-compatibility/2006" xmlns:r="http://schemas.openxmlformats.org/officeDocument/2006/relationships" xmlns:w="http://schemas.openxmlformats.org/wordprocessingml/2006/main" xmlns:w14="http://schemas.microsoft.com/office/word/2010/wordml" xmlns:w15="http://schemas.microsoft.com/office/word/2012/wordml" xmlns:w16cex="http://schemas.microsoft.com/office/word/2018/wordml/cex" xmlns:w16cid="http://schemas.microsoft.com/office/word/2016/wordml/cid" xmlns:w16="http://schemas.microsoft.com/office/word/2018/wordml" xmlns:w16du="http://schemas.microsoft.com/office/word/2023/wordml/word16du" xmlns:w16sdtdh="http://schemas.microsoft.com/office/word/2020/wordml/sdtdatahash" xmlns:w16se="http://schemas.microsoft.com/office/word/2015/wordml/symex" mc:Ignorable="w14 w15 w16se w16cid w16 w16cex w16sdtdh w16du">
+<w:styles xmlns:mc="http://schemas.openxmlformats.org/markup-compatibility/2006" xmlns:r="http://schemas.openxmlformats.org/officeDocument/2006/relationships" xmlns:w="http://schemas.openxmlformats.org/wordprocessingml/2006/main" xmlns:w14="http://schemas.microsoft.com/office/word/2010/wordml" xmlns:w15="http://schemas.microsoft.com/office/word/2012/wordml" xmlns:w16cex="http://schemas.microsoft.com/office/word/2018/wordml/cex" xmlns:w16cid="http://schemas.microsoft.com/office/word/2016/wordml/cid" xmlns:w16="http://schemas.microsoft.com/office/word/2018/wordml" xmlns:w16du="http://schemas.microsoft.com/office/word/2023/wordml/word16du" xmlns:w16sdtdh="http://schemas.microsoft.com/office/word/2020/wordml/sdtdatahash" xmlns:w16sdtfl="http://schemas.microsoft.com/office/word/2024/wordml/sdtformatlock" xmlns:w16se="http://schemas.microsoft.com/office/word/2015/wordml/symex" mc:Ignorable="w14 w15 w16se w16cid w16 w16cex w16sdtdh w16sdtfl w16du">
   <w:docDefaults>
     <w:rPrDefault>
       <w:rPr>

</xml_diff>